<commit_message>
inscrease code coverage and renaming resource file
</commit_message>
<xml_diff>
--- a/Picture viewer project.docx
+++ b/Picture viewer project.docx
@@ -33,41 +33,19 @@
         <w:rPr>
           <w:lang w:val="en-US"/>
         </w:rPr>
-        <w:t xml:space="preserve">Product goal : Be able to visualize pictures, video and sounds of all format : jpeg, </w:t>
-      </w:r>
-      <w:proofErr w:type="spellStart"/>
-      <w:r>
-        <w:rPr>
-          <w:lang w:val="en-US"/>
-        </w:rPr>
-        <w:t>png</w:t>
-      </w:r>
-      <w:proofErr w:type="spellEnd"/>
-      <w:r>
-        <w:rPr>
-          <w:lang w:val="en-US"/>
-        </w:rPr>
-        <w:t>, bmp, mpg, mpeg, mp4, mp3, wav, with a user friendly user interface in windows OS. The soft will be installed via an installer that provides all dependencies.</w:t>
-      </w:r>
-    </w:p>
-    <w:p>
-      <w:pPr>
-        <w:rPr>
-          <w:lang w:val="en-US"/>
-        </w:rPr>
-      </w:pPr>
-    </w:p>
-    <w:p>
-      <w:r>
-        <w:t xml:space="preserve">Product </w:t>
-      </w:r>
-      <w:proofErr w:type="spellStart"/>
-      <w:r>
-        <w:t>backlog</w:t>
-      </w:r>
-      <w:proofErr w:type="spellEnd"/>
-      <w:r>
-        <w:t xml:space="preserve"> items : </w:t>
+        <w:t>Product goal : Be able to visualize pictures, video and sounds of all format : jpeg, png, bmp, mpg, mpeg, mp4, mp3, wav, with a user friendly user interface in windows OS. The soft will be installed via an installer that provides all dependencies.</w:t>
+      </w:r>
+    </w:p>
+    <w:p>
+      <w:pPr>
+        <w:rPr>
+          <w:lang w:val="en-US"/>
+        </w:rPr>
+      </w:pPr>
+    </w:p>
+    <w:p>
+      <w:r>
+        <w:t xml:space="preserve">Product backlog items : </w:t>
       </w:r>
     </w:p>
     <w:p>
@@ -175,7 +153,7 @@
     <w:p>
       <w:pPr>
         <w:pStyle w:val="Heading2"/>
-        <w:ind w:left="0" w:firstLine="0"/>
+        <w:ind w:left="0"/>
         <w:rPr>
           <w:rFonts w:hint="eastAsia"/>
         </w:rPr>
@@ -198,7 +176,7 @@
     <w:p>
       <w:pPr>
         <w:pStyle w:val="Heading2"/>
-        <w:ind w:left="0" w:firstLine="0"/>
+        <w:ind w:left="0"/>
         <w:rPr>
           <w:rFonts w:hint="eastAsia"/>
         </w:rPr>
@@ -218,37 +196,13 @@
         <w:t xml:space="preserve">Have all the menu available and be able to install the version on windows. </w:t>
       </w:r>
       <w:r>
-        <w:t xml:space="preserve">Have </w:t>
-      </w:r>
-      <w:proofErr w:type="spellStart"/>
-      <w:r>
-        <w:t>some</w:t>
-      </w:r>
-      <w:proofErr w:type="spellEnd"/>
-      <w:r>
-        <w:t xml:space="preserve"> fun </w:t>
-      </w:r>
-      <w:proofErr w:type="spellStart"/>
-      <w:r>
-        <w:t>icon</w:t>
-      </w:r>
-      <w:proofErr w:type="spellEnd"/>
-      <w:r>
-        <w:t xml:space="preserve"> &amp; </w:t>
-      </w:r>
-      <w:proofErr w:type="spellStart"/>
-      <w:r>
-        <w:t>name</w:t>
-      </w:r>
-      <w:proofErr w:type="spellEnd"/>
-      <w:r>
-        <w:t xml:space="preserve"> for the application.</w:t>
+        <w:t>Have some fun icon &amp; name for the application.</w:t>
       </w:r>
     </w:p>
     <w:p>
       <w:pPr>
         <w:pStyle w:val="Heading2"/>
-        <w:ind w:left="0" w:firstLine="0"/>
+        <w:ind w:left="0"/>
         <w:rPr>
           <w:rFonts w:hint="eastAsia"/>
         </w:rPr>
@@ -272,7 +226,7 @@
     <w:p>
       <w:pPr>
         <w:pStyle w:val="Heading2"/>
-        <w:ind w:left="0" w:firstLine="0"/>
+        <w:ind w:left="0"/>
         <w:rPr>
           <w:rFonts w:hint="eastAsia"/>
         </w:rPr>
@@ -284,7 +238,7 @@
     <w:p>
       <w:pPr>
         <w:pStyle w:val="Heading3"/>
-        <w:ind w:left="0" w:firstLine="0"/>
+        <w:ind w:left="0"/>
         <w:rPr>
           <w:rFonts w:hint="eastAsia"/>
         </w:rPr>
@@ -388,16 +342,8 @@
         <w:rPr>
           <w:lang w:val="en-US"/>
         </w:rPr>
-        <w:t xml:space="preserve">File, Edit, </w:t>
-      </w:r>
-      <w:proofErr w:type="spellStart"/>
-      <w:r>
-        <w:rPr>
-          <w:lang w:val="en-US"/>
-        </w:rPr>
-        <w:t>View,Image,Filters,Tools,Window,information</w:t>
-      </w:r>
-      <w:proofErr w:type="spellEnd"/>
+        <w:t>File, Edit, View,Image,Filters,Tools,Window,information</w:t>
+      </w:r>
     </w:p>
     <w:p>
       <w:pPr>
@@ -542,13 +488,8 @@
           <w:numId w:val="4"/>
         </w:numPr>
       </w:pPr>
-      <w:proofErr w:type="spellStart"/>
-      <w:r>
-        <w:t>Recent</w:t>
-      </w:r>
-      <w:proofErr w:type="spellEnd"/>
-      <w:r>
-        <w:t xml:space="preserve"> files</w:t>
+      <w:r>
+        <w:t>Recent files</w:t>
       </w:r>
     </w:p>
     <w:p>
@@ -559,11 +500,9 @@
           <w:numId w:val="4"/>
         </w:numPr>
       </w:pPr>
-      <w:proofErr w:type="spellStart"/>
       <w:r>
         <w:t>Browse</w:t>
       </w:r>
-      <w:proofErr w:type="spellEnd"/>
     </w:p>
     <w:p>
       <w:pPr>
@@ -621,11 +560,9 @@
           <w:numId w:val="4"/>
         </w:numPr>
       </w:pPr>
-      <w:proofErr w:type="spellStart"/>
       <w:r>
         <w:t>Print</w:t>
       </w:r>
-      <w:proofErr w:type="spellEnd"/>
     </w:p>
     <w:p>
       <w:pPr>
@@ -635,11 +572,9 @@
           <w:numId w:val="4"/>
         </w:numPr>
       </w:pPr>
-      <w:proofErr w:type="spellStart"/>
       <w:r>
         <w:t>Quit</w:t>
       </w:r>
-      <w:proofErr w:type="spellEnd"/>
     </w:p>
     <w:p>
       <w:pPr>
@@ -698,11 +633,9 @@
           <w:numId w:val="4"/>
         </w:numPr>
       </w:pPr>
-      <w:proofErr w:type="spellStart"/>
       <w:r>
         <w:t>Delete</w:t>
       </w:r>
-      <w:proofErr w:type="spellEnd"/>
     </w:p>
     <w:p>
       <w:pPr>
@@ -724,13 +657,8 @@
           <w:numId w:val="4"/>
         </w:numPr>
       </w:pPr>
-      <w:proofErr w:type="spellStart"/>
-      <w:r>
-        <w:t>View</w:t>
-      </w:r>
-      <w:proofErr w:type="spellEnd"/>
-      <w:r>
-        <w:t xml:space="preserve"> : </w:t>
+      <w:r>
+        <w:t xml:space="preserve">View : </w:t>
       </w:r>
     </w:p>
     <w:p>
@@ -766,13 +694,8 @@
           <w:numId w:val="4"/>
         </w:numPr>
       </w:pPr>
-      <w:proofErr w:type="spellStart"/>
-      <w:r>
-        <w:t>Adjust</w:t>
-      </w:r>
-      <w:proofErr w:type="spellEnd"/>
-      <w:r>
-        <w:t xml:space="preserve"> :</w:t>
+      <w:r>
+        <w:t>Adjust :</w:t>
       </w:r>
     </w:p>
     <w:p>
@@ -784,13 +707,8 @@
         </w:numPr>
       </w:pPr>
       <w:r>
-        <w:t xml:space="preserve">No </w:t>
-      </w:r>
-      <w:proofErr w:type="spellStart"/>
-      <w:r>
-        <w:t>Adjustment</w:t>
-      </w:r>
-      <w:proofErr w:type="spellEnd"/>
+        <w:t>No Adjustment</w:t>
+      </w:r>
     </w:p>
     <w:p>
       <w:pPr>
@@ -884,13 +802,8 @@
           <w:numId w:val="4"/>
         </w:numPr>
       </w:pPr>
-      <w:proofErr w:type="spellStart"/>
-      <w:r>
-        <w:t>Previous</w:t>
-      </w:r>
-      <w:proofErr w:type="spellEnd"/>
-      <w:r>
-        <w:t xml:space="preserve"> File</w:t>
+      <w:r>
+        <w:t>Previous File</w:t>
       </w:r>
     </w:p>
     <w:p>
@@ -974,21 +887,8 @@
         </w:numPr>
       </w:pPr>
       <w:r>
-        <w:t xml:space="preserve">Number of </w:t>
-      </w:r>
-      <w:proofErr w:type="spellStart"/>
-      <w:r>
-        <w:t>used</w:t>
-      </w:r>
-      <w:proofErr w:type="spellEnd"/>
-      <w:r>
-        <w:t xml:space="preserve"> </w:t>
-      </w:r>
-      <w:proofErr w:type="spellStart"/>
-      <w:r>
-        <w:t>colors</w:t>
-      </w:r>
-      <w:proofErr w:type="spellEnd"/>
+        <w:t>Number of used colors</w:t>
+      </w:r>
     </w:p>
     <w:p>
       <w:pPr>
@@ -998,11 +898,9 @@
           <w:numId w:val="4"/>
         </w:numPr>
       </w:pPr>
-      <w:proofErr w:type="spellStart"/>
       <w:r>
         <w:t>Rotate</w:t>
       </w:r>
-      <w:proofErr w:type="spellEnd"/>
     </w:p>
     <w:p>
       <w:pPr>
@@ -1013,21 +911,8 @@
         </w:numPr>
       </w:pPr>
       <w:r>
-        <w:t xml:space="preserve">90° </w:t>
-      </w:r>
-      <w:proofErr w:type="spellStart"/>
-      <w:r>
-        <w:t>clock</w:t>
-      </w:r>
-      <w:proofErr w:type="spellEnd"/>
-      <w:r>
-        <w:t xml:space="preserve"> </w:t>
-      </w:r>
-      <w:proofErr w:type="spellStart"/>
-      <w:r>
-        <w:t>wise</w:t>
-      </w:r>
-      <w:proofErr w:type="spellEnd"/>
+        <w:t>90° clock wise</w:t>
+      </w:r>
     </w:p>
     <w:p>
       <w:pPr>
@@ -1038,21 +923,8 @@
         </w:numPr>
       </w:pPr>
       <w:r>
-        <w:t xml:space="preserve">90° reverse </w:t>
-      </w:r>
-      <w:proofErr w:type="spellStart"/>
-      <w:r>
-        <w:t>clock</w:t>
-      </w:r>
-      <w:proofErr w:type="spellEnd"/>
-      <w:r>
-        <w:t xml:space="preserve"> </w:t>
-      </w:r>
-      <w:proofErr w:type="spellStart"/>
-      <w:r>
-        <w:t>wise</w:t>
-      </w:r>
-      <w:proofErr w:type="spellEnd"/>
+        <w:t>90° reverse clock wise</w:t>
+      </w:r>
     </w:p>
     <w:p>
       <w:pPr>
@@ -1110,11 +982,9 @@
           <w:numId w:val="4"/>
         </w:numPr>
       </w:pPr>
-      <w:proofErr w:type="spellStart"/>
       <w:r>
         <w:t>Resize</w:t>
       </w:r>
-      <w:proofErr w:type="spellEnd"/>
     </w:p>
     <w:p>
       <w:pPr>
@@ -1125,21 +995,8 @@
         </w:numPr>
       </w:pPr>
       <w:r>
-        <w:t xml:space="preserve">Correct </w:t>
-      </w:r>
-      <w:proofErr w:type="spellStart"/>
-      <w:r>
-        <w:t>red</w:t>
-      </w:r>
-      <w:proofErr w:type="spellEnd"/>
-      <w:r>
-        <w:t xml:space="preserve"> </w:t>
-      </w:r>
-      <w:proofErr w:type="spellStart"/>
-      <w:r>
-        <w:t>eyes</w:t>
-      </w:r>
-      <w:proofErr w:type="spellEnd"/>
+        <w:t>Correct red eyes</w:t>
+      </w:r>
     </w:p>
     <w:p>
       <w:pPr>
@@ -1161,13 +1018,8 @@
           <w:numId w:val="4"/>
         </w:numPr>
       </w:pPr>
-      <w:proofErr w:type="spellStart"/>
-      <w:r>
-        <w:t>Find</w:t>
-      </w:r>
-      <w:proofErr w:type="spellEnd"/>
-      <w:r>
-        <w:t xml:space="preserve"> a file</w:t>
+      <w:r>
+        <w:t>Find a file</w:t>
       </w:r>
     </w:p>
     <w:p>
@@ -1178,13 +1030,8 @@
           <w:numId w:val="4"/>
         </w:numPr>
       </w:pPr>
-      <w:proofErr w:type="spellStart"/>
-      <w:r>
-        <w:t>Hexadecimal</w:t>
-      </w:r>
-      <w:proofErr w:type="spellEnd"/>
-      <w:r>
-        <w:t xml:space="preserve"> display</w:t>
+      <w:r>
+        <w:t>Hexadecimal display</w:t>
       </w:r>
     </w:p>
     <w:p>
@@ -1219,11 +1066,9 @@
           <w:numId w:val="4"/>
         </w:numPr>
       </w:pPr>
-      <w:proofErr w:type="spellStart"/>
       <w:r>
         <w:t>Parameters</w:t>
       </w:r>
-      <w:proofErr w:type="spellEnd"/>
     </w:p>
     <w:p>
       <w:pPr>
@@ -1263,13 +1108,8 @@
           <w:numId w:val="4"/>
         </w:numPr>
       </w:pPr>
-      <w:proofErr w:type="spellStart"/>
-      <w:r>
-        <w:t>Window</w:t>
-      </w:r>
-      <w:proofErr w:type="spellEnd"/>
-      <w:r>
-        <w:t xml:space="preserve"> : </w:t>
+      <w:r>
+        <w:t xml:space="preserve">Window : </w:t>
       </w:r>
     </w:p>
     <w:p>
@@ -1280,13 +1120,8 @@
           <w:numId w:val="4"/>
         </w:numPr>
       </w:pPr>
-      <w:proofErr w:type="spellStart"/>
-      <w:r>
-        <w:t>Tile</w:t>
-      </w:r>
-      <w:proofErr w:type="spellEnd"/>
-      <w:r>
-        <w:t xml:space="preserve"> (en cascade)</w:t>
+      <w:r>
+        <w:t>Tile (en cascade)</w:t>
       </w:r>
     </w:p>
     <w:p>
@@ -1297,21 +1132,8 @@
           <w:numId w:val="4"/>
         </w:numPr>
       </w:pPr>
-      <w:proofErr w:type="spellStart"/>
-      <w:r>
-        <w:t>Tile</w:t>
-      </w:r>
-      <w:proofErr w:type="spellEnd"/>
-      <w:r>
-        <w:t xml:space="preserve"> </w:t>
-      </w:r>
-      <w:proofErr w:type="spellStart"/>
-      <w:r>
-        <w:t>horizontally</w:t>
-      </w:r>
-      <w:proofErr w:type="spellEnd"/>
-      <w:r>
-        <w:t xml:space="preserve"> </w:t>
+      <w:r>
+        <w:t xml:space="preserve">Tile horizontally </w:t>
       </w:r>
     </w:p>
     <w:p>
@@ -1334,19 +1156,9 @@
         </w:numPr>
         <w:spacing w:after="0"/>
       </w:pPr>
-      <w:proofErr w:type="spellStart"/>
-      <w:r>
-        <w:t>Tile</w:t>
-      </w:r>
-      <w:proofErr w:type="spellEnd"/>
-      <w:r>
-        <w:t xml:space="preserve"> </w:t>
-      </w:r>
-      <w:proofErr w:type="spellStart"/>
-      <w:r>
-        <w:t>Vertically</w:t>
-      </w:r>
-      <w:proofErr w:type="spellEnd"/>
+      <w:r>
+        <w:t>Tile Vertically</w:t>
+      </w:r>
     </w:p>
     <w:p>
       <w:pPr>
@@ -1357,13 +1169,8 @@
         </w:numPr>
         <w:spacing w:after="0"/>
       </w:pPr>
-      <w:proofErr w:type="spellStart"/>
-      <w:r>
-        <w:t>Minimize</w:t>
-      </w:r>
-      <w:proofErr w:type="spellEnd"/>
-      <w:r>
-        <w:t xml:space="preserve"> all</w:t>
+      <w:r>
+        <w:t>Minimize all</w:t>
       </w:r>
     </w:p>
     <w:p>
@@ -1402,7 +1209,7 @@
     <w:p>
       <w:pPr>
         <w:pStyle w:val="Heading3"/>
-        <w:ind w:left="0" w:firstLine="0"/>
+        <w:ind w:left="0"/>
         <w:rPr>
           <w:rFonts w:hint="eastAsia"/>
         </w:rPr>
@@ -1422,21 +1229,7 @@
         <w:rPr>
           <w:lang w:val="en-US"/>
         </w:rPr>
-        <w:t xml:space="preserve">Given I </w:t>
-      </w:r>
-      <w:proofErr w:type="spellStart"/>
-      <w:r>
-        <w:rPr>
-          <w:lang w:val="en-US"/>
-        </w:rPr>
-        <w:t>lauch</w:t>
-      </w:r>
-      <w:proofErr w:type="spellEnd"/>
-      <w:r>
-        <w:rPr>
-          <w:lang w:val="en-US"/>
-        </w:rPr>
-        <w:t xml:space="preserve"> the picture view application</w:t>
+        <w:t>Given I lauch the picture view application</w:t>
       </w:r>
     </w:p>
     <w:p>
@@ -1478,7 +1271,7 @@
     <w:p>
       <w:pPr>
         <w:pStyle w:val="Heading3"/>
-        <w:ind w:left="0" w:firstLine="0"/>
+        <w:ind w:left="0"/>
         <w:rPr>
           <w:rFonts w:hint="eastAsia"/>
         </w:rPr>
@@ -1598,21 +1391,8 @@
         <w:pStyle w:val="BodyText"/>
       </w:pPr>
       <w:r>
-        <w:t xml:space="preserve">Given I </w:t>
-      </w:r>
-      <w:proofErr w:type="spellStart"/>
-      <w:r>
-        <w:t>reduce</w:t>
-      </w:r>
-      <w:proofErr w:type="spellEnd"/>
-      <w:r>
-        <w:t xml:space="preserve"> the </w:t>
-      </w:r>
-      <w:proofErr w:type="spellStart"/>
-      <w:r>
-        <w:t>window</w:t>
-      </w:r>
-      <w:proofErr w:type="spellEnd"/>
+        <w:t>Given I reduce the window</w:t>
+      </w:r>
     </w:p>
     <w:p>
       <w:pPr>
@@ -1720,18 +1500,13 @@
     <w:p>
       <w:pPr>
         <w:pStyle w:val="Heading3"/>
-        <w:ind w:left="0" w:firstLine="0"/>
+        <w:ind w:left="0"/>
         <w:rPr>
           <w:rFonts w:hint="eastAsia"/>
         </w:rPr>
       </w:pPr>
-      <w:proofErr w:type="spellStart"/>
-      <w:r>
-        <w:t>Fourth</w:t>
-      </w:r>
-      <w:proofErr w:type="spellEnd"/>
-      <w:r>
-        <w:t xml:space="preserve"> item</w:t>
+      <w:r>
+        <w:t>Installer</w:t>
       </w:r>
     </w:p>
     <w:p>
@@ -2178,15 +1953,7 @@
         </w:rPr>
       </w:pPr>
       <w:r>
-        <w:t xml:space="preserve">✅ </w:t>
-      </w:r>
-      <w:proofErr w:type="spellStart"/>
-      <w:r>
-        <w:t>Step</w:t>
-      </w:r>
-      <w:proofErr w:type="spellEnd"/>
-      <w:r>
-        <w:t xml:space="preserve"> 3: Add a Setup Project</w:t>
+        <w:t>✅ Step 3: Add a Setup Project</w:t>
       </w:r>
     </w:p>
     <w:p>
@@ -2282,16 +2049,8 @@
         <w:rPr>
           <w:lang w:val="en-US"/>
         </w:rPr>
-        <w:t xml:space="preserve"> (found under </w:t>
-      </w:r>
-      <w:proofErr w:type="spellStart"/>
-      <w:r>
-        <w:rPr>
-          <w:lang w:val="en-US"/>
-        </w:rPr>
-        <w:t>i</w:t>
-      </w:r>
-      <w:proofErr w:type="spellEnd"/>
+        <w:t xml:space="preserve"> (found under i</w:t>
+      </w:r>
       <w:r>
         <w:rPr>
           <w:rStyle w:val="Textesource"/>
@@ -2327,7 +2086,6 @@
         </w:rPr>
         <w:t xml:space="preserve">Name it something like </w:t>
       </w:r>
-      <w:proofErr w:type="spellStart"/>
       <w:r>
         <w:rPr>
           <w:rStyle w:val="Textesource"/>
@@ -2335,7 +2093,6 @@
         </w:rPr>
         <w:t>MyAppInstaller</w:t>
       </w:r>
-      <w:proofErr w:type="spellEnd"/>
       <w:r>
         <w:rPr>
           <w:lang w:val="en-US"/>
@@ -2457,15 +2214,7 @@
         </w:tabs>
       </w:pPr>
       <w:r>
-        <w:t xml:space="preserve">In the </w:t>
-      </w:r>
-      <w:proofErr w:type="spellStart"/>
-      <w:r>
-        <w:t>dialog</w:t>
-      </w:r>
-      <w:proofErr w:type="spellEnd"/>
-      <w:r>
-        <w:t>:</w:t>
+        <w:t>In the dialog:</w:t>
       </w:r>
     </w:p>
     <w:p>
@@ -2508,21 +2257,7 @@
         <w:rPr>
           <w:lang w:val="en-US"/>
         </w:rPr>
-        <w:t>PictureView.exe ,</w:t>
-      </w:r>
-      <w:proofErr w:type="spellStart"/>
-      <w:r>
-        <w:rPr>
-          <w:lang w:val="en-US"/>
-        </w:rPr>
-        <w:t>PictureView.runtimeconfig.json</w:t>
-      </w:r>
-      <w:proofErr w:type="spellEnd"/>
-      <w:r>
-        <w:rPr>
-          <w:lang w:val="en-US"/>
-        </w:rPr>
-        <w:t>, PictureView.dll</w:t>
+        <w:t>PictureView.exe ,PictureView.runtimeconfig.json, PictureView.dll</w:t>
       </w:r>
     </w:p>
     <w:p>
@@ -2580,17 +2315,8 @@
           <w:rStyle w:val="Textesource"/>
           <w:lang w:val="en-US"/>
         </w:rPr>
-        <w:t>.</w:t>
-      </w:r>
-      <w:proofErr w:type="spellStart"/>
-      <w:r>
-        <w:rPr>
-          <w:rStyle w:val="Textesource"/>
-          <w:lang w:val="en-US"/>
-        </w:rPr>
-        <w:t>dll</w:t>
-      </w:r>
-      <w:proofErr w:type="spellEnd"/>
+        <w:t>.dll</w:t>
+      </w:r>
       <w:r>
         <w:rPr>
           <w:lang w:val="en-US"/>
@@ -2632,15 +2358,7 @@
         </w:rPr>
       </w:pPr>
       <w:r>
-        <w:t xml:space="preserve">Add a </w:t>
-      </w:r>
-      <w:proofErr w:type="spellStart"/>
-      <w:r>
-        <w:t>Shortcut</w:t>
-      </w:r>
-      <w:proofErr w:type="spellEnd"/>
-      <w:r>
-        <w:t>:</w:t>
+        <w:t>Add a Shortcut:</w:t>
       </w:r>
     </w:p>
     <w:p>
@@ -2876,25 +2594,125 @@
           <w:sz w:val="24"/>
           <w:szCs w:val="24"/>
         </w:rPr>
-        <w:t>Add an Icon (</w:t>
-      </w:r>
-      <w:proofErr w:type="spellStart"/>
-      <w:r>
-        <w:rPr>
-          <w:rFonts w:ascii="Aptos" w:eastAsia="Aptos" w:hAnsi="Aptos"/>
+        <w:t>Add an Icon (Optional):</w:t>
+      </w:r>
+    </w:p>
+    <w:p>
+      <w:pPr>
+        <w:pStyle w:val="BodyText"/>
+        <w:numPr>
+          <w:ilvl w:val="0"/>
+          <w:numId w:val="12"/>
+        </w:numPr>
+        <w:tabs>
+          <w:tab w:val="clear" w:pos="709"/>
+          <w:tab w:val="left" w:pos="0"/>
+        </w:tabs>
+        <w:rPr>
+          <w:lang w:val="en-US"/>
+        </w:rPr>
+      </w:pPr>
+      <w:r>
+        <w:rPr>
+          <w:lang w:val="en-US"/>
+        </w:rPr>
+        <w:t xml:space="preserve">Add your </w:t>
+      </w:r>
+      <w:r>
+        <w:rPr>
+          <w:rStyle w:val="Textesource"/>
+          <w:lang w:val="en-US"/>
+        </w:rPr>
+        <w:t>.ico</w:t>
+      </w:r>
+      <w:r>
+        <w:rPr>
+          <w:lang w:val="en-US"/>
+        </w:rPr>
+        <w:t xml:space="preserve"> file to the setup project.</w:t>
+      </w:r>
+    </w:p>
+    <w:p>
+      <w:pPr>
+        <w:pStyle w:val="BodyText"/>
+        <w:numPr>
+          <w:ilvl w:val="0"/>
+          <w:numId w:val="12"/>
+        </w:numPr>
+        <w:tabs>
+          <w:tab w:val="clear" w:pos="709"/>
+          <w:tab w:val="left" w:pos="0"/>
+        </w:tabs>
+        <w:rPr>
+          <w:lang w:val="en-US"/>
+        </w:rPr>
+      </w:pPr>
+      <w:r>
+        <w:rPr>
+          <w:lang w:val="en-US"/>
+        </w:rPr>
+        <w:t xml:space="preserve">Right-click your shortcut → </w:t>
+      </w:r>
+      <w:r>
+        <w:rPr>
+          <w:rStyle w:val="Textesource"/>
+          <w:lang w:val="en-US"/>
+        </w:rPr>
+        <w:t>Properties</w:t>
+      </w:r>
+      <w:r>
+        <w:rPr>
+          <w:lang w:val="en-US"/>
+        </w:rPr>
+        <w:t xml:space="preserve"> → Set </w:t>
+      </w:r>
+      <w:r>
+        <w:rPr>
+          <w:rStyle w:val="Strong"/>
+          <w:lang w:val="en-US"/>
+        </w:rPr>
+        <w:t>Icon</w:t>
+      </w:r>
+      <w:r>
+        <w:rPr>
+          <w:lang w:val="en-US"/>
+        </w:rPr>
+        <w:t xml:space="preserve"> to the added </w:t>
+      </w:r>
+      <w:r>
+        <w:rPr>
+          <w:rStyle w:val="Textesource"/>
+          <w:lang w:val="en-US"/>
+        </w:rPr>
+        <w:t>.ico</w:t>
+      </w:r>
+      <w:r>
+        <w:rPr>
+          <w:lang w:val="en-US"/>
+        </w:rPr>
+        <w:t xml:space="preserve"> file.</w:t>
+      </w:r>
+    </w:p>
+    <w:p>
+      <w:pPr>
+        <w:pStyle w:val="Lignehorizontale"/>
+        <w:spacing w:after="140" w:line="276" w:lineRule="auto"/>
+        <w:rPr>
           <w:sz w:val="24"/>
           <w:szCs w:val="24"/>
-        </w:rPr>
-        <w:t>Optional</w:t>
-      </w:r>
-      <w:proofErr w:type="spellEnd"/>
-      <w:r>
+          <w:lang w:val="en-US"/>
+        </w:rPr>
+      </w:pPr>
+    </w:p>
+    <w:p>
+      <w:pPr>
+        <w:pStyle w:val="BodyText"/>
         <w:rPr>
           <w:rFonts w:ascii="Aptos" w:eastAsia="Aptos" w:hAnsi="Aptos"/>
-          <w:sz w:val="24"/>
-          <w:szCs w:val="24"/>
-        </w:rPr>
-        <w:t>):</w:t>
+        </w:rPr>
+      </w:pPr>
+      <w:r>
+        <w:t>✅ Step 6: Build the MSI Installer</w:t>
       </w:r>
     </w:p>
     <w:p>
@@ -2902,7 +2720,7 @@
         <w:pStyle w:val="BodyText"/>
         <w:numPr>
           <w:ilvl w:val="0"/>
-          <w:numId w:val="12"/>
+          <w:numId w:val="13"/>
         </w:numPr>
         <w:tabs>
           <w:tab w:val="clear" w:pos="709"/>
@@ -2916,29 +2734,20 @@
         <w:rPr>
           <w:lang w:val="en-US"/>
         </w:rPr>
-        <w:t xml:space="preserve">Add your </w:t>
-      </w:r>
-      <w:r>
-        <w:rPr>
-          <w:rStyle w:val="Textesource"/>
-          <w:lang w:val="en-US"/>
-        </w:rPr>
-        <w:t>.</w:t>
-      </w:r>
-      <w:proofErr w:type="spellStart"/>
-      <w:r>
-        <w:rPr>
-          <w:rStyle w:val="Textesource"/>
-          <w:lang w:val="en-US"/>
-        </w:rPr>
-        <w:t>ico</w:t>
-      </w:r>
-      <w:proofErr w:type="spellEnd"/>
-      <w:r>
-        <w:rPr>
-          <w:lang w:val="en-US"/>
-        </w:rPr>
-        <w:t xml:space="preserve"> file to the setup project.</w:t>
+        <w:t xml:space="preserve">Set the </w:t>
+      </w:r>
+      <w:r>
+        <w:rPr>
+          <w:rStyle w:val="Strong"/>
+          <w:lang w:val="en-US"/>
+        </w:rPr>
+        <w:t>Setup Project</w:t>
+      </w:r>
+      <w:r>
+        <w:rPr>
+          <w:lang w:val="en-US"/>
+        </w:rPr>
+        <w:t xml:space="preserve"> as the startup project.</w:t>
       </w:r>
     </w:p>
     <w:p>
@@ -2946,7 +2755,7 @@
         <w:pStyle w:val="BodyText"/>
         <w:numPr>
           <w:ilvl w:val="0"/>
-          <w:numId w:val="12"/>
+          <w:numId w:val="13"/>
         </w:numPr>
         <w:tabs>
           <w:tab w:val="clear" w:pos="709"/>
@@ -2960,93 +2769,33 @@
         <w:rPr>
           <w:lang w:val="en-US"/>
         </w:rPr>
-        <w:t xml:space="preserve">Right-click your shortcut → </w:t>
+        <w:t xml:space="preserve">Right-click on the </w:t>
+      </w:r>
+      <w:r>
+        <w:rPr>
+          <w:rStyle w:val="Strong"/>
+          <w:lang w:val="en-US"/>
+        </w:rPr>
+        <w:t>Setup Project</w:t>
+      </w:r>
+      <w:r>
+        <w:rPr>
+          <w:lang w:val="en-US"/>
+        </w:rPr>
+        <w:t xml:space="preserve"> → </w:t>
       </w:r>
       <w:r>
         <w:rPr>
           <w:rStyle w:val="Textesource"/>
           <w:lang w:val="en-US"/>
         </w:rPr>
-        <w:t>Properties</w:t>
-      </w:r>
-      <w:r>
-        <w:rPr>
-          <w:lang w:val="en-US"/>
-        </w:rPr>
-        <w:t xml:space="preserve"> → Set </w:t>
-      </w:r>
-      <w:r>
-        <w:rPr>
-          <w:rStyle w:val="Strong"/>
-          <w:lang w:val="en-US"/>
-        </w:rPr>
-        <w:t>Icon</w:t>
-      </w:r>
-      <w:r>
-        <w:rPr>
-          <w:lang w:val="en-US"/>
-        </w:rPr>
-        <w:t xml:space="preserve"> to the added </w:t>
-      </w:r>
-      <w:r>
-        <w:rPr>
-          <w:rStyle w:val="Textesource"/>
+        <w:t>Build</w:t>
+      </w:r>
+      <w:r>
+        <w:rPr>
           <w:lang w:val="en-US"/>
         </w:rPr>
         <w:t>.</w:t>
-      </w:r>
-      <w:proofErr w:type="spellStart"/>
-      <w:r>
-        <w:rPr>
-          <w:rStyle w:val="Textesource"/>
-          <w:lang w:val="en-US"/>
-        </w:rPr>
-        <w:t>ico</w:t>
-      </w:r>
-      <w:proofErr w:type="spellEnd"/>
-      <w:r>
-        <w:rPr>
-          <w:lang w:val="en-US"/>
-        </w:rPr>
-        <w:t xml:space="preserve"> file.</w:t>
-      </w:r>
-    </w:p>
-    <w:p>
-      <w:pPr>
-        <w:pStyle w:val="Lignehorizontale"/>
-        <w:spacing w:after="140" w:line="276" w:lineRule="auto"/>
-        <w:rPr>
-          <w:sz w:val="24"/>
-          <w:szCs w:val="24"/>
-          <w:lang w:val="en-US"/>
-        </w:rPr>
-      </w:pPr>
-    </w:p>
-    <w:p>
-      <w:pPr>
-        <w:pStyle w:val="BodyText"/>
-        <w:rPr>
-          <w:rFonts w:ascii="Aptos" w:eastAsia="Aptos" w:hAnsi="Aptos"/>
-        </w:rPr>
-      </w:pPr>
-      <w:r>
-        <w:t xml:space="preserve">✅ </w:t>
-      </w:r>
-      <w:proofErr w:type="spellStart"/>
-      <w:r>
-        <w:t>Step</w:t>
-      </w:r>
-      <w:proofErr w:type="spellEnd"/>
-      <w:r>
-        <w:t xml:space="preserve"> 6: </w:t>
-      </w:r>
-      <w:proofErr w:type="spellStart"/>
-      <w:r>
-        <w:t>Build</w:t>
-      </w:r>
-      <w:proofErr w:type="spellEnd"/>
-      <w:r>
-        <w:t xml:space="preserve"> the MSI Installer</w:t>
       </w:r>
     </w:p>
     <w:p>
@@ -3068,107 +2817,15 @@
         <w:rPr>
           <w:lang w:val="en-US"/>
         </w:rPr>
-        <w:t xml:space="preserve">Set the </w:t>
-      </w:r>
-      <w:r>
-        <w:rPr>
-          <w:rStyle w:val="Strong"/>
-          <w:lang w:val="en-US"/>
-        </w:rPr>
-        <w:t>Setup Project</w:t>
-      </w:r>
-      <w:r>
-        <w:rPr>
-          <w:lang w:val="en-US"/>
-        </w:rPr>
-        <w:t xml:space="preserve"> as the startup project.</w:t>
-      </w:r>
-    </w:p>
-    <w:p>
-      <w:pPr>
-        <w:pStyle w:val="BodyText"/>
-        <w:numPr>
-          <w:ilvl w:val="0"/>
-          <w:numId w:val="13"/>
-        </w:numPr>
-        <w:tabs>
-          <w:tab w:val="clear" w:pos="709"/>
-          <w:tab w:val="left" w:pos="0"/>
-        </w:tabs>
-        <w:rPr>
-          <w:lang w:val="en-US"/>
-        </w:rPr>
-      </w:pPr>
-      <w:r>
-        <w:rPr>
-          <w:lang w:val="en-US"/>
-        </w:rPr>
-        <w:t xml:space="preserve">Right-click on the </w:t>
-      </w:r>
-      <w:r>
-        <w:rPr>
-          <w:rStyle w:val="Strong"/>
-          <w:lang w:val="en-US"/>
-        </w:rPr>
-        <w:t>Setup Project</w:t>
-      </w:r>
-      <w:r>
-        <w:rPr>
-          <w:lang w:val="en-US"/>
-        </w:rPr>
-        <w:t xml:space="preserve"> → </w:t>
+        <w:t xml:space="preserve">After build, you’ll find the </w:t>
       </w:r>
       <w:r>
         <w:rPr>
           <w:rStyle w:val="Textesource"/>
           <w:lang w:val="en-US"/>
         </w:rPr>
-        <w:t>Build</w:t>
-      </w:r>
-      <w:r>
-        <w:rPr>
-          <w:lang w:val="en-US"/>
-        </w:rPr>
-        <w:t>.</w:t>
-      </w:r>
-    </w:p>
-    <w:p>
-      <w:pPr>
-        <w:pStyle w:val="BodyText"/>
-        <w:numPr>
-          <w:ilvl w:val="0"/>
-          <w:numId w:val="13"/>
-        </w:numPr>
-        <w:tabs>
-          <w:tab w:val="clear" w:pos="709"/>
-          <w:tab w:val="left" w:pos="0"/>
-        </w:tabs>
-        <w:rPr>
-          <w:lang w:val="en-US"/>
-        </w:rPr>
-      </w:pPr>
-      <w:r>
-        <w:rPr>
-          <w:lang w:val="en-US"/>
-        </w:rPr>
-        <w:t xml:space="preserve">After build, you’ll find the </w:t>
-      </w:r>
-      <w:r>
-        <w:rPr>
-          <w:rStyle w:val="Textesource"/>
-          <w:lang w:val="en-US"/>
-        </w:rPr>
-        <w:t>.</w:t>
-      </w:r>
-      <w:proofErr w:type="spellStart"/>
-      <w:r>
-        <w:rPr>
-          <w:rStyle w:val="Textesource"/>
-          <w:lang w:val="en-US"/>
-        </w:rPr>
-        <w:t>msi</w:t>
-      </w:r>
-      <w:proofErr w:type="spellEnd"/>
+        <w:t>.msi</w:t>
+      </w:r>
       <w:r>
         <w:rPr>
           <w:lang w:val="en-US"/>
@@ -3192,29 +2849,16 @@
         </w:rPr>
       </w:pPr>
       <w:r>
-        <w:t xml:space="preserve">Display an </w:t>
-      </w:r>
-      <w:proofErr w:type="spellStart"/>
-      <w:r>
-        <w:t>opened</w:t>
-      </w:r>
-      <w:proofErr w:type="spellEnd"/>
-      <w:r>
-        <w:t xml:space="preserve"> file</w:t>
-      </w:r>
-    </w:p>
-    <w:p>
-      <w:pPr>
-        <w:pStyle w:val="BodyText"/>
-      </w:pPr>
-      <w:r>
-        <w:t xml:space="preserve">Given I click </w:t>
-      </w:r>
-      <w:proofErr w:type="spellStart"/>
-      <w:r>
-        <w:t>File→Open</w:t>
-      </w:r>
-      <w:proofErr w:type="spellEnd"/>
+        <w:t>Display an opened file</w:t>
+      </w:r>
+    </w:p>
+    <w:p>
+      <w:pPr>
+        <w:pStyle w:val="BodyText"/>
+      </w:pPr>
+      <w:r>
+        <w:t>Given I click File→Open</w:t>
+      </w:r>
     </w:p>
     <w:p>
       <w:pPr>
@@ -3276,6 +2920,7 @@
       <w:pPr>
         <w:pStyle w:val="Heading3"/>
         <w:rPr>
+          <w:rFonts w:hint="eastAsia"/>
           <w:lang w:val="en-US"/>
         </w:rPr>
       </w:pPr>
@@ -3353,7 +2998,7 @@
     <w:p>
       <w:pPr>
         <w:pStyle w:val="Heading3"/>
-        <w:ind w:left="0" w:firstLine="0"/>
+        <w:ind w:left="0"/>
         <w:rPr>
           <w:rFonts w:hint="eastAsia"/>
         </w:rPr>
@@ -3365,7 +3010,7 @@
     <w:p>
       <w:pPr>
         <w:pStyle w:val="Heading4"/>
-        <w:ind w:left="0" w:firstLine="0"/>
+        <w:ind w:left="0"/>
         <w:rPr>
           <w:rFonts w:hint="eastAsia"/>
         </w:rPr>
@@ -3402,13 +3047,8 @@
       <w:pPr>
         <w:pStyle w:val="BodyText"/>
       </w:pPr>
-      <w:proofErr w:type="spellStart"/>
-      <w:r>
-        <w:t>Recent</w:t>
-      </w:r>
-      <w:proofErr w:type="spellEnd"/>
-      <w:r>
-        <w:t xml:space="preserve"> Files</w:t>
+      <w:r>
+        <w:t>Recent Files</w:t>
       </w:r>
     </w:p>
     <w:p>
@@ -3481,7 +3121,6 @@
           <w:bCs/>
         </w:rPr>
       </w:pPr>
-      <w:proofErr w:type="spellStart"/>
       <w:r>
         <w:rPr>
           <w:b/>
@@ -3489,7 +3128,6 @@
         </w:rPr>
         <w:t>View</w:t>
       </w:r>
-      <w:proofErr w:type="spellEnd"/>
     </w:p>
     <w:p>
       <w:pPr>
@@ -3499,36 +3137,27 @@
           <w:bCs/>
         </w:rPr>
       </w:pPr>
-      <w:proofErr w:type="spellStart"/>
       <w:r>
         <w:rPr>
           <w:b/>
           <w:bCs/>
         </w:rPr>
-        <w:t>View</w:t>
-      </w:r>
-      <w:proofErr w:type="spellEnd"/>
-      <w:r>
+        <w:t xml:space="preserve">View As </w:t>
+      </w:r>
+    </w:p>
+    <w:p>
+      <w:pPr>
+        <w:pStyle w:val="BodyText"/>
         <w:rPr>
           <w:b/>
           <w:bCs/>
         </w:rPr>
-        <w:t xml:space="preserve"> As </w:t>
-      </w:r>
-    </w:p>
-    <w:p>
-      <w:pPr>
-        <w:pStyle w:val="BodyText"/>
+      </w:pPr>
+      <w:r>
         <w:rPr>
           <w:b/>
           <w:bCs/>
         </w:rPr>
-      </w:pPr>
-      <w:r>
-        <w:rPr>
-          <w:b/>
-          <w:bCs/>
-        </w:rPr>
         <w:tab/>
       </w:r>
       <w:r>
@@ -3568,12 +3197,8 @@
       </w:pPr>
       <w:r>
         <w:tab/>
-      </w:r>
-      <w:proofErr w:type="spellStart"/>
-      <w:r>
         <w:t>Detail</w:t>
       </w:r>
-      <w:proofErr w:type="spellEnd"/>
     </w:p>
     <w:p>
       <w:pPr>
@@ -3630,39 +3255,16 @@
         <w:pStyle w:val="BodyText"/>
       </w:pPr>
       <w:r>
-        <w:t xml:space="preserve">Given I click </w:t>
-      </w:r>
-      <w:proofErr w:type="spellStart"/>
-      <w:r>
-        <w:t>File→Browse</w:t>
-      </w:r>
-      <w:proofErr w:type="spellEnd"/>
-    </w:p>
-    <w:p>
-      <w:pPr>
-        <w:pStyle w:val="BodyText"/>
-      </w:pPr>
-      <w:proofErr w:type="spellStart"/>
-      <w:r>
-        <w:t>When</w:t>
-      </w:r>
-      <w:proofErr w:type="spellEnd"/>
-      <w:r>
-        <w:t xml:space="preserve"> no file </w:t>
-      </w:r>
-      <w:proofErr w:type="spellStart"/>
-      <w:r>
-        <w:t>is</w:t>
-      </w:r>
-      <w:proofErr w:type="spellEnd"/>
-      <w:r>
-        <w:t xml:space="preserve"> </w:t>
-      </w:r>
-      <w:proofErr w:type="spellStart"/>
-      <w:r>
-        <w:t>opened</w:t>
-      </w:r>
-      <w:proofErr w:type="spellEnd"/>
+        <w:t>Given I click File→Browse</w:t>
+      </w:r>
+    </w:p>
+    <w:p>
+      <w:pPr>
+        <w:pStyle w:val="BodyText"/>
+      </w:pPr>
+      <w:r>
+        <w:t>When no file is opened</w:t>
+      </w:r>
     </w:p>
     <w:p>
       <w:pPr>
@@ -3855,16 +3457,8 @@
         <w:rPr>
           <w:lang w:val="en-US"/>
         </w:rPr>
-        <w:t xml:space="preserve">Given I click </w:t>
-      </w:r>
-      <w:proofErr w:type="spellStart"/>
-      <w:r>
-        <w:rPr>
-          <w:lang w:val="en-US"/>
-        </w:rPr>
-        <w:t>File→Browse</w:t>
-      </w:r>
-      <w:proofErr w:type="spellEnd"/>
+        <w:t>Given I click File→Browse</w:t>
+      </w:r>
     </w:p>
     <w:p>
       <w:pPr>
@@ -3941,16 +3535,8 @@
         <w:rPr>
           <w:lang w:val="en-US"/>
         </w:rPr>
-        <w:t xml:space="preserve">Given I click </w:t>
-      </w:r>
-      <w:proofErr w:type="spellStart"/>
-      <w:r>
-        <w:rPr>
-          <w:lang w:val="en-US"/>
-        </w:rPr>
-        <w:t>File→Browse</w:t>
-      </w:r>
-      <w:proofErr w:type="spellEnd"/>
+        <w:t>Given I click File→Browse</w:t>
+      </w:r>
     </w:p>
     <w:p>
       <w:pPr>
@@ -4027,16 +3613,8 @@
         <w:rPr>
           <w:lang w:val="en-US"/>
         </w:rPr>
-        <w:t xml:space="preserve">Given I click </w:t>
-      </w:r>
-      <w:proofErr w:type="spellStart"/>
-      <w:r>
-        <w:rPr>
-          <w:lang w:val="en-US"/>
-        </w:rPr>
-        <w:t>File→Browse</w:t>
-      </w:r>
-      <w:proofErr w:type="spellEnd"/>
+        <w:t>Given I click File→Browse</w:t>
+      </w:r>
     </w:p>
     <w:p>
       <w:pPr>
@@ -4195,16 +3773,8 @@
         <w:rPr>
           <w:lang w:val="en-US"/>
         </w:rPr>
-        <w:t xml:space="preserve">When I do </w:t>
-      </w:r>
-      <w:proofErr w:type="spellStart"/>
-      <w:r>
-        <w:rPr>
-          <w:lang w:val="en-US"/>
-        </w:rPr>
-        <w:t>File→Open</w:t>
-      </w:r>
-      <w:proofErr w:type="spellEnd"/>
+        <w:t>When I do File→Open</w:t>
+      </w:r>
     </w:p>
     <w:p>
       <w:pPr>
@@ -4281,21 +3851,7 @@
         <w:rPr>
           <w:lang w:val="en-US"/>
         </w:rPr>
-        <w:t xml:space="preserve">When I do </w:t>
-      </w:r>
-      <w:proofErr w:type="spellStart"/>
-      <w:r>
-        <w:rPr>
-          <w:lang w:val="en-US"/>
-        </w:rPr>
-        <w:t>File→Recent</w:t>
-      </w:r>
-      <w:proofErr w:type="spellEnd"/>
-      <w:r>
-        <w:rPr>
-          <w:lang w:val="en-US"/>
-        </w:rPr>
-        <w:t xml:space="preserve"> Files and select a file</w:t>
+        <w:t>When I do File→Recent Files and select a file</w:t>
       </w:r>
     </w:p>
     <w:p>
@@ -4373,16 +3929,8 @@
         <w:rPr>
           <w:lang w:val="en-US"/>
         </w:rPr>
-        <w:t xml:space="preserve">When I do </w:t>
-      </w:r>
-      <w:proofErr w:type="spellStart"/>
-      <w:r>
-        <w:rPr>
-          <w:lang w:val="en-US"/>
-        </w:rPr>
-        <w:t>File→Close</w:t>
-      </w:r>
-      <w:proofErr w:type="spellEnd"/>
+        <w:t>When I do File→Close</w:t>
+      </w:r>
     </w:p>
     <w:p>
       <w:pPr>
@@ -4459,16 +4007,8 @@
         <w:rPr>
           <w:lang w:val="en-US"/>
         </w:rPr>
-        <w:t xml:space="preserve">When I do </w:t>
-      </w:r>
-      <w:proofErr w:type="spellStart"/>
-      <w:r>
-        <w:rPr>
-          <w:lang w:val="en-US"/>
-        </w:rPr>
-        <w:t>File→Close</w:t>
-      </w:r>
-      <w:proofErr w:type="spellEnd"/>
+        <w:t>When I do File→Close</w:t>
+      </w:r>
     </w:p>
     <w:p>
       <w:pPr>
@@ -4545,21 +4085,7 @@
         <w:rPr>
           <w:lang w:val="en-US"/>
         </w:rPr>
-        <w:t xml:space="preserve">and when I do </w:t>
-      </w:r>
-      <w:proofErr w:type="spellStart"/>
-      <w:r>
-        <w:rPr>
-          <w:lang w:val="en-US"/>
-        </w:rPr>
-        <w:t>File→Close</w:t>
-      </w:r>
-      <w:proofErr w:type="spellEnd"/>
-      <w:r>
-        <w:rPr>
-          <w:lang w:val="en-US"/>
-        </w:rPr>
-        <w:t xml:space="preserve"> ALL</w:t>
+        <w:t>and when I do File→Close ALL</w:t>
       </w:r>
     </w:p>
     <w:p>
@@ -4623,21 +4149,7 @@
         <w:rPr>
           <w:lang w:val="en-US"/>
         </w:rPr>
-        <w:t xml:space="preserve">and when I do </w:t>
-      </w:r>
-      <w:proofErr w:type="spellStart"/>
-      <w:r>
-        <w:rPr>
-          <w:lang w:val="en-US"/>
-        </w:rPr>
-        <w:t>File→Close</w:t>
-      </w:r>
-      <w:proofErr w:type="spellEnd"/>
-      <w:r>
-        <w:rPr>
-          <w:lang w:val="en-US"/>
-        </w:rPr>
-        <w:t xml:space="preserve"> ALL</w:t>
+        <w:t>and when I do File→Close ALL</w:t>
       </w:r>
     </w:p>
     <w:p>
@@ -4745,6 +4257,280 @@
         </w:rPr>
         <w:t>Then I should open the file in another pane</w:t>
       </w:r>
+    </w:p>
+    <w:p>
+      <w:pPr>
+        <w:pStyle w:val="Heading1"/>
+        <w:rPr>
+          <w:lang w:val="en-US"/>
+        </w:rPr>
+      </w:pPr>
+      <w:r>
+        <w:rPr>
+          <w:lang w:val="en-US"/>
+        </w:rPr>
+        <w:lastRenderedPageBreak/>
+        <w:t>Tests</w:t>
+      </w:r>
+    </w:p>
+    <w:p>
+      <w:pPr>
+        <w:pStyle w:val="Heading2"/>
+      </w:pPr>
+      <w:r>
+        <w:t xml:space="preserve">Utiliser Visual studio </w:t>
+      </w:r>
+    </w:p>
+    <w:p>
+      <w:pPr>
+        <w:pStyle w:val="BodyText"/>
+      </w:pPr>
+      <w:r>
+        <w:rPr>
+          <w:noProof/>
+        </w:rPr>
+        <w:drawing>
+          <wp:inline distT="0" distB="0" distL="0" distR="0" wp14:anchorId="29E8DD73" wp14:editId="3A2A7010">
+            <wp:extent cx="2122170" cy="1652905"/>
+            <wp:effectExtent l="0" t="0" r="0" b="0"/>
+            <wp:docPr id="625316419" name="Picture 1"/>
+            <wp:cNvGraphicFramePr>
+              <a:graphicFrameLocks xmlns:a="http://schemas.openxmlformats.org/drawingml/2006/main" noChangeAspect="1"/>
+            </wp:cNvGraphicFramePr>
+            <a:graphic xmlns:a="http://schemas.openxmlformats.org/drawingml/2006/main">
+              <a:graphicData uri="http://schemas.openxmlformats.org/drawingml/2006/picture">
+                <pic:pic xmlns:pic="http://schemas.openxmlformats.org/drawingml/2006/picture">
+                  <pic:nvPicPr>
+                    <pic:cNvPr id="0" name="Picture 2"/>
+                    <pic:cNvPicPr>
+                      <a:picLocks noChangeAspect="1" noChangeArrowheads="1"/>
+                    </pic:cNvPicPr>
+                  </pic:nvPicPr>
+                  <pic:blipFill>
+                    <a:blip r:embed="rId11" cstate="print">
+                      <a:extLst>
+                        <a:ext uri="{28A0092B-C50C-407E-A947-70E740481C1C}">
+                          <a14:useLocalDpi xmlns:a14="http://schemas.microsoft.com/office/drawing/2010/main" val="0"/>
+                        </a:ext>
+                      </a:extLst>
+                    </a:blip>
+                    <a:srcRect/>
+                    <a:stretch>
+                      <a:fillRect/>
+                    </a:stretch>
+                  </pic:blipFill>
+                  <pic:spPr bwMode="auto">
+                    <a:xfrm>
+                      <a:off x="0" y="0"/>
+                      <a:ext cx="2122170" cy="1652905"/>
+                    </a:xfrm>
+                    <a:prstGeom prst="rect">
+                      <a:avLst/>
+                    </a:prstGeom>
+                    <a:noFill/>
+                    <a:ln>
+                      <a:noFill/>
+                    </a:ln>
+                  </pic:spPr>
+                </pic:pic>
+              </a:graphicData>
+            </a:graphic>
+          </wp:inline>
+        </w:drawing>
+      </w:r>
+    </w:p>
+    <w:p>
+      <w:pPr>
+        <w:pStyle w:val="Heading2"/>
+      </w:pPr>
+      <w:r>
+        <w:t>Utiliser Reportgenerator</w:t>
+      </w:r>
+    </w:p>
+    <w:p>
+      <w:pPr>
+        <w:tabs>
+          <w:tab w:val="left" w:pos="916"/>
+          <w:tab w:val="left" w:pos="1832"/>
+          <w:tab w:val="left" w:pos="2748"/>
+          <w:tab w:val="left" w:pos="3664"/>
+          <w:tab w:val="left" w:pos="4580"/>
+          <w:tab w:val="left" w:pos="5496"/>
+          <w:tab w:val="left" w:pos="6412"/>
+          <w:tab w:val="left" w:pos="7328"/>
+          <w:tab w:val="left" w:pos="8244"/>
+          <w:tab w:val="left" w:pos="9160"/>
+          <w:tab w:val="left" w:pos="10076"/>
+          <w:tab w:val="left" w:pos="10992"/>
+          <w:tab w:val="left" w:pos="11908"/>
+          <w:tab w:val="left" w:pos="12824"/>
+          <w:tab w:val="left" w:pos="13740"/>
+          <w:tab w:val="left" w:pos="14656"/>
+        </w:tabs>
+        <w:suppressAutoHyphens w:val="0"/>
+        <w:spacing w:after="0" w:line="240" w:lineRule="auto"/>
+        <w:rPr>
+          <w:rFonts w:ascii="Cascadia Mono" w:eastAsia="Times New Roman" w:hAnsi="Cascadia Mono" w:cs="Courier New"/>
+          <w:color w:val="000000"/>
+          <w:sz w:val="18"/>
+          <w:szCs w:val="18"/>
+          <w:lang w:eastAsia="fr-FR"/>
+        </w:rPr>
+      </w:pPr>
+    </w:p>
+    <w:p>
+      <w:pPr>
+        <w:tabs>
+          <w:tab w:val="left" w:pos="916"/>
+          <w:tab w:val="left" w:pos="1832"/>
+          <w:tab w:val="left" w:pos="2748"/>
+          <w:tab w:val="left" w:pos="3664"/>
+          <w:tab w:val="left" w:pos="4580"/>
+          <w:tab w:val="left" w:pos="5496"/>
+          <w:tab w:val="left" w:pos="6412"/>
+          <w:tab w:val="left" w:pos="7328"/>
+          <w:tab w:val="left" w:pos="8244"/>
+          <w:tab w:val="left" w:pos="9160"/>
+          <w:tab w:val="left" w:pos="10076"/>
+          <w:tab w:val="left" w:pos="10992"/>
+          <w:tab w:val="left" w:pos="11908"/>
+          <w:tab w:val="left" w:pos="12824"/>
+          <w:tab w:val="left" w:pos="13740"/>
+          <w:tab w:val="left" w:pos="14656"/>
+        </w:tabs>
+        <w:suppressAutoHyphens w:val="0"/>
+        <w:spacing w:after="0" w:line="240" w:lineRule="auto"/>
+        <w:rPr>
+          <w:rFonts w:ascii="Cascadia Mono" w:eastAsia="Times New Roman" w:hAnsi="Cascadia Mono" w:cs="Courier New"/>
+          <w:color w:val="000000"/>
+          <w:sz w:val="18"/>
+          <w:szCs w:val="18"/>
+          <w:lang w:val="en-US" w:eastAsia="fr-FR"/>
+        </w:rPr>
+      </w:pPr>
+      <w:r>
+        <w:rPr>
+          <w:rFonts w:ascii="Cascadia Mono" w:eastAsia="Times New Roman" w:hAnsi="Cascadia Mono" w:cs="Courier New"/>
+          <w:color w:val="000000"/>
+          <w:sz w:val="18"/>
+          <w:szCs w:val="18"/>
+          <w:lang w:val="en-US" w:eastAsia="fr-FR"/>
+        </w:rPr>
+        <w:t>dotnet tool install -g reportgenerator</w:t>
+      </w:r>
+    </w:p>
+    <w:p>
+      <w:pPr>
+        <w:pStyle w:val="BodyText"/>
+        <w:rPr>
+          <w:lang w:val="en-US"/>
+        </w:rPr>
+      </w:pPr>
+    </w:p>
+    <w:p>
+      <w:r>
+        <w:t>Pour générer le report d</w:t>
+      </w:r>
+      <w:r>
+        <w:t xml:space="preserve">es tests : </w:t>
+      </w:r>
+    </w:p>
+    <w:p>
+      <w:r>
+        <w:t xml:space="preserve">Générer les tests et la couverture : </w:t>
+      </w:r>
+    </w:p>
+    <w:p>
+      <w:pPr>
+        <w:pStyle w:val="BodyText"/>
+      </w:pPr>
+      <w:r>
+        <w:t># Générer les tests + couverture</w:t>
+      </w:r>
+    </w:p>
+    <w:p>
+      <w:pPr>
+        <w:pStyle w:val="BodyText"/>
+      </w:pPr>
+      <w:r>
+        <w:t>dotnet test PictureViewerTests/PictureViewerTests.csproj --collect:"XPlat Code Coverage"</w:t>
+      </w:r>
+      <w:r>
+        <w:t xml:space="preserve"> </w:t>
+      </w:r>
+    </w:p>
+    <w:p>
+      <w:pPr>
+        <w:pStyle w:val="BodyText"/>
+        <w:rPr>
+          <w:lang w:val="en-US"/>
+        </w:rPr>
+      </w:pPr>
+      <w:r>
+        <w:rPr>
+          <w:lang w:val="en-US"/>
+        </w:rPr>
+        <w:t xml:space="preserve">L’emplacement est là : </w:t>
+      </w:r>
+      <w:r>
+        <w:rPr>
+          <w:lang w:val="en-US"/>
+        </w:rPr>
+        <w:t>C:\Users\hicha\Data\Projets\PictureView\PictureViewerTests\TestResults\4b083bf0-ff4f-4b42-b991-e5393d67fd88</w:t>
+      </w:r>
+      <w:r>
+        <w:rPr>
+          <w:lang w:val="en-US"/>
+        </w:rPr>
+        <w:t>\</w:t>
+      </w:r>
+      <w:r>
+        <w:rPr>
+          <w:lang w:val="en-US"/>
+        </w:rPr>
+        <w:t>coverage.cobertura.xml</w:t>
+      </w:r>
+    </w:p>
+    <w:p>
+      <w:pPr>
+        <w:pStyle w:val="BodyText"/>
+      </w:pPr>
+      <w:r>
+        <w:t>Générer le report de couvet</w:t>
+      </w:r>
+      <w:r>
+        <w:t>ure</w:t>
+      </w:r>
+    </w:p>
+    <w:p>
+      <w:pPr>
+        <w:pStyle w:val="BodyText"/>
+        <w:rPr>
+          <w:lang w:val="en-US"/>
+        </w:rPr>
+      </w:pPr>
+      <w:r>
+        <w:rPr>
+          <w:lang w:val="en-US"/>
+        </w:rPr>
+        <w:t>reportgenerator -reports:"C:\Users\hicha\Data\Projets\PictureView\PictureViewerTests\TestResults\f8ac3d8d-15f0-44b3-a1c5-16240d501c4a/coverage.cobertura.xml" -targetdir:"coveragereport""</w:t>
+      </w:r>
+    </w:p>
+    <w:p>
+      <w:pPr>
+        <w:pStyle w:val="BodyText"/>
+        <w:rPr>
+          <w:lang w:val="en-US"/>
+        </w:rPr>
+      </w:pPr>
+    </w:p>
+    <w:p>
+      <w:pPr>
+        <w:pStyle w:val="BodyText"/>
+        <w:rPr>
+          <w:lang w:val="en-US"/>
+        </w:rPr>
+      </w:pPr>
     </w:p>
     <w:p>
       <w:pPr>
@@ -4889,6 +4675,101 @@
     </w:lvl>
   </w:abstractNum>
   <w:abstractNum w:abstractNumId="1" w15:restartNumberingAfterBreak="0">
+    <w:nsid w:val="0B3115B5"/>
+    <w:multiLevelType w:val="multilevel"/>
+    <w:tmpl w:val="040C0027"/>
+    <w:lvl w:ilvl="0">
+      <w:start w:val="1"/>
+      <w:numFmt w:val="upperRoman"/>
+      <w:pStyle w:val="Heading1"/>
+      <w:lvlText w:val="%1."/>
+      <w:lvlJc w:val="left"/>
+      <w:pPr>
+        <w:ind w:left="0" w:firstLine="0"/>
+      </w:pPr>
+    </w:lvl>
+    <w:lvl w:ilvl="1">
+      <w:start w:val="1"/>
+      <w:numFmt w:val="upperLetter"/>
+      <w:pStyle w:val="Heading2"/>
+      <w:lvlText w:val="%2."/>
+      <w:lvlJc w:val="left"/>
+      <w:pPr>
+        <w:ind w:left="720" w:firstLine="0"/>
+      </w:pPr>
+    </w:lvl>
+    <w:lvl w:ilvl="2">
+      <w:start w:val="1"/>
+      <w:numFmt w:val="decimal"/>
+      <w:pStyle w:val="Heading3"/>
+      <w:lvlText w:val="%3."/>
+      <w:lvlJc w:val="left"/>
+      <w:pPr>
+        <w:ind w:left="1440" w:firstLine="0"/>
+      </w:pPr>
+    </w:lvl>
+    <w:lvl w:ilvl="3">
+      <w:start w:val="1"/>
+      <w:numFmt w:val="lowerLetter"/>
+      <w:pStyle w:val="Heading4"/>
+      <w:lvlText w:val="%4)"/>
+      <w:lvlJc w:val="left"/>
+      <w:pPr>
+        <w:ind w:left="2160" w:firstLine="0"/>
+      </w:pPr>
+    </w:lvl>
+    <w:lvl w:ilvl="4">
+      <w:start w:val="1"/>
+      <w:numFmt w:val="decimal"/>
+      <w:pStyle w:val="Heading5"/>
+      <w:lvlText w:val="(%5)"/>
+      <w:lvlJc w:val="left"/>
+      <w:pPr>
+        <w:ind w:left="2880" w:firstLine="0"/>
+      </w:pPr>
+    </w:lvl>
+    <w:lvl w:ilvl="5">
+      <w:start w:val="1"/>
+      <w:numFmt w:val="lowerLetter"/>
+      <w:pStyle w:val="Heading6"/>
+      <w:lvlText w:val="(%6)"/>
+      <w:lvlJc w:val="left"/>
+      <w:pPr>
+        <w:ind w:left="3600" w:firstLine="0"/>
+      </w:pPr>
+    </w:lvl>
+    <w:lvl w:ilvl="6">
+      <w:start w:val="1"/>
+      <w:numFmt w:val="lowerRoman"/>
+      <w:pStyle w:val="Heading7"/>
+      <w:lvlText w:val="(%7)"/>
+      <w:lvlJc w:val="left"/>
+      <w:pPr>
+        <w:ind w:left="4320" w:firstLine="0"/>
+      </w:pPr>
+    </w:lvl>
+    <w:lvl w:ilvl="7">
+      <w:start w:val="1"/>
+      <w:numFmt w:val="lowerLetter"/>
+      <w:pStyle w:val="Heading8"/>
+      <w:lvlText w:val="(%8)"/>
+      <w:lvlJc w:val="left"/>
+      <w:pPr>
+        <w:ind w:left="5040" w:firstLine="0"/>
+      </w:pPr>
+    </w:lvl>
+    <w:lvl w:ilvl="8">
+      <w:start w:val="1"/>
+      <w:numFmt w:val="lowerRoman"/>
+      <w:pStyle w:val="Heading9"/>
+      <w:lvlText w:val="(%9)"/>
+      <w:lvlJc w:val="left"/>
+      <w:pPr>
+        <w:ind w:left="5760" w:firstLine="0"/>
+      </w:pPr>
+    </w:lvl>
+  </w:abstractNum>
+  <w:abstractNum w:abstractNumId="2" w15:restartNumberingAfterBreak="0">
     <w:nsid w:val="18F17CED"/>
     <w:multiLevelType w:val="multilevel"/>
     <w:tmpl w:val="D2C2E2F4"/>
@@ -5028,7 +4909,7 @@
       </w:rPr>
     </w:lvl>
   </w:abstractNum>
-  <w:abstractNum w:abstractNumId="2" w15:restartNumberingAfterBreak="0">
+  <w:abstractNum w:abstractNumId="3" w15:restartNumberingAfterBreak="0">
     <w:nsid w:val="247018CD"/>
     <w:multiLevelType w:val="multilevel"/>
     <w:tmpl w:val="50FC5ED0"/>
@@ -5168,7 +5049,7 @@
       </w:rPr>
     </w:lvl>
   </w:abstractNum>
-  <w:abstractNum w:abstractNumId="3" w15:restartNumberingAfterBreak="0">
+  <w:abstractNum w:abstractNumId="4" w15:restartNumberingAfterBreak="0">
     <w:nsid w:val="2E0A6C93"/>
     <w:multiLevelType w:val="multilevel"/>
     <w:tmpl w:val="3E862470"/>
@@ -5305,7 +5186,7 @@
       </w:rPr>
     </w:lvl>
   </w:abstractNum>
-  <w:abstractNum w:abstractNumId="4" w15:restartNumberingAfterBreak="0">
+  <w:abstractNum w:abstractNumId="5" w15:restartNumberingAfterBreak="0">
     <w:nsid w:val="2E7D3EDA"/>
     <w:multiLevelType w:val="multilevel"/>
     <w:tmpl w:val="06AA1AD6"/>
@@ -5445,7 +5326,7 @@
       </w:rPr>
     </w:lvl>
   </w:abstractNum>
-  <w:abstractNum w:abstractNumId="5" w15:restartNumberingAfterBreak="0">
+  <w:abstractNum w:abstractNumId="6" w15:restartNumberingAfterBreak="0">
     <w:nsid w:val="380E29D8"/>
     <w:multiLevelType w:val="multilevel"/>
     <w:tmpl w:val="F1A6EEF6"/>
@@ -5585,7 +5466,7 @@
       </w:rPr>
     </w:lvl>
   </w:abstractNum>
-  <w:abstractNum w:abstractNumId="6" w15:restartNumberingAfterBreak="0">
+  <w:abstractNum w:abstractNumId="7" w15:restartNumberingAfterBreak="0">
     <w:nsid w:val="38CA5D6A"/>
     <w:multiLevelType w:val="multilevel"/>
     <w:tmpl w:val="D8106992"/>
@@ -5698,7 +5579,7 @@
       </w:pPr>
     </w:lvl>
   </w:abstractNum>
-  <w:abstractNum w:abstractNumId="7" w15:restartNumberingAfterBreak="0">
+  <w:abstractNum w:abstractNumId="8" w15:restartNumberingAfterBreak="0">
     <w:nsid w:val="541864B8"/>
     <w:multiLevelType w:val="multilevel"/>
     <w:tmpl w:val="5C0009B2"/>
@@ -5835,7 +5716,7 @@
       </w:rPr>
     </w:lvl>
   </w:abstractNum>
-  <w:abstractNum w:abstractNumId="8" w15:restartNumberingAfterBreak="0">
+  <w:abstractNum w:abstractNumId="9" w15:restartNumberingAfterBreak="0">
     <w:nsid w:val="54E8028B"/>
     <w:multiLevelType w:val="multilevel"/>
     <w:tmpl w:val="8F9AAA4A"/>
@@ -5960,7 +5841,7 @@
       </w:rPr>
     </w:lvl>
   </w:abstractNum>
-  <w:abstractNum w:abstractNumId="9" w15:restartNumberingAfterBreak="0">
+  <w:abstractNum w:abstractNumId="10" w15:restartNumberingAfterBreak="0">
     <w:nsid w:val="5B4D6541"/>
     <w:multiLevelType w:val="multilevel"/>
     <w:tmpl w:val="90E4E630"/>
@@ -6073,7 +5954,7 @@
       </w:pPr>
     </w:lvl>
   </w:abstractNum>
-  <w:abstractNum w:abstractNumId="10" w15:restartNumberingAfterBreak="0">
+  <w:abstractNum w:abstractNumId="11" w15:restartNumberingAfterBreak="0">
     <w:nsid w:val="61F830B2"/>
     <w:multiLevelType w:val="multilevel"/>
     <w:tmpl w:val="A2A29264"/>
@@ -6213,7 +6094,7 @@
       </w:rPr>
     </w:lvl>
   </w:abstractNum>
-  <w:abstractNum w:abstractNumId="11" w15:restartNumberingAfterBreak="0">
+  <w:abstractNum w:abstractNumId="12" w15:restartNumberingAfterBreak="0">
     <w:nsid w:val="68931BE2"/>
     <w:multiLevelType w:val="multilevel"/>
     <w:tmpl w:val="EB0A841E"/>
@@ -6326,10 +6207,10 @@
       </w:pPr>
     </w:lvl>
   </w:abstractNum>
-  <w:abstractNum w:abstractNumId="12" w15:restartNumberingAfterBreak="0">
+  <w:abstractNum w:abstractNumId="13" w15:restartNumberingAfterBreak="0">
     <w:nsid w:val="6FDF0338"/>
     <w:multiLevelType w:val="multilevel"/>
-    <w:tmpl w:val="5E321702"/>
+    <w:tmpl w:val="BEDC98A0"/>
     <w:lvl w:ilvl="0">
       <w:start w:val="1"/>
       <w:numFmt w:val="upperRoman"/>
@@ -6345,7 +6226,6 @@
     <w:lvl w:ilvl="1">
       <w:start w:val="1"/>
       <w:numFmt w:val="upperLetter"/>
-      <w:pStyle w:val="Heading2"/>
       <w:lvlText w:val="%2."/>
       <w:lvlJc w:val="left"/>
       <w:pPr>
@@ -6358,7 +6238,6 @@
     <w:lvl w:ilvl="2">
       <w:start w:val="1"/>
       <w:numFmt w:val="decimal"/>
-      <w:pStyle w:val="Heading3"/>
       <w:lvlText w:val="%3."/>
       <w:lvlJc w:val="left"/>
       <w:pPr>
@@ -6371,7 +6250,6 @@
     <w:lvl w:ilvl="3">
       <w:start w:val="1"/>
       <w:numFmt w:val="lowerLetter"/>
-      <w:pStyle w:val="Heading4"/>
       <w:lvlText w:val="%4."/>
       <w:lvlJc w:val="left"/>
       <w:pPr>
@@ -6384,7 +6262,6 @@
     <w:lvl w:ilvl="4">
       <w:start w:val="1"/>
       <w:numFmt w:val="lowerRoman"/>
-      <w:pStyle w:val="Heading5"/>
       <w:lvlText w:val="%5."/>
       <w:lvlJc w:val="right"/>
       <w:pPr>
@@ -6397,7 +6274,6 @@
     <w:lvl w:ilvl="5">
       <w:start w:val="1"/>
       <w:numFmt w:val="bullet"/>
-      <w:pStyle w:val="Heading6"/>
       <w:lvlText w:val=""/>
       <w:lvlJc w:val="left"/>
       <w:pPr>
@@ -6413,7 +6289,6 @@
     <w:lvl w:ilvl="6">
       <w:start w:val="1"/>
       <w:numFmt w:val="bullet"/>
-      <w:pStyle w:val="Heading7"/>
       <w:lvlText w:val=""/>
       <w:lvlJc w:val="left"/>
       <w:pPr>
@@ -6457,7 +6332,7 @@
       </w:rPr>
     </w:lvl>
   </w:abstractNum>
-  <w:abstractNum w:abstractNumId="13" w15:restartNumberingAfterBreak="0">
+  <w:abstractNum w:abstractNumId="14" w15:restartNumberingAfterBreak="0">
     <w:nsid w:val="7E567E65"/>
     <w:multiLevelType w:val="multilevel"/>
     <w:tmpl w:val="77B274CC"/>
@@ -6571,49 +6446,52 @@
     </w:lvl>
   </w:abstractNum>
   <w:num w:numId="1" w16cid:durableId="1918395792">
+    <w:abstractNumId w:val="13"/>
+  </w:num>
+  <w:num w:numId="2" w16cid:durableId="235436327">
+    <w:abstractNumId w:val="2"/>
+  </w:num>
+  <w:num w:numId="3" w16cid:durableId="1079253836">
+    <w:abstractNumId w:val="6"/>
+  </w:num>
+  <w:num w:numId="4" w16cid:durableId="1965308491">
+    <w:abstractNumId w:val="3"/>
+  </w:num>
+  <w:num w:numId="5" w16cid:durableId="1387877710">
+    <w:abstractNumId w:val="9"/>
+  </w:num>
+  <w:num w:numId="6" w16cid:durableId="1666319252">
+    <w:abstractNumId w:val="5"/>
+  </w:num>
+  <w:num w:numId="7" w16cid:durableId="737443073">
     <w:abstractNumId w:val="12"/>
   </w:num>
-  <w:num w:numId="2" w16cid:durableId="235436327">
-    <w:abstractNumId w:val="1"/>
+  <w:num w:numId="8" w16cid:durableId="1265922446">
+    <w:abstractNumId w:val="7"/>
   </w:num>
-  <w:num w:numId="3" w16cid:durableId="1079253836">
-    <w:abstractNumId w:val="5"/>
+  <w:num w:numId="9" w16cid:durableId="243537449">
+    <w:abstractNumId w:val="10"/>
   </w:num>
-  <w:num w:numId="4" w16cid:durableId="1965308491">
-    <w:abstractNumId w:val="2"/>
-  </w:num>
-  <w:num w:numId="5" w16cid:durableId="1387877710">
+  <w:num w:numId="10" w16cid:durableId="2126388553">
     <w:abstractNumId w:val="8"/>
   </w:num>
-  <w:num w:numId="6" w16cid:durableId="1666319252">
+  <w:num w:numId="11" w16cid:durableId="1754088112">
     <w:abstractNumId w:val="4"/>
-  </w:num>
-  <w:num w:numId="7" w16cid:durableId="737443073">
-    <w:abstractNumId w:val="11"/>
-  </w:num>
-  <w:num w:numId="8" w16cid:durableId="1265922446">
-    <w:abstractNumId w:val="6"/>
-  </w:num>
-  <w:num w:numId="9" w16cid:durableId="243537449">
-    <w:abstractNumId w:val="9"/>
-  </w:num>
-  <w:num w:numId="10" w16cid:durableId="2126388553">
-    <w:abstractNumId w:val="7"/>
-  </w:num>
-  <w:num w:numId="11" w16cid:durableId="1754088112">
-    <w:abstractNumId w:val="3"/>
   </w:num>
   <w:num w:numId="12" w16cid:durableId="1323312065">
     <w:abstractNumId w:val="0"/>
   </w:num>
   <w:num w:numId="13" w16cid:durableId="1058895583">
+    <w:abstractNumId w:val="14"/>
+  </w:num>
+  <w:num w:numId="14" w16cid:durableId="1245644033">
+    <w:abstractNumId w:val="11"/>
+  </w:num>
+  <w:num w:numId="15" w16cid:durableId="366370250">
     <w:abstractNumId w:val="13"/>
   </w:num>
-  <w:num w:numId="14" w16cid:durableId="1245644033">
-    <w:abstractNumId w:val="10"/>
-  </w:num>
-  <w:num w:numId="15" w16cid:durableId="366370250">
-    <w:abstractNumId w:val="12"/>
+  <w:num w:numId="16" w16cid:durableId="866798513">
+    <w:abstractNumId w:val="1"/>
   </w:num>
 </w:numbering>
 </file>
@@ -7030,6 +6908,9 @@
     <w:pPr>
       <w:keepNext/>
       <w:keepLines/>
+      <w:numPr>
+        <w:numId w:val="16"/>
+      </w:numPr>
       <w:spacing w:before="360" w:after="80"/>
       <w:outlineLvl w:val="0"/>
     </w:pPr>
@@ -7048,7 +6929,7 @@
     <w:pPr>
       <w:numPr>
         <w:ilvl w:val="1"/>
-        <w:numId w:val="1"/>
+        <w:numId w:val="16"/>
       </w:numPr>
       <w:spacing w:before="200"/>
       <w:outlineLvl w:val="1"/>
@@ -7068,7 +6949,7 @@
     <w:pPr>
       <w:numPr>
         <w:ilvl w:val="2"/>
-        <w:numId w:val="1"/>
+        <w:numId w:val="16"/>
       </w:numPr>
       <w:spacing w:before="140"/>
       <w:outlineLvl w:val="2"/>
@@ -7086,7 +6967,7 @@
     <w:pPr>
       <w:numPr>
         <w:ilvl w:val="3"/>
-        <w:numId w:val="1"/>
+        <w:numId w:val="16"/>
       </w:numPr>
       <w:spacing w:before="120"/>
       <w:outlineLvl w:val="3"/>
@@ -7108,7 +6989,7 @@
     <w:pPr>
       <w:numPr>
         <w:ilvl w:val="4"/>
-        <w:numId w:val="1"/>
+        <w:numId w:val="16"/>
       </w:numPr>
       <w:spacing w:before="120" w:after="60"/>
       <w:outlineLvl w:val="4"/>
@@ -7128,7 +7009,7 @@
     <w:pPr>
       <w:numPr>
         <w:ilvl w:val="5"/>
-        <w:numId w:val="1"/>
+        <w:numId w:val="16"/>
       </w:numPr>
       <w:spacing w:before="60" w:after="60"/>
       <w:outlineLvl w:val="5"/>
@@ -7150,7 +7031,7 @@
     <w:pPr>
       <w:numPr>
         <w:ilvl w:val="6"/>
-        <w:numId w:val="1"/>
+        <w:numId w:val="16"/>
       </w:numPr>
       <w:spacing w:before="60" w:after="60"/>
       <w:outlineLvl w:val="6"/>
@@ -7162,10 +7043,65 @@
       <w:szCs w:val="20"/>
     </w:rPr>
   </w:style>
+  <w:style w:type="paragraph" w:styleId="Heading8">
+    <w:name w:val="heading 8"/>
+    <w:basedOn w:val="Normal"/>
+    <w:next w:val="Normal"/>
+    <w:link w:val="Heading8Char"/>
+    <w:uiPriority w:val="9"/>
+    <w:semiHidden/>
+    <w:unhideWhenUsed/>
+    <w:qFormat/>
+    <w:rsid w:val="006D477C"/>
+    <w:pPr>
+      <w:keepNext/>
+      <w:keepLines/>
+      <w:numPr>
+        <w:ilvl w:val="7"/>
+        <w:numId w:val="16"/>
+      </w:numPr>
+      <w:spacing w:before="40" w:after="0"/>
+      <w:outlineLvl w:val="7"/>
+    </w:pPr>
+    <w:rPr>
+      <w:rFonts w:asciiTheme="majorHAnsi" w:eastAsiaTheme="majorEastAsia" w:hAnsiTheme="majorHAnsi" w:cstheme="majorBidi"/>
+      <w:color w:val="272727" w:themeColor="text1" w:themeTint="D8"/>
+      <w:sz w:val="21"/>
+      <w:szCs w:val="21"/>
+    </w:rPr>
+  </w:style>
+  <w:style w:type="paragraph" w:styleId="Heading9">
+    <w:name w:val="heading 9"/>
+    <w:basedOn w:val="Normal"/>
+    <w:next w:val="Normal"/>
+    <w:link w:val="Heading9Char"/>
+    <w:uiPriority w:val="9"/>
+    <w:semiHidden/>
+    <w:unhideWhenUsed/>
+    <w:qFormat/>
+    <w:rsid w:val="006D477C"/>
+    <w:pPr>
+      <w:keepNext/>
+      <w:keepLines/>
+      <w:numPr>
+        <w:ilvl w:val="8"/>
+        <w:numId w:val="16"/>
+      </w:numPr>
+      <w:spacing w:before="40" w:after="0"/>
+      <w:outlineLvl w:val="8"/>
+    </w:pPr>
+    <w:rPr>
+      <w:rFonts w:asciiTheme="majorHAnsi" w:eastAsiaTheme="majorEastAsia" w:hAnsiTheme="majorHAnsi" w:cstheme="majorBidi"/>
+      <w:i/>
+      <w:iCs/>
+      <w:color w:val="272727" w:themeColor="text1" w:themeTint="D8"/>
+      <w:sz w:val="21"/>
+      <w:szCs w:val="21"/>
+    </w:rPr>
+  </w:style>
   <w:style w:type="character" w:default="1" w:styleId="DefaultParagraphFont">
     <w:name w:val="Default Paragraph Font"/>
     <w:uiPriority w:val="1"/>
-    <w:semiHidden/>
     <w:unhideWhenUsed/>
   </w:style>
   <w:style w:type="table" w:default="1" w:styleId="TableNormal">
@@ -7354,6 +7290,87 @@
     <w:unhideWhenUsed/>
     <w:qFormat/>
   </w:style>
+  <w:style w:type="character" w:customStyle="1" w:styleId="Heading8Char">
+    <w:name w:val="Heading 8 Char"/>
+    <w:basedOn w:val="DefaultParagraphFont"/>
+    <w:link w:val="Heading8"/>
+    <w:uiPriority w:val="9"/>
+    <w:semiHidden/>
+    <w:rsid w:val="006D477C"/>
+    <w:rPr>
+      <w:rFonts w:asciiTheme="majorHAnsi" w:eastAsiaTheme="majorEastAsia" w:hAnsiTheme="majorHAnsi" w:cstheme="majorBidi"/>
+      <w:color w:val="272727" w:themeColor="text1" w:themeTint="D8"/>
+      <w:sz w:val="21"/>
+      <w:szCs w:val="21"/>
+    </w:rPr>
+  </w:style>
+  <w:style w:type="character" w:customStyle="1" w:styleId="Heading9Char">
+    <w:name w:val="Heading 9 Char"/>
+    <w:basedOn w:val="DefaultParagraphFont"/>
+    <w:link w:val="Heading9"/>
+    <w:uiPriority w:val="9"/>
+    <w:semiHidden/>
+    <w:rsid w:val="006D477C"/>
+    <w:rPr>
+      <w:rFonts w:asciiTheme="majorHAnsi" w:eastAsiaTheme="majorEastAsia" w:hAnsiTheme="majorHAnsi" w:cstheme="majorBidi"/>
+      <w:i/>
+      <w:iCs/>
+      <w:color w:val="272727" w:themeColor="text1" w:themeTint="D8"/>
+      <w:sz w:val="21"/>
+      <w:szCs w:val="21"/>
+    </w:rPr>
+  </w:style>
+  <w:style w:type="paragraph" w:styleId="HTMLPreformatted">
+    <w:name w:val="HTML Preformatted"/>
+    <w:basedOn w:val="Normal"/>
+    <w:link w:val="HTMLPreformattedChar"/>
+    <w:uiPriority w:val="99"/>
+    <w:semiHidden/>
+    <w:unhideWhenUsed/>
+    <w:rsid w:val="00C71E6D"/>
+    <w:pPr>
+      <w:tabs>
+        <w:tab w:val="left" w:pos="916"/>
+        <w:tab w:val="left" w:pos="1832"/>
+        <w:tab w:val="left" w:pos="2748"/>
+        <w:tab w:val="left" w:pos="3664"/>
+        <w:tab w:val="left" w:pos="4580"/>
+        <w:tab w:val="left" w:pos="5496"/>
+        <w:tab w:val="left" w:pos="6412"/>
+        <w:tab w:val="left" w:pos="7328"/>
+        <w:tab w:val="left" w:pos="8244"/>
+        <w:tab w:val="left" w:pos="9160"/>
+        <w:tab w:val="left" w:pos="10076"/>
+        <w:tab w:val="left" w:pos="10992"/>
+        <w:tab w:val="left" w:pos="11908"/>
+        <w:tab w:val="left" w:pos="12824"/>
+        <w:tab w:val="left" w:pos="13740"/>
+        <w:tab w:val="left" w:pos="14656"/>
+      </w:tabs>
+      <w:suppressAutoHyphens w:val="0"/>
+      <w:spacing w:after="0" w:line="240" w:lineRule="auto"/>
+    </w:pPr>
+    <w:rPr>
+      <w:rFonts w:ascii="Courier New" w:eastAsia="Times New Roman" w:hAnsi="Courier New" w:cs="Courier New"/>
+      <w:sz w:val="20"/>
+      <w:szCs w:val="20"/>
+      <w:lang w:eastAsia="fr-FR"/>
+    </w:rPr>
+  </w:style>
+  <w:style w:type="character" w:customStyle="1" w:styleId="HTMLPreformattedChar">
+    <w:name w:val="HTML Preformatted Char"/>
+    <w:basedOn w:val="DefaultParagraphFont"/>
+    <w:link w:val="HTMLPreformatted"/>
+    <w:uiPriority w:val="99"/>
+    <w:semiHidden/>
+    <w:rsid w:val="00C71E6D"/>
+    <w:rPr>
+      <w:rFonts w:ascii="Courier New" w:eastAsia="Times New Roman" w:hAnsi="Courier New" w:cs="Courier New"/>
+      <w:sz w:val="20"/>
+      <w:szCs w:val="20"/>
+      <w:lang w:eastAsia="fr-FR"/>
+    </w:rPr>
+  </w:style>
 </w:styles>
 </file>
 

</xml_diff>

<commit_message>
Increase unit test coverage
</commit_message>
<xml_diff>
--- a/Picture viewer project.docx
+++ b/Picture viewer project.docx
@@ -33,19 +33,83 @@
         <w:rPr>
           <w:lang w:val="en-US"/>
         </w:rPr>
-        <w:t>Product goal : Be able to visualize pictures, video and sounds of all format : jpeg, png, bmp, mpg, mpeg, mp4, mp3, wav, with a user friendly user interface in windows OS. The soft will be installed via an installer that provides all dependencies.</w:t>
-      </w:r>
-    </w:p>
-    <w:p>
-      <w:pPr>
-        <w:rPr>
-          <w:lang w:val="en-US"/>
-        </w:rPr>
-      </w:pPr>
-    </w:p>
-    <w:p>
-      <w:r>
-        <w:t xml:space="preserve">Product backlog items : </w:t>
+        <w:t xml:space="preserve">Product </w:t>
+      </w:r>
+      <w:proofErr w:type="gramStart"/>
+      <w:r>
+        <w:rPr>
+          <w:lang w:val="en-US"/>
+        </w:rPr>
+        <w:t>goal :</w:t>
+      </w:r>
+      <w:proofErr w:type="gramEnd"/>
+      <w:r>
+        <w:rPr>
+          <w:lang w:val="en-US"/>
+        </w:rPr>
+        <w:t xml:space="preserve"> Be able to visualize pictures, video and sounds of all </w:t>
+      </w:r>
+      <w:proofErr w:type="gramStart"/>
+      <w:r>
+        <w:rPr>
+          <w:lang w:val="en-US"/>
+        </w:rPr>
+        <w:t>format :</w:t>
+      </w:r>
+      <w:proofErr w:type="gramEnd"/>
+      <w:r>
+        <w:rPr>
+          <w:lang w:val="en-US"/>
+        </w:rPr>
+        <w:t xml:space="preserve"> jpeg, </w:t>
+      </w:r>
+      <w:proofErr w:type="spellStart"/>
+      <w:r>
+        <w:rPr>
+          <w:lang w:val="en-US"/>
+        </w:rPr>
+        <w:t>png</w:t>
+      </w:r>
+      <w:proofErr w:type="spellEnd"/>
+      <w:r>
+        <w:rPr>
+          <w:lang w:val="en-US"/>
+        </w:rPr>
+        <w:t xml:space="preserve">, bmp, mpg, mpeg, mp4, mp3, wav, with a </w:t>
+      </w:r>
+      <w:proofErr w:type="gramStart"/>
+      <w:r>
+        <w:rPr>
+          <w:lang w:val="en-US"/>
+        </w:rPr>
+        <w:t>user friendly</w:t>
+      </w:r>
+      <w:proofErr w:type="gramEnd"/>
+      <w:r>
+        <w:rPr>
+          <w:lang w:val="en-US"/>
+        </w:rPr>
+        <w:t xml:space="preserve"> user interface in windows OS. The soft will be installed via an installer that provides all dependencies.</w:t>
+      </w:r>
+    </w:p>
+    <w:p>
+      <w:pPr>
+        <w:rPr>
+          <w:lang w:val="en-US"/>
+        </w:rPr>
+      </w:pPr>
+    </w:p>
+    <w:p>
+      <w:r>
+        <w:t xml:space="preserve">Product </w:t>
+      </w:r>
+      <w:proofErr w:type="spellStart"/>
+      <w:r>
+        <w:t>backlog</w:t>
+      </w:r>
+      <w:proofErr w:type="spellEnd"/>
+      <w:r>
+        <w:t xml:space="preserve"> items : </w:t>
       </w:r>
     </w:p>
     <w:p>
@@ -196,7 +260,31 @@
         <w:t xml:space="preserve">Have all the menu available and be able to install the version on windows. </w:t>
       </w:r>
       <w:r>
-        <w:t>Have some fun icon &amp; name for the application.</w:t>
+        <w:t xml:space="preserve">Have </w:t>
+      </w:r>
+      <w:proofErr w:type="spellStart"/>
+      <w:r>
+        <w:t>some</w:t>
+      </w:r>
+      <w:proofErr w:type="spellEnd"/>
+      <w:r>
+        <w:t xml:space="preserve"> fun </w:t>
+      </w:r>
+      <w:proofErr w:type="spellStart"/>
+      <w:r>
+        <w:t>icon</w:t>
+      </w:r>
+      <w:proofErr w:type="spellEnd"/>
+      <w:r>
+        <w:t xml:space="preserve"> &amp; </w:t>
+      </w:r>
+      <w:proofErr w:type="spellStart"/>
+      <w:r>
+        <w:t>name</w:t>
+      </w:r>
+      <w:proofErr w:type="spellEnd"/>
+      <w:r>
+        <w:t xml:space="preserve"> for the application.</w:t>
       </w:r>
     </w:p>
     <w:p>
@@ -258,7 +346,21 @@
         <w:rPr>
           <w:lang w:val="en-US"/>
         </w:rPr>
-        <w:t xml:space="preserve">Be able to display all menus and their content see  : </w:t>
+        <w:t xml:space="preserve">Be able to display all menus and their content </w:t>
+      </w:r>
+      <w:proofErr w:type="gramStart"/>
+      <w:r>
+        <w:rPr>
+          <w:lang w:val="en-US"/>
+        </w:rPr>
+        <w:t>see  :</w:t>
+      </w:r>
+      <w:proofErr w:type="gramEnd"/>
+      <w:r>
+        <w:rPr>
+          <w:lang w:val="en-US"/>
+        </w:rPr>
+        <w:t xml:space="preserve"> </w:t>
       </w:r>
     </w:p>
     <w:p>
@@ -324,8 +426,16 @@
         </w:rPr>
         <w:lastRenderedPageBreak/>
         <w:tab/>
-        <w:t>The user interface has a menu :</w:t>
-      </w:r>
+        <w:t xml:space="preserve">The user interface has a </w:t>
+      </w:r>
+      <w:proofErr w:type="gramStart"/>
+      <w:r>
+        <w:rPr>
+          <w:lang w:val="en-US"/>
+        </w:rPr>
+        <w:t>menu :</w:t>
+      </w:r>
+      <w:proofErr w:type="gramEnd"/>
     </w:p>
     <w:p>
       <w:pPr>
@@ -342,8 +452,46 @@
         <w:rPr>
           <w:lang w:val="en-US"/>
         </w:rPr>
-        <w:t>File, Edit, View,Image,Filters,Tools,Window,information</w:t>
-      </w:r>
+        <w:t xml:space="preserve">File, Edit, </w:t>
+      </w:r>
+      <w:proofErr w:type="spellStart"/>
+      <w:proofErr w:type="gramStart"/>
+      <w:r>
+        <w:rPr>
+          <w:lang w:val="en-US"/>
+        </w:rPr>
+        <w:t>View,Image</w:t>
+      </w:r>
+      <w:proofErr w:type="gramEnd"/>
+      <w:r>
+        <w:rPr>
+          <w:lang w:val="en-US"/>
+        </w:rPr>
+        <w:t>,</w:t>
+      </w:r>
+      <w:proofErr w:type="gramStart"/>
+      <w:r>
+        <w:rPr>
+          <w:lang w:val="en-US"/>
+        </w:rPr>
+        <w:t>Filters,Tools</w:t>
+      </w:r>
+      <w:proofErr w:type="gramEnd"/>
+      <w:r>
+        <w:rPr>
+          <w:lang w:val="en-US"/>
+        </w:rPr>
+        <w:t>,</w:t>
+      </w:r>
+      <w:proofErr w:type="gramStart"/>
+      <w:r>
+        <w:rPr>
+          <w:lang w:val="en-US"/>
+        </w:rPr>
+        <w:t>Window,information</w:t>
+      </w:r>
+      <w:proofErr w:type="spellEnd"/>
+      <w:proofErr w:type="gramEnd"/>
     </w:p>
     <w:p>
       <w:pPr>
@@ -464,8 +612,13 @@
           <w:numId w:val="4"/>
         </w:numPr>
       </w:pPr>
-      <w:r>
-        <w:t xml:space="preserve">File: </w:t>
+      <w:proofErr w:type="gramStart"/>
+      <w:r>
+        <w:t>File:</w:t>
+      </w:r>
+      <w:proofErr w:type="gramEnd"/>
+      <w:r>
+        <w:t xml:space="preserve"> </w:t>
       </w:r>
     </w:p>
     <w:p>
@@ -488,8 +641,13 @@
           <w:numId w:val="4"/>
         </w:numPr>
       </w:pPr>
-      <w:r>
-        <w:t>Recent files</w:t>
+      <w:proofErr w:type="spellStart"/>
+      <w:r>
+        <w:t>Recent</w:t>
+      </w:r>
+      <w:proofErr w:type="spellEnd"/>
+      <w:r>
+        <w:t xml:space="preserve"> files</w:t>
       </w:r>
     </w:p>
     <w:p>
@@ -500,9 +658,11 @@
           <w:numId w:val="4"/>
         </w:numPr>
       </w:pPr>
+      <w:proofErr w:type="spellStart"/>
       <w:r>
         <w:t>Browse</w:t>
       </w:r>
+      <w:proofErr w:type="spellEnd"/>
     </w:p>
     <w:p>
       <w:pPr>
@@ -560,9 +720,11 @@
           <w:numId w:val="4"/>
         </w:numPr>
       </w:pPr>
+      <w:proofErr w:type="spellStart"/>
       <w:r>
         <w:t>Print</w:t>
       </w:r>
+      <w:proofErr w:type="spellEnd"/>
     </w:p>
     <w:p>
       <w:pPr>
@@ -572,9 +734,11 @@
           <w:numId w:val="4"/>
         </w:numPr>
       </w:pPr>
+      <w:proofErr w:type="spellStart"/>
       <w:r>
         <w:t>Quit</w:t>
       </w:r>
+      <w:proofErr w:type="spellEnd"/>
     </w:p>
     <w:p>
       <w:pPr>
@@ -633,9 +797,11 @@
           <w:numId w:val="4"/>
         </w:numPr>
       </w:pPr>
+      <w:proofErr w:type="spellStart"/>
       <w:r>
         <w:t>Delete</w:t>
       </w:r>
+      <w:proofErr w:type="spellEnd"/>
     </w:p>
     <w:p>
       <w:pPr>
@@ -657,8 +823,13 @@
           <w:numId w:val="4"/>
         </w:numPr>
       </w:pPr>
-      <w:r>
-        <w:t xml:space="preserve">View : </w:t>
+      <w:proofErr w:type="spellStart"/>
+      <w:r>
+        <w:t>View</w:t>
+      </w:r>
+      <w:proofErr w:type="spellEnd"/>
+      <w:r>
+        <w:t xml:space="preserve"> : </w:t>
       </w:r>
     </w:p>
     <w:p>
@@ -694,8 +865,13 @@
           <w:numId w:val="4"/>
         </w:numPr>
       </w:pPr>
-      <w:r>
-        <w:t>Adjust :</w:t>
+      <w:proofErr w:type="spellStart"/>
+      <w:r>
+        <w:t>Adjust</w:t>
+      </w:r>
+      <w:proofErr w:type="spellEnd"/>
+      <w:r>
+        <w:t xml:space="preserve"> :</w:t>
       </w:r>
     </w:p>
     <w:p>
@@ -707,8 +883,13 @@
         </w:numPr>
       </w:pPr>
       <w:r>
-        <w:t>No Adjustment</w:t>
-      </w:r>
+        <w:t xml:space="preserve">No </w:t>
+      </w:r>
+      <w:proofErr w:type="spellStart"/>
+      <w:r>
+        <w:t>Adjustment</w:t>
+      </w:r>
+      <w:proofErr w:type="spellEnd"/>
     </w:p>
     <w:p>
       <w:pPr>
@@ -802,8 +983,13 @@
           <w:numId w:val="4"/>
         </w:numPr>
       </w:pPr>
-      <w:r>
-        <w:t>Previous File</w:t>
+      <w:proofErr w:type="spellStart"/>
+      <w:r>
+        <w:t>Previous</w:t>
+      </w:r>
+      <w:proofErr w:type="spellEnd"/>
+      <w:r>
+        <w:t xml:space="preserve"> File</w:t>
       </w:r>
     </w:p>
     <w:p>
@@ -887,8 +1073,21 @@
         </w:numPr>
       </w:pPr>
       <w:r>
-        <w:t>Number of used colors</w:t>
-      </w:r>
+        <w:t xml:space="preserve">Number of </w:t>
+      </w:r>
+      <w:proofErr w:type="spellStart"/>
+      <w:r>
+        <w:t>used</w:t>
+      </w:r>
+      <w:proofErr w:type="spellEnd"/>
+      <w:r>
+        <w:t xml:space="preserve"> </w:t>
+      </w:r>
+      <w:proofErr w:type="spellStart"/>
+      <w:r>
+        <w:t>colors</w:t>
+      </w:r>
+      <w:proofErr w:type="spellEnd"/>
     </w:p>
     <w:p>
       <w:pPr>
@@ -898,9 +1097,11 @@
           <w:numId w:val="4"/>
         </w:numPr>
       </w:pPr>
+      <w:proofErr w:type="spellStart"/>
       <w:r>
         <w:t>Rotate</w:t>
       </w:r>
+      <w:proofErr w:type="spellEnd"/>
     </w:p>
     <w:p>
       <w:pPr>
@@ -911,8 +1112,21 @@
         </w:numPr>
       </w:pPr>
       <w:r>
-        <w:t>90° clock wise</w:t>
-      </w:r>
+        <w:t xml:space="preserve">90° </w:t>
+      </w:r>
+      <w:proofErr w:type="spellStart"/>
+      <w:r>
+        <w:t>clock</w:t>
+      </w:r>
+      <w:proofErr w:type="spellEnd"/>
+      <w:r>
+        <w:t xml:space="preserve"> </w:t>
+      </w:r>
+      <w:proofErr w:type="spellStart"/>
+      <w:r>
+        <w:t>wise</w:t>
+      </w:r>
+      <w:proofErr w:type="spellEnd"/>
     </w:p>
     <w:p>
       <w:pPr>
@@ -923,8 +1137,21 @@
         </w:numPr>
       </w:pPr>
       <w:r>
-        <w:t>90° reverse clock wise</w:t>
-      </w:r>
+        <w:t xml:space="preserve">90° reverse </w:t>
+      </w:r>
+      <w:proofErr w:type="spellStart"/>
+      <w:r>
+        <w:t>clock</w:t>
+      </w:r>
+      <w:proofErr w:type="spellEnd"/>
+      <w:r>
+        <w:t xml:space="preserve"> </w:t>
+      </w:r>
+      <w:proofErr w:type="spellStart"/>
+      <w:r>
+        <w:t>wise</w:t>
+      </w:r>
+      <w:proofErr w:type="spellEnd"/>
     </w:p>
     <w:p>
       <w:pPr>
@@ -982,9 +1209,11 @@
           <w:numId w:val="4"/>
         </w:numPr>
       </w:pPr>
+      <w:proofErr w:type="spellStart"/>
       <w:r>
         <w:t>Resize</w:t>
       </w:r>
+      <w:proofErr w:type="spellEnd"/>
     </w:p>
     <w:p>
       <w:pPr>
@@ -995,8 +1224,21 @@
         </w:numPr>
       </w:pPr>
       <w:r>
-        <w:t>Correct red eyes</w:t>
-      </w:r>
+        <w:t xml:space="preserve">Correct </w:t>
+      </w:r>
+      <w:proofErr w:type="spellStart"/>
+      <w:r>
+        <w:t>red</w:t>
+      </w:r>
+      <w:proofErr w:type="spellEnd"/>
+      <w:r>
+        <w:t xml:space="preserve"> </w:t>
+      </w:r>
+      <w:proofErr w:type="spellStart"/>
+      <w:r>
+        <w:t>eyes</w:t>
+      </w:r>
+      <w:proofErr w:type="spellEnd"/>
     </w:p>
     <w:p>
       <w:pPr>
@@ -1006,9 +1248,11 @@
           <w:numId w:val="4"/>
         </w:numPr>
       </w:pPr>
+      <w:proofErr w:type="gramStart"/>
       <w:r>
         <w:t>Tools:</w:t>
       </w:r>
+      <w:proofErr w:type="gramEnd"/>
     </w:p>
     <w:p>
       <w:pPr>
@@ -1018,8 +1262,13 @@
           <w:numId w:val="4"/>
         </w:numPr>
       </w:pPr>
-      <w:r>
-        <w:t>Find a file</w:t>
+      <w:proofErr w:type="spellStart"/>
+      <w:r>
+        <w:t>Find</w:t>
+      </w:r>
+      <w:proofErr w:type="spellEnd"/>
+      <w:r>
+        <w:t xml:space="preserve"> a file</w:t>
       </w:r>
     </w:p>
     <w:p>
@@ -1030,8 +1279,13 @@
           <w:numId w:val="4"/>
         </w:numPr>
       </w:pPr>
-      <w:r>
-        <w:t>Hexadecimal display</w:t>
+      <w:proofErr w:type="spellStart"/>
+      <w:r>
+        <w:t>Hexadecimal</w:t>
+      </w:r>
+      <w:proofErr w:type="spellEnd"/>
+      <w:r>
+        <w:t xml:space="preserve"> display</w:t>
       </w:r>
     </w:p>
     <w:p>
@@ -1066,9 +1320,11 @@
           <w:numId w:val="4"/>
         </w:numPr>
       </w:pPr>
+      <w:proofErr w:type="spellStart"/>
       <w:r>
         <w:t>Parameters</w:t>
       </w:r>
+      <w:proofErr w:type="spellEnd"/>
     </w:p>
     <w:p>
       <w:pPr>
@@ -1097,7 +1353,21 @@
         <w:rPr>
           <w:lang w:val="en-US"/>
         </w:rPr>
-        <w:t>Show pictures on all the screens : Place the selected pictures on the screen</w:t>
+        <w:t xml:space="preserve">Show pictures on all the </w:t>
+      </w:r>
+      <w:proofErr w:type="gramStart"/>
+      <w:r>
+        <w:rPr>
+          <w:lang w:val="en-US"/>
+        </w:rPr>
+        <w:t>screens :</w:t>
+      </w:r>
+      <w:proofErr w:type="gramEnd"/>
+      <w:r>
+        <w:rPr>
+          <w:lang w:val="en-US"/>
+        </w:rPr>
+        <w:t xml:space="preserve"> Place the selected pictures on the screen</w:t>
       </w:r>
     </w:p>
     <w:p>
@@ -1108,8 +1378,13 @@
           <w:numId w:val="4"/>
         </w:numPr>
       </w:pPr>
-      <w:r>
-        <w:t xml:space="preserve">Window : </w:t>
+      <w:proofErr w:type="spellStart"/>
+      <w:r>
+        <w:t>Window</w:t>
+      </w:r>
+      <w:proofErr w:type="spellEnd"/>
+      <w:r>
+        <w:t xml:space="preserve"> : </w:t>
       </w:r>
     </w:p>
     <w:p>
@@ -1120,8 +1395,13 @@
           <w:numId w:val="4"/>
         </w:numPr>
       </w:pPr>
-      <w:r>
-        <w:t>Tile (en cascade)</w:t>
+      <w:proofErr w:type="spellStart"/>
+      <w:r>
+        <w:t>Tile</w:t>
+      </w:r>
+      <w:proofErr w:type="spellEnd"/>
+      <w:r>
+        <w:t xml:space="preserve"> (en cascade)</w:t>
       </w:r>
     </w:p>
     <w:p>
@@ -1132,8 +1412,21 @@
           <w:numId w:val="4"/>
         </w:numPr>
       </w:pPr>
-      <w:r>
-        <w:t xml:space="preserve">Tile horizontally </w:t>
+      <w:proofErr w:type="spellStart"/>
+      <w:r>
+        <w:t>Tile</w:t>
+      </w:r>
+      <w:proofErr w:type="spellEnd"/>
+      <w:r>
+        <w:t xml:space="preserve"> </w:t>
+      </w:r>
+      <w:proofErr w:type="spellStart"/>
+      <w:r>
+        <w:t>horizontally</w:t>
+      </w:r>
+      <w:proofErr w:type="spellEnd"/>
+      <w:r>
+        <w:t xml:space="preserve"> </w:t>
       </w:r>
     </w:p>
     <w:p>
@@ -1156,9 +1449,19 @@
         </w:numPr>
         <w:spacing w:after="0"/>
       </w:pPr>
-      <w:r>
-        <w:t>Tile Vertically</w:t>
-      </w:r>
+      <w:proofErr w:type="spellStart"/>
+      <w:r>
+        <w:t>Tile</w:t>
+      </w:r>
+      <w:proofErr w:type="spellEnd"/>
+      <w:r>
+        <w:t xml:space="preserve"> </w:t>
+      </w:r>
+      <w:proofErr w:type="spellStart"/>
+      <w:r>
+        <w:t>Vertically</w:t>
+      </w:r>
+      <w:proofErr w:type="spellEnd"/>
     </w:p>
     <w:p>
       <w:pPr>
@@ -1169,8 +1472,13 @@
         </w:numPr>
         <w:spacing w:after="0"/>
       </w:pPr>
-      <w:r>
-        <w:t>Minimize all</w:t>
+      <w:proofErr w:type="spellStart"/>
+      <w:r>
+        <w:t>Minimize</w:t>
+      </w:r>
+      <w:proofErr w:type="spellEnd"/>
+      <w:r>
+        <w:t xml:space="preserve"> all</w:t>
       </w:r>
     </w:p>
     <w:p>
@@ -1229,7 +1537,21 @@
         <w:rPr>
           <w:lang w:val="en-US"/>
         </w:rPr>
-        <w:t>Given I lauch the picture view application</w:t>
+        <w:t xml:space="preserve">Given I </w:t>
+      </w:r>
+      <w:proofErr w:type="spellStart"/>
+      <w:r>
+        <w:rPr>
+          <w:lang w:val="en-US"/>
+        </w:rPr>
+        <w:t>lauch</w:t>
+      </w:r>
+      <w:proofErr w:type="spellEnd"/>
+      <w:r>
+        <w:rPr>
+          <w:lang w:val="en-US"/>
+        </w:rPr>
+        <w:t xml:space="preserve"> the picture view application</w:t>
       </w:r>
     </w:p>
     <w:p>
@@ -1391,8 +1713,21 @@
         <w:pStyle w:val="BodyText"/>
       </w:pPr>
       <w:r>
-        <w:t>Given I reduce the window</w:t>
-      </w:r>
+        <w:t xml:space="preserve">Given I </w:t>
+      </w:r>
+      <w:proofErr w:type="spellStart"/>
+      <w:r>
+        <w:t>reduce</w:t>
+      </w:r>
+      <w:proofErr w:type="spellEnd"/>
+      <w:r>
+        <w:t xml:space="preserve"> the </w:t>
+      </w:r>
+      <w:proofErr w:type="spellStart"/>
+      <w:r>
+        <w:t>window</w:t>
+      </w:r>
+      <w:proofErr w:type="spellEnd"/>
     </w:p>
     <w:p>
       <w:pPr>
@@ -1534,7 +1869,21 @@
         <w:rPr>
           <w:lang w:val="en-US"/>
         </w:rPr>
-        <w:t xml:space="preserve">Complete documentation : </w:t>
+        <w:t xml:space="preserve">Complete </w:t>
+      </w:r>
+      <w:proofErr w:type="gramStart"/>
+      <w:r>
+        <w:rPr>
+          <w:lang w:val="en-US"/>
+        </w:rPr>
+        <w:t>documentation :</w:t>
+      </w:r>
+      <w:proofErr w:type="gramEnd"/>
+      <w:r>
+        <w:rPr>
+          <w:lang w:val="en-US"/>
+        </w:rPr>
+        <w:t xml:space="preserve"> </w:t>
       </w:r>
     </w:p>
     <w:p>
@@ -1562,8 +1911,16 @@
         <w:rPr>
           <w:lang w:val="en-US"/>
         </w:rPr>
-        <w:t>Here the procedure :</w:t>
-      </w:r>
+        <w:t xml:space="preserve">Here the </w:t>
+      </w:r>
+      <w:proofErr w:type="gramStart"/>
+      <w:r>
+        <w:rPr>
+          <w:lang w:val="en-US"/>
+        </w:rPr>
+        <w:t>procedure :</w:t>
+      </w:r>
+      <w:proofErr w:type="gramEnd"/>
     </w:p>
     <w:p>
       <w:pPr>
@@ -1953,7 +2310,23 @@
         </w:rPr>
       </w:pPr>
       <w:r>
-        <w:t>✅ Step 3: Add a Setup Project</w:t>
+        <w:t xml:space="preserve">✅ </w:t>
+      </w:r>
+      <w:proofErr w:type="spellStart"/>
+      <w:r>
+        <w:t>Step</w:t>
+      </w:r>
+      <w:proofErr w:type="spellEnd"/>
+      <w:r>
+        <w:t xml:space="preserve"> </w:t>
+      </w:r>
+      <w:proofErr w:type="gramStart"/>
+      <w:r>
+        <w:t>3:</w:t>
+      </w:r>
+      <w:proofErr w:type="gramEnd"/>
+      <w:r>
+        <w:t xml:space="preserve"> Add a Setup Project</w:t>
       </w:r>
     </w:p>
     <w:p>
@@ -2049,8 +2422,16 @@
         <w:rPr>
           <w:lang w:val="en-US"/>
         </w:rPr>
-        <w:t xml:space="preserve"> (found under i</w:t>
-      </w:r>
+        <w:t xml:space="preserve"> (found under </w:t>
+      </w:r>
+      <w:proofErr w:type="spellStart"/>
+      <w:r>
+        <w:rPr>
+          <w:lang w:val="en-US"/>
+        </w:rPr>
+        <w:t>i</w:t>
+      </w:r>
+      <w:proofErr w:type="spellEnd"/>
       <w:r>
         <w:rPr>
           <w:rStyle w:val="Textesource"/>
@@ -2086,6 +2467,7 @@
         </w:rPr>
         <w:t xml:space="preserve">Name it something like </w:t>
       </w:r>
+      <w:proofErr w:type="spellStart"/>
       <w:r>
         <w:rPr>
           <w:rStyle w:val="Textesource"/>
@@ -2093,6 +2475,7 @@
         </w:rPr>
         <w:t>MyAppInstaller</w:t>
       </w:r>
+      <w:proofErr w:type="spellEnd"/>
       <w:r>
         <w:rPr>
           <w:lang w:val="en-US"/>
@@ -2214,8 +2597,18 @@
         </w:tabs>
       </w:pPr>
       <w:r>
-        <w:t>In the dialog:</w:t>
-      </w:r>
+        <w:t xml:space="preserve">In the </w:t>
+      </w:r>
+      <w:proofErr w:type="spellStart"/>
+      <w:proofErr w:type="gramStart"/>
+      <w:r>
+        <w:t>dialog</w:t>
+      </w:r>
+      <w:proofErr w:type="spellEnd"/>
+      <w:r>
+        <w:t>:</w:t>
+      </w:r>
+      <w:proofErr w:type="gramEnd"/>
     </w:p>
     <w:p>
       <w:pPr>
@@ -2235,8 +2628,16 @@
         <w:rPr>
           <w:lang w:val="en-US"/>
         </w:rPr>
-        <w:t>Select all required file to be installed :</w:t>
-      </w:r>
+        <w:t xml:space="preserve">Select all required file to be </w:t>
+      </w:r>
+      <w:proofErr w:type="gramStart"/>
+      <w:r>
+        <w:rPr>
+          <w:lang w:val="en-US"/>
+        </w:rPr>
+        <w:t>installed :</w:t>
+      </w:r>
+      <w:proofErr w:type="gramEnd"/>
     </w:p>
     <w:p>
       <w:pPr>
@@ -2253,11 +2654,27 @@
           <w:lang w:val="en-US"/>
         </w:rPr>
       </w:pPr>
-      <w:r>
-        <w:rPr>
-          <w:lang w:val="en-US"/>
-        </w:rPr>
-        <w:t>PictureView.exe ,PictureView.runtimeconfig.json, PictureView.dll</w:t>
+      <w:proofErr w:type="gramStart"/>
+      <w:r>
+        <w:rPr>
+          <w:lang w:val="en-US"/>
+        </w:rPr>
+        <w:t>PictureView.exe ,</w:t>
+      </w:r>
+      <w:proofErr w:type="spellStart"/>
+      <w:proofErr w:type="gramEnd"/>
+      <w:r>
+        <w:rPr>
+          <w:lang w:val="en-US"/>
+        </w:rPr>
+        <w:t>PictureView.runtimeconfig.json</w:t>
+      </w:r>
+      <w:proofErr w:type="spellEnd"/>
+      <w:r>
+        <w:rPr>
+          <w:lang w:val="en-US"/>
+        </w:rPr>
+        <w:t>, PictureView.dll</w:t>
       </w:r>
     </w:p>
     <w:p>
@@ -2315,8 +2732,17 @@
           <w:rStyle w:val="Textesource"/>
           <w:lang w:val="en-US"/>
         </w:rPr>
-        <w:t>.dll</w:t>
-      </w:r>
+        <w:t>.</w:t>
+      </w:r>
+      <w:proofErr w:type="spellStart"/>
+      <w:r>
+        <w:rPr>
+          <w:rStyle w:val="Textesource"/>
+          <w:lang w:val="en-US"/>
+        </w:rPr>
+        <w:t>dll</w:t>
+      </w:r>
+      <w:proofErr w:type="spellEnd"/>
       <w:r>
         <w:rPr>
           <w:lang w:val="en-US"/>
@@ -2358,8 +2784,18 @@
         </w:rPr>
       </w:pPr>
       <w:r>
-        <w:t>Add a Shortcut:</w:t>
-      </w:r>
+        <w:t xml:space="preserve">Add a </w:t>
+      </w:r>
+      <w:proofErr w:type="spellStart"/>
+      <w:proofErr w:type="gramStart"/>
+      <w:r>
+        <w:t>Shortcut</w:t>
+      </w:r>
+      <w:proofErr w:type="spellEnd"/>
+      <w:r>
+        <w:t>:</w:t>
+      </w:r>
+      <w:proofErr w:type="gramEnd"/>
     </w:p>
     <w:p>
       <w:pPr>
@@ -2482,7 +2918,21 @@
         <w:rPr>
           <w:lang w:val="en-US"/>
         </w:rPr>
-        <w:t xml:space="preserve">You can also change some settings on project : </w:t>
+        <w:t xml:space="preserve">You can also change some settings on </w:t>
+      </w:r>
+      <w:proofErr w:type="gramStart"/>
+      <w:r>
+        <w:rPr>
+          <w:lang w:val="en-US"/>
+        </w:rPr>
+        <w:t>project :</w:t>
+      </w:r>
+      <w:proofErr w:type="gramEnd"/>
+      <w:r>
+        <w:rPr>
+          <w:lang w:val="en-US"/>
+        </w:rPr>
+        <w:t xml:space="preserve"> </w:t>
       </w:r>
     </w:p>
     <w:p>
@@ -2594,8 +3044,28 @@
           <w:sz w:val="24"/>
           <w:szCs w:val="24"/>
         </w:rPr>
-        <w:t>Add an Icon (Optional):</w:t>
-      </w:r>
+        <w:t>Add an Icon (</w:t>
+      </w:r>
+      <w:proofErr w:type="spellStart"/>
+      <w:r>
+        <w:rPr>
+          <w:rFonts w:ascii="Aptos" w:eastAsia="Aptos" w:hAnsi="Aptos"/>
+          <w:sz w:val="24"/>
+          <w:szCs w:val="24"/>
+        </w:rPr>
+        <w:t>Optional</w:t>
+      </w:r>
+      <w:proofErr w:type="spellEnd"/>
+      <w:proofErr w:type="gramStart"/>
+      <w:r>
+        <w:rPr>
+          <w:rFonts w:ascii="Aptos" w:eastAsia="Aptos" w:hAnsi="Aptos"/>
+          <w:sz w:val="24"/>
+          <w:szCs w:val="24"/>
+        </w:rPr>
+        <w:t>):</w:t>
+      </w:r>
+      <w:proofErr w:type="gramEnd"/>
     </w:p>
     <w:p>
       <w:pPr>
@@ -2623,8 +3093,17 @@
           <w:rStyle w:val="Textesource"/>
           <w:lang w:val="en-US"/>
         </w:rPr>
-        <w:t>.ico</w:t>
-      </w:r>
+        <w:t>.</w:t>
+      </w:r>
+      <w:proofErr w:type="spellStart"/>
+      <w:r>
+        <w:rPr>
+          <w:rStyle w:val="Textesource"/>
+          <w:lang w:val="en-US"/>
+        </w:rPr>
+        <w:t>ico</w:t>
+      </w:r>
+      <w:proofErr w:type="spellEnd"/>
       <w:r>
         <w:rPr>
           <w:lang w:val="en-US"/>
@@ -2684,8 +3163,17 @@
           <w:rStyle w:val="Textesource"/>
           <w:lang w:val="en-US"/>
         </w:rPr>
-        <w:t>.ico</w:t>
-      </w:r>
+        <w:t>.</w:t>
+      </w:r>
+      <w:proofErr w:type="spellStart"/>
+      <w:r>
+        <w:rPr>
+          <w:rStyle w:val="Textesource"/>
+          <w:lang w:val="en-US"/>
+        </w:rPr>
+        <w:t>ico</w:t>
+      </w:r>
+      <w:proofErr w:type="spellEnd"/>
       <w:r>
         <w:rPr>
           <w:lang w:val="en-US"/>
@@ -2712,7 +3200,31 @@
         </w:rPr>
       </w:pPr>
       <w:r>
-        <w:t>✅ Step 6: Build the MSI Installer</w:t>
+        <w:t xml:space="preserve">✅ </w:t>
+      </w:r>
+      <w:proofErr w:type="spellStart"/>
+      <w:r>
+        <w:t>Step</w:t>
+      </w:r>
+      <w:proofErr w:type="spellEnd"/>
+      <w:r>
+        <w:t xml:space="preserve"> </w:t>
+      </w:r>
+      <w:proofErr w:type="gramStart"/>
+      <w:r>
+        <w:t>6:</w:t>
+      </w:r>
+      <w:proofErr w:type="gramEnd"/>
+      <w:r>
+        <w:t xml:space="preserve"> </w:t>
+      </w:r>
+      <w:proofErr w:type="spellStart"/>
+      <w:r>
+        <w:t>Build</w:t>
+      </w:r>
+      <w:proofErr w:type="spellEnd"/>
+      <w:r>
+        <w:t xml:space="preserve"> the MSI Installer</w:t>
       </w:r>
     </w:p>
     <w:p>
@@ -2824,8 +3336,17 @@
           <w:rStyle w:val="Textesource"/>
           <w:lang w:val="en-US"/>
         </w:rPr>
-        <w:t>.msi</w:t>
-      </w:r>
+        <w:t>.</w:t>
+      </w:r>
+      <w:proofErr w:type="spellStart"/>
+      <w:r>
+        <w:rPr>
+          <w:rStyle w:val="Textesource"/>
+          <w:lang w:val="en-US"/>
+        </w:rPr>
+        <w:t>msi</w:t>
+      </w:r>
+      <w:proofErr w:type="spellEnd"/>
       <w:r>
         <w:rPr>
           <w:lang w:val="en-US"/>
@@ -2849,16 +3370,29 @@
         </w:rPr>
       </w:pPr>
       <w:r>
-        <w:t>Display an opened file</w:t>
-      </w:r>
-    </w:p>
-    <w:p>
-      <w:pPr>
-        <w:pStyle w:val="BodyText"/>
-      </w:pPr>
-      <w:r>
-        <w:t>Given I click File→Open</w:t>
-      </w:r>
+        <w:t xml:space="preserve">Display an </w:t>
+      </w:r>
+      <w:proofErr w:type="spellStart"/>
+      <w:r>
+        <w:t>opened</w:t>
+      </w:r>
+      <w:proofErr w:type="spellEnd"/>
+      <w:r>
+        <w:t xml:space="preserve"> file</w:t>
+      </w:r>
+    </w:p>
+    <w:p>
+      <w:pPr>
+        <w:pStyle w:val="BodyText"/>
+      </w:pPr>
+      <w:r>
+        <w:t xml:space="preserve">Given I click </w:t>
+      </w:r>
+      <w:proofErr w:type="spellStart"/>
+      <w:r>
+        <w:t>File→Open</w:t>
+      </w:r>
+      <w:proofErr w:type="spellEnd"/>
     </w:p>
     <w:p>
       <w:pPr>
@@ -3047,8 +3581,13 @@
       <w:pPr>
         <w:pStyle w:val="BodyText"/>
       </w:pPr>
-      <w:r>
-        <w:t>Recent Files</w:t>
+      <w:proofErr w:type="spellStart"/>
+      <w:r>
+        <w:t>Recent</w:t>
+      </w:r>
+      <w:proofErr w:type="spellEnd"/>
+      <w:r>
+        <w:t xml:space="preserve"> Files</w:t>
       </w:r>
     </w:p>
     <w:p>
@@ -3121,6 +3660,7 @@
           <w:bCs/>
         </w:rPr>
       </w:pPr>
+      <w:proofErr w:type="spellStart"/>
       <w:r>
         <w:rPr>
           <w:b/>
@@ -3128,6 +3668,7 @@
         </w:rPr>
         <w:t>View</w:t>
       </w:r>
+      <w:proofErr w:type="spellEnd"/>
     </w:p>
     <w:p>
       <w:pPr>
@@ -3137,32 +3678,43 @@
           <w:bCs/>
         </w:rPr>
       </w:pPr>
+      <w:proofErr w:type="spellStart"/>
       <w:r>
         <w:rPr>
           <w:b/>
           <w:bCs/>
         </w:rPr>
-        <w:t xml:space="preserve">View As </w:t>
-      </w:r>
-    </w:p>
-    <w:p>
-      <w:pPr>
-        <w:pStyle w:val="BodyText"/>
+        <w:t>View</w:t>
+      </w:r>
+      <w:proofErr w:type="spellEnd"/>
+      <w:r>
         <w:rPr>
           <w:b/>
           <w:bCs/>
         </w:rPr>
-      </w:pPr>
-      <w:r>
+        <w:t xml:space="preserve"> As </w:t>
+      </w:r>
+    </w:p>
+    <w:p>
+      <w:pPr>
+        <w:pStyle w:val="BodyText"/>
         <w:rPr>
           <w:b/>
           <w:bCs/>
         </w:rPr>
+      </w:pPr>
+      <w:r>
+        <w:rPr>
+          <w:b/>
+          <w:bCs/>
+        </w:rPr>
         <w:tab/>
       </w:r>
+      <w:proofErr w:type="spellStart"/>
       <w:r>
         <w:t>Thumbnails</w:t>
       </w:r>
+      <w:proofErr w:type="spellEnd"/>
     </w:p>
     <w:p>
       <w:pPr>
@@ -3170,7 +3722,14 @@
       </w:pPr>
       <w:r>
         <w:tab/>
-        <w:t>Thumbnails &amp; Labels</w:t>
+      </w:r>
+      <w:proofErr w:type="spellStart"/>
+      <w:r>
+        <w:t>Thumbnails</w:t>
+      </w:r>
+      <w:proofErr w:type="spellEnd"/>
+      <w:r>
+        <w:t xml:space="preserve"> &amp; Labels</w:t>
       </w:r>
     </w:p>
     <w:p>
@@ -3197,8 +3756,12 @@
       </w:pPr>
       <w:r>
         <w:tab/>
+      </w:r>
+      <w:proofErr w:type="spellStart"/>
+      <w:r>
         <w:t>Detail</w:t>
       </w:r>
+      <w:proofErr w:type="spellEnd"/>
     </w:p>
     <w:p>
       <w:pPr>
@@ -3255,16 +3818,39 @@
         <w:pStyle w:val="BodyText"/>
       </w:pPr>
       <w:r>
-        <w:t>Given I click File→Browse</w:t>
-      </w:r>
-    </w:p>
-    <w:p>
-      <w:pPr>
-        <w:pStyle w:val="BodyText"/>
-      </w:pPr>
-      <w:r>
-        <w:t>When no file is opened</w:t>
-      </w:r>
+        <w:t xml:space="preserve">Given I click </w:t>
+      </w:r>
+      <w:proofErr w:type="spellStart"/>
+      <w:r>
+        <w:t>File→Browse</w:t>
+      </w:r>
+      <w:proofErr w:type="spellEnd"/>
+    </w:p>
+    <w:p>
+      <w:pPr>
+        <w:pStyle w:val="BodyText"/>
+      </w:pPr>
+      <w:proofErr w:type="spellStart"/>
+      <w:r>
+        <w:t>When</w:t>
+      </w:r>
+      <w:proofErr w:type="spellEnd"/>
+      <w:r>
+        <w:t xml:space="preserve"> no file </w:t>
+      </w:r>
+      <w:proofErr w:type="spellStart"/>
+      <w:r>
+        <w:t>is</w:t>
+      </w:r>
+      <w:proofErr w:type="spellEnd"/>
+      <w:r>
+        <w:t xml:space="preserve"> </w:t>
+      </w:r>
+      <w:proofErr w:type="spellStart"/>
+      <w:r>
+        <w:t>opened</w:t>
+      </w:r>
+      <w:proofErr w:type="spellEnd"/>
     </w:p>
     <w:p>
       <w:pPr>
@@ -3291,7 +3877,21 @@
         <w:rPr>
           <w:lang w:val="en-US"/>
         </w:rPr>
-        <w:t>And on the right I should see the content of the folder as Icons</w:t>
+        <w:t xml:space="preserve">And on the </w:t>
+      </w:r>
+      <w:proofErr w:type="gramStart"/>
+      <w:r>
+        <w:rPr>
+          <w:lang w:val="en-US"/>
+        </w:rPr>
+        <w:t>right</w:t>
+      </w:r>
+      <w:proofErr w:type="gramEnd"/>
+      <w:r>
+        <w:rPr>
+          <w:lang w:val="en-US"/>
+        </w:rPr>
+        <w:t xml:space="preserve"> I should see the content of the folder as Icons</w:t>
       </w:r>
     </w:p>
     <w:p>
@@ -3457,8 +4057,16 @@
         <w:rPr>
           <w:lang w:val="en-US"/>
         </w:rPr>
-        <w:t>Given I click File→Browse</w:t>
-      </w:r>
+        <w:t xml:space="preserve">Given I click </w:t>
+      </w:r>
+      <w:proofErr w:type="spellStart"/>
+      <w:r>
+        <w:rPr>
+          <w:lang w:val="en-US"/>
+        </w:rPr>
+        <w:t>File→Browse</w:t>
+      </w:r>
+      <w:proofErr w:type="spellEnd"/>
     </w:p>
     <w:p>
       <w:pPr>
@@ -3499,7 +4107,21 @@
         <w:rPr>
           <w:lang w:val="en-US"/>
         </w:rPr>
-        <w:t>And on the right I should see the content of the folder as Icons</w:t>
+        <w:t xml:space="preserve">And on the </w:t>
+      </w:r>
+      <w:proofErr w:type="gramStart"/>
+      <w:r>
+        <w:rPr>
+          <w:lang w:val="en-US"/>
+        </w:rPr>
+        <w:t>right</w:t>
+      </w:r>
+      <w:proofErr w:type="gramEnd"/>
+      <w:r>
+        <w:rPr>
+          <w:lang w:val="en-US"/>
+        </w:rPr>
+        <w:t xml:space="preserve"> I should see the content of the folder as Icons</w:t>
       </w:r>
     </w:p>
     <w:p>
@@ -3535,8 +4157,16 @@
         <w:rPr>
           <w:lang w:val="en-US"/>
         </w:rPr>
-        <w:t>Given I click File→Browse</w:t>
-      </w:r>
+        <w:t xml:space="preserve">Given I click </w:t>
+      </w:r>
+      <w:proofErr w:type="spellStart"/>
+      <w:r>
+        <w:rPr>
+          <w:lang w:val="en-US"/>
+        </w:rPr>
+        <w:t>File→Browse</w:t>
+      </w:r>
+      <w:proofErr w:type="spellEnd"/>
     </w:p>
     <w:p>
       <w:pPr>
@@ -3613,8 +4243,16 @@
         <w:rPr>
           <w:lang w:val="en-US"/>
         </w:rPr>
-        <w:t>Given I click File→Browse</w:t>
-      </w:r>
+        <w:t xml:space="preserve">Given I click </w:t>
+      </w:r>
+      <w:proofErr w:type="spellStart"/>
+      <w:r>
+        <w:rPr>
+          <w:lang w:val="en-US"/>
+        </w:rPr>
+        <w:t>File→Browse</w:t>
+      </w:r>
+      <w:proofErr w:type="spellEnd"/>
     </w:p>
     <w:p>
       <w:pPr>
@@ -3656,7 +4294,21 @@
           <w:lang w:val="en-US"/>
         </w:rPr>
         <w:lastRenderedPageBreak/>
-        <w:t>Then It should close the browser mode</w:t>
+        <w:t xml:space="preserve">Then </w:t>
+      </w:r>
+      <w:proofErr w:type="gramStart"/>
+      <w:r>
+        <w:rPr>
+          <w:lang w:val="en-US"/>
+        </w:rPr>
+        <w:t>It</w:t>
+      </w:r>
+      <w:proofErr w:type="gramEnd"/>
+      <w:r>
+        <w:rPr>
+          <w:lang w:val="en-US"/>
+        </w:rPr>
+        <w:t xml:space="preserve"> should close the browser mode</w:t>
       </w:r>
     </w:p>
     <w:p>
@@ -3773,8 +4425,16 @@
         <w:rPr>
           <w:lang w:val="en-US"/>
         </w:rPr>
-        <w:t>When I do File→Open</w:t>
-      </w:r>
+        <w:t xml:space="preserve">When I do </w:t>
+      </w:r>
+      <w:proofErr w:type="spellStart"/>
+      <w:r>
+        <w:rPr>
+          <w:lang w:val="en-US"/>
+        </w:rPr>
+        <w:t>File→Open</w:t>
+      </w:r>
+      <w:proofErr w:type="spellEnd"/>
     </w:p>
     <w:p>
       <w:pPr>
@@ -3851,7 +4511,21 @@
         <w:rPr>
           <w:lang w:val="en-US"/>
         </w:rPr>
-        <w:t>When I do File→Recent Files and select a file</w:t>
+        <w:t xml:space="preserve">When I do </w:t>
+      </w:r>
+      <w:proofErr w:type="spellStart"/>
+      <w:r>
+        <w:rPr>
+          <w:lang w:val="en-US"/>
+        </w:rPr>
+        <w:t>File→Recent</w:t>
+      </w:r>
+      <w:proofErr w:type="spellEnd"/>
+      <w:r>
+        <w:rPr>
+          <w:lang w:val="en-US"/>
+        </w:rPr>
+        <w:t xml:space="preserve"> Files and select a file</w:t>
       </w:r>
     </w:p>
     <w:p>
@@ -3929,8 +4603,16 @@
         <w:rPr>
           <w:lang w:val="en-US"/>
         </w:rPr>
-        <w:t>When I do File→Close</w:t>
-      </w:r>
+        <w:t xml:space="preserve">When I do </w:t>
+      </w:r>
+      <w:proofErr w:type="spellStart"/>
+      <w:r>
+        <w:rPr>
+          <w:lang w:val="en-US"/>
+        </w:rPr>
+        <w:t>File→Close</w:t>
+      </w:r>
+      <w:proofErr w:type="spellEnd"/>
     </w:p>
     <w:p>
       <w:pPr>
@@ -4007,8 +4689,16 @@
         <w:rPr>
           <w:lang w:val="en-US"/>
         </w:rPr>
-        <w:t>When I do File→Close</w:t>
-      </w:r>
+        <w:t xml:space="preserve">When I do </w:t>
+      </w:r>
+      <w:proofErr w:type="spellStart"/>
+      <w:r>
+        <w:rPr>
+          <w:lang w:val="en-US"/>
+        </w:rPr>
+        <w:t>File→Close</w:t>
+      </w:r>
+      <w:proofErr w:type="spellEnd"/>
     </w:p>
     <w:p>
       <w:pPr>
@@ -4085,7 +4775,21 @@
         <w:rPr>
           <w:lang w:val="en-US"/>
         </w:rPr>
-        <w:t>and when I do File→Close ALL</w:t>
+        <w:t xml:space="preserve">and when I do </w:t>
+      </w:r>
+      <w:proofErr w:type="spellStart"/>
+      <w:r>
+        <w:rPr>
+          <w:lang w:val="en-US"/>
+        </w:rPr>
+        <w:t>File→Close</w:t>
+      </w:r>
+      <w:proofErr w:type="spellEnd"/>
+      <w:r>
+        <w:rPr>
+          <w:lang w:val="en-US"/>
+        </w:rPr>
+        <w:t xml:space="preserve"> ALL</w:t>
       </w:r>
     </w:p>
     <w:p>
@@ -4149,7 +4853,21 @@
         <w:rPr>
           <w:lang w:val="en-US"/>
         </w:rPr>
-        <w:t>and when I do File→Close ALL</w:t>
+        <w:t xml:space="preserve">and when I do </w:t>
+      </w:r>
+      <w:proofErr w:type="spellStart"/>
+      <w:r>
+        <w:rPr>
+          <w:lang w:val="en-US"/>
+        </w:rPr>
+        <w:t>File→Close</w:t>
+      </w:r>
+      <w:proofErr w:type="spellEnd"/>
+      <w:r>
+        <w:rPr>
+          <w:lang w:val="en-US"/>
+        </w:rPr>
+        <w:t xml:space="preserve"> ALL</w:t>
       </w:r>
     </w:p>
     <w:p>
@@ -4276,6 +4994,9 @@
     <w:p>
       <w:pPr>
         <w:pStyle w:val="Heading2"/>
+        <w:rPr>
+          <w:rFonts w:hint="eastAsia"/>
+        </w:rPr>
       </w:pPr>
       <w:r>
         <w:t xml:space="preserve">Utiliser Visual studio </w:t>
@@ -4342,10 +5063,18 @@
     <w:p>
       <w:pPr>
         <w:pStyle w:val="Heading2"/>
-      </w:pPr>
-      <w:r>
-        <w:t>Utiliser Reportgenerator</w:t>
-      </w:r>
+        <w:rPr>
+          <w:rFonts w:hint="eastAsia"/>
+        </w:rPr>
+      </w:pPr>
+      <w:r>
+        <w:t xml:space="preserve">Utiliser </w:t>
+      </w:r>
+      <w:proofErr w:type="spellStart"/>
+      <w:r>
+        <w:t>Reportgenerator</w:t>
+      </w:r>
+      <w:proofErr w:type="spellEnd"/>
     </w:p>
     <w:p>
       <w:pPr>
@@ -4416,8 +5145,20 @@
           <w:szCs w:val="18"/>
           <w:lang w:val="en-US" w:eastAsia="fr-FR"/>
         </w:rPr>
-        <w:t>dotnet tool install -g reportgenerator</w:t>
-      </w:r>
+        <w:t xml:space="preserve">dotnet tool install -g </w:t>
+      </w:r>
+      <w:proofErr w:type="spellStart"/>
+      <w:r>
+        <w:rPr>
+          <w:rFonts w:ascii="Cascadia Mono" w:eastAsia="Times New Roman" w:hAnsi="Cascadia Mono" w:cs="Courier New"/>
+          <w:color w:val="000000"/>
+          <w:sz w:val="18"/>
+          <w:szCs w:val="18"/>
+          <w:lang w:val="en-US" w:eastAsia="fr-FR"/>
+        </w:rPr>
+        <w:t>reportgenerator</w:t>
+      </w:r>
+      <w:proofErr w:type="spellEnd"/>
     </w:p>
     <w:p>
       <w:pPr>
@@ -4452,8 +5193,60 @@
       <w:pPr>
         <w:pStyle w:val="BodyText"/>
       </w:pPr>
-      <w:r>
-        <w:t>dotnet test PictureViewerTests/PictureViewerTests.csproj --collect:"XPlat Code Coverage"</w:t>
+      <w:proofErr w:type="spellStart"/>
+      <w:proofErr w:type="gramStart"/>
+      <w:r>
+        <w:t>dotnet</w:t>
+      </w:r>
+      <w:proofErr w:type="spellEnd"/>
+      <w:proofErr w:type="gramEnd"/>
+      <w:r>
+        <w:t xml:space="preserve"> test </w:t>
+      </w:r>
+      <w:proofErr w:type="spellStart"/>
+      <w:r>
+        <w:t>PictureViewerTests</w:t>
+      </w:r>
+      <w:proofErr w:type="spellEnd"/>
+      <w:r>
+        <w:t>/</w:t>
+      </w:r>
+      <w:proofErr w:type="spellStart"/>
+      <w:r>
+        <w:t>PictureViewerTests.csproj</w:t>
+      </w:r>
+      <w:proofErr w:type="spellEnd"/>
+      <w:r>
+        <w:t xml:space="preserve"> --</w:t>
+      </w:r>
+      <w:proofErr w:type="spellStart"/>
+      <w:proofErr w:type="gramStart"/>
+      <w:r>
+        <w:t>collect</w:t>
+      </w:r>
+      <w:proofErr w:type="spellEnd"/>
+      <w:r>
+        <w:t>:</w:t>
+      </w:r>
+      <w:proofErr w:type="gramEnd"/>
+      <w:r>
+        <w:t>"</w:t>
+      </w:r>
+      <w:proofErr w:type="spellStart"/>
+      <w:r>
+        <w:t>XPlat</w:t>
+      </w:r>
+      <w:proofErr w:type="spellEnd"/>
+      <w:r>
+        <w:t xml:space="preserve"> Code </w:t>
+      </w:r>
+      <w:proofErr w:type="spellStart"/>
+      <w:r>
+        <w:t>Coverage</w:t>
+      </w:r>
+      <w:proofErr w:type="spellEnd"/>
+      <w:r>
+        <w:t>"</w:t>
       </w:r>
       <w:r>
         <w:t xml:space="preserve"> </w:t>
@@ -4462,58 +5255,2234 @@
     <w:p>
       <w:pPr>
         <w:pStyle w:val="BodyText"/>
-        <w:rPr>
-          <w:lang w:val="en-US"/>
-        </w:rPr>
-      </w:pPr>
-      <w:r>
-        <w:rPr>
-          <w:lang w:val="en-US"/>
-        </w:rPr>
-        <w:t xml:space="preserve">L’emplacement est là : </w:t>
-      </w:r>
-      <w:r>
-        <w:rPr>
-          <w:lang w:val="en-US"/>
-        </w:rPr>
-        <w:t>C:\Users\hicha\Data\Projets\PictureView\PictureViewerTests\TestResults\4b083bf0-ff4f-4b42-b991-e5393d67fd88</w:t>
-      </w:r>
-      <w:r>
-        <w:rPr>
-          <w:lang w:val="en-US"/>
-        </w:rPr>
-        <w:t>\</w:t>
-      </w:r>
-      <w:r>
-        <w:rPr>
-          <w:lang w:val="en-US"/>
-        </w:rPr>
-        <w:t>coverage.cobertura.xml</w:t>
-      </w:r>
-    </w:p>
-    <w:p>
-      <w:pPr>
-        <w:pStyle w:val="BodyText"/>
-      </w:pPr>
-      <w:r>
-        <w:t>Générer le report de couvet</w:t>
-      </w:r>
-      <w:r>
-        <w:t>ure</w:t>
-      </w:r>
-    </w:p>
-    <w:p>
-      <w:pPr>
-        <w:pStyle w:val="BodyText"/>
-        <w:rPr>
-          <w:lang w:val="en-US"/>
-        </w:rPr>
-      </w:pPr>
-      <w:r>
-        <w:rPr>
-          <w:lang w:val="en-US"/>
-        </w:rPr>
-        <w:t>reportgenerator -reports:"C:\Users\hicha\Data\Projets\PictureView\PictureViewerTests\TestResults\f8ac3d8d-15f0-44b3-a1c5-16240d501c4a/coverage.cobertura.xml" -targetdir:"coveragereport""</w:t>
+      </w:pPr>
+      <w:r>
+        <w:t>L’emplacement est là : C:\Users\hicha\Data\Projets\PictureView\PictureViewerTests\TestResults\4b083bf0-ff4f-4b42-b991-e5393d67fd88</w:t>
+      </w:r>
+      <w:r>
+        <w:t>\coverage.cobertura.xml</w:t>
+      </w:r>
+    </w:p>
+    <w:p>
+      <w:pPr>
+        <w:pStyle w:val="BodyText"/>
+        <w:rPr>
+          <w:lang w:val="en-US"/>
+        </w:rPr>
+      </w:pPr>
+      <w:proofErr w:type="spellStart"/>
+      <w:r>
+        <w:rPr>
+          <w:lang w:val="en-US"/>
+        </w:rPr>
+        <w:t>Générer</w:t>
+      </w:r>
+      <w:proofErr w:type="spellEnd"/>
+      <w:r>
+        <w:rPr>
+          <w:lang w:val="en-US"/>
+        </w:rPr>
+        <w:t xml:space="preserve"> le report de </w:t>
+      </w:r>
+      <w:proofErr w:type="spellStart"/>
+      <w:r>
+        <w:rPr>
+          <w:lang w:val="en-US"/>
+        </w:rPr>
+        <w:t>couveture</w:t>
+      </w:r>
+      <w:proofErr w:type="spellEnd"/>
+    </w:p>
+    <w:p>
+      <w:pPr>
+        <w:pStyle w:val="BodyText"/>
+        <w:rPr>
+          <w:lang w:val="en-US"/>
+        </w:rPr>
+      </w:pPr>
+      <w:proofErr w:type="spellStart"/>
+      <w:r>
+        <w:rPr>
+          <w:lang w:val="en-US"/>
+        </w:rPr>
+        <w:t>reportgenerator</w:t>
+      </w:r>
+      <w:proofErr w:type="spellEnd"/>
+      <w:r>
+        <w:rPr>
+          <w:lang w:val="en-US"/>
+        </w:rPr>
+        <w:t xml:space="preserve"> -reports:"C:\Users\hicha\Data\Projets\PictureView\PictureViewerTests\TestResults\f8ac3d8d-15f0-44b3-a1c5-16240d501c4a/coverage.cobertura.xml" -</w:t>
+      </w:r>
+      <w:proofErr w:type="spellStart"/>
+      <w:r>
+        <w:rPr>
+          <w:lang w:val="en-US"/>
+        </w:rPr>
+        <w:t>targetdir</w:t>
+      </w:r>
+      <w:proofErr w:type="spellEnd"/>
+      <w:r>
+        <w:rPr>
+          <w:lang w:val="en-US"/>
+        </w:rPr>
+        <w:t>:"</w:t>
+      </w:r>
+      <w:proofErr w:type="spellStart"/>
+      <w:r>
+        <w:rPr>
+          <w:lang w:val="en-US"/>
+        </w:rPr>
+        <w:t>coveragereport</w:t>
+      </w:r>
+      <w:proofErr w:type="spellEnd"/>
+      <w:r>
+        <w:rPr>
+          <w:lang w:val="en-US"/>
+        </w:rPr>
+        <w:t>""</w:t>
+      </w:r>
+    </w:p>
+    <w:p>
+      <w:pPr>
+        <w:pStyle w:val="Heading1"/>
+        <w:rPr>
+          <w:lang w:val="en-US"/>
+        </w:rPr>
+      </w:pPr>
+      <w:r>
+        <w:rPr>
+          <w:lang w:val="en-US"/>
+        </w:rPr>
+        <w:t>Architecture</w:t>
+      </w:r>
+    </w:p>
+    <w:p>
+      <w:pPr>
+        <w:pStyle w:val="Heading2"/>
+        <w:rPr>
+          <w:lang w:val="en-US"/>
+        </w:rPr>
+      </w:pPr>
+      <w:r>
+        <w:rPr>
+          <w:lang w:val="en-US"/>
+        </w:rPr>
+        <w:t>File-&gt;open</w:t>
+      </w:r>
+    </w:p>
+    <w:p>
+      <w:pPr>
+        <w:pStyle w:val="BodyText"/>
+        <w:rPr>
+          <w:lang w:val="en-US"/>
+        </w:rPr>
+      </w:pPr>
+    </w:p>
+    <w:p>
+      <w:pPr>
+        <w:pStyle w:val="BodyText"/>
+        <w:rPr>
+          <w:lang w:val="en-US"/>
+        </w:rPr>
+      </w:pPr>
+    </w:p>
+    <w:p>
+      <w:pPr>
+        <w:pStyle w:val="BodyText"/>
+        <w:rPr>
+          <w:lang w:val="en-US"/>
+        </w:rPr>
+      </w:pPr>
+    </w:p>
+    <w:p>
+      <w:pPr>
+        <w:pStyle w:val="BodyText"/>
+        <w:rPr>
+          <w:lang w:val="en-US"/>
+        </w:rPr>
+      </w:pPr>
+      <w:r>
+        <w:rPr>
+          <w:lang w:val="en-US"/>
+        </w:rPr>
+        <w:lastRenderedPageBreak/>
+        <w:t>+------------------------------------------------------+</w:t>
+      </w:r>
+    </w:p>
+    <w:p>
+      <w:pPr>
+        <w:pStyle w:val="BodyText"/>
+        <w:rPr>
+          <w:lang w:val="en-US"/>
+        </w:rPr>
+      </w:pPr>
+      <w:r>
+        <w:rPr>
+          <w:lang w:val="en-US"/>
+        </w:rPr>
+        <w:t xml:space="preserve">| </w:t>
+      </w:r>
+      <w:proofErr w:type="spellStart"/>
+      <w:r>
+        <w:rPr>
+          <w:lang w:val="en-US"/>
+        </w:rPr>
+        <w:t>MainWindow</w:t>
+      </w:r>
+      <w:proofErr w:type="spellEnd"/>
+      <w:r>
+        <w:rPr>
+          <w:lang w:val="en-US"/>
+        </w:rPr>
+        <w:t xml:space="preserve">                                           |</w:t>
+      </w:r>
+    </w:p>
+    <w:p>
+      <w:pPr>
+        <w:pStyle w:val="BodyText"/>
+        <w:rPr>
+          <w:lang w:val="en-US"/>
+        </w:rPr>
+      </w:pPr>
+      <w:r>
+        <w:rPr>
+          <w:lang w:val="en-US"/>
+        </w:rPr>
+        <w:t>|------------------------------------------------------|</w:t>
+      </w:r>
+    </w:p>
+    <w:p>
+      <w:pPr>
+        <w:pStyle w:val="BodyText"/>
+        <w:rPr>
+          <w:lang w:val="en-US"/>
+        </w:rPr>
+      </w:pPr>
+      <w:r>
+        <w:rPr>
+          <w:lang w:val="en-US"/>
+        </w:rPr>
+        <w:t xml:space="preserve">| + </w:t>
+      </w:r>
+      <w:proofErr w:type="spellStart"/>
+      <w:proofErr w:type="gramStart"/>
+      <w:r>
+        <w:rPr>
+          <w:lang w:val="en-US"/>
+        </w:rPr>
+        <w:t>DataContext</w:t>
+      </w:r>
+      <w:proofErr w:type="spellEnd"/>
+      <w:r>
+        <w:rPr>
+          <w:lang w:val="en-US"/>
+        </w:rPr>
+        <w:t xml:space="preserve"> :</w:t>
+      </w:r>
+      <w:proofErr w:type="gramEnd"/>
+      <w:r>
+        <w:rPr>
+          <w:lang w:val="en-US"/>
+        </w:rPr>
+        <w:t xml:space="preserve"> </w:t>
+      </w:r>
+      <w:proofErr w:type="spellStart"/>
+      <w:r>
+        <w:rPr>
+          <w:lang w:val="en-US"/>
+        </w:rPr>
+        <w:t>MainWindowViewModel</w:t>
+      </w:r>
+      <w:proofErr w:type="spellEnd"/>
+      <w:r>
+        <w:rPr>
+          <w:lang w:val="en-US"/>
+        </w:rPr>
+        <w:t xml:space="preserve">                   |</w:t>
+      </w:r>
+    </w:p>
+    <w:p>
+      <w:pPr>
+        <w:pStyle w:val="BodyText"/>
+        <w:rPr>
+          <w:lang w:val="en-US"/>
+        </w:rPr>
+      </w:pPr>
+      <w:r>
+        <w:rPr>
+          <w:lang w:val="en-US"/>
+        </w:rPr>
+        <w:t xml:space="preserve">| + </w:t>
+      </w:r>
+      <w:proofErr w:type="spellStart"/>
+      <w:r>
+        <w:rPr>
+          <w:lang w:val="en-US"/>
+        </w:rPr>
+        <w:t>MenuItem</w:t>
+      </w:r>
+      <w:proofErr w:type="spellEnd"/>
+      <w:r>
+        <w:rPr>
+          <w:lang w:val="en-US"/>
+        </w:rPr>
+        <w:t xml:space="preserve"> "Open" Command="{Binding </w:t>
+      </w:r>
+      <w:proofErr w:type="spellStart"/>
+      <w:r>
+        <w:rPr>
+          <w:lang w:val="en-US"/>
+        </w:rPr>
+        <w:t>OpenCommand</w:t>
+      </w:r>
+      <w:proofErr w:type="spellEnd"/>
+      <w:r>
+        <w:rPr>
+          <w:lang w:val="en-US"/>
+        </w:rPr>
+        <w:t>}"     |</w:t>
+      </w:r>
+    </w:p>
+    <w:p>
+      <w:pPr>
+        <w:pStyle w:val="BodyText"/>
+        <w:rPr>
+          <w:lang w:val="en-US"/>
+        </w:rPr>
+      </w:pPr>
+      <w:r>
+        <w:rPr>
+          <w:lang w:val="en-US"/>
+        </w:rPr>
+        <w:t>+------------------------------------------------------+</w:t>
+      </w:r>
+    </w:p>
+    <w:p>
+      <w:pPr>
+        <w:pStyle w:val="BodyText"/>
+        <w:rPr>
+          <w:lang w:val="en-US"/>
+        </w:rPr>
+      </w:pPr>
+      <w:r>
+        <w:rPr>
+          <w:lang w:val="en-US"/>
+        </w:rPr>
+        <w:t xml:space="preserve">                         |</w:t>
+      </w:r>
+    </w:p>
+    <w:p>
+      <w:pPr>
+        <w:pStyle w:val="BodyText"/>
+        <w:rPr>
+          <w:lang w:val="en-US"/>
+        </w:rPr>
+      </w:pPr>
+      <w:r>
+        <w:rPr>
+          <w:lang w:val="en-US"/>
+        </w:rPr>
+        <w:t xml:space="preserve">                         | </w:t>
+      </w:r>
+      <w:proofErr w:type="gramStart"/>
+      <w:r>
+        <w:rPr>
+          <w:lang w:val="en-US"/>
+        </w:rPr>
+        <w:t>1 :</w:t>
+      </w:r>
+      <w:proofErr w:type="gramEnd"/>
+      <w:r>
+        <w:rPr>
+          <w:lang w:val="en-US"/>
+        </w:rPr>
+        <w:t xml:space="preserve"> bind</w:t>
+      </w:r>
+    </w:p>
+    <w:p>
+      <w:pPr>
+        <w:pStyle w:val="BodyText"/>
+        <w:rPr>
+          <w:lang w:val="en-US"/>
+        </w:rPr>
+      </w:pPr>
+      <w:r>
+        <w:rPr>
+          <w:lang w:val="en-US"/>
+        </w:rPr>
+        <w:t xml:space="preserve">                         v</w:t>
+      </w:r>
+    </w:p>
+    <w:p>
+      <w:pPr>
+        <w:pStyle w:val="BodyText"/>
+        <w:rPr>
+          <w:lang w:val="en-US"/>
+        </w:rPr>
+      </w:pPr>
+      <w:r>
+        <w:rPr>
+          <w:lang w:val="en-US"/>
+        </w:rPr>
+        <w:t>+------------------------------------------------------+</w:t>
+      </w:r>
+    </w:p>
+    <w:p>
+      <w:pPr>
+        <w:pStyle w:val="BodyText"/>
+        <w:rPr>
+          <w:lang w:val="en-US"/>
+        </w:rPr>
+      </w:pPr>
+      <w:r>
+        <w:rPr>
+          <w:lang w:val="en-US"/>
+        </w:rPr>
+        <w:t xml:space="preserve">| </w:t>
+      </w:r>
+      <w:proofErr w:type="spellStart"/>
+      <w:r>
+        <w:rPr>
+          <w:lang w:val="en-US"/>
+        </w:rPr>
+        <w:t>MainWindowViewModel</w:t>
+      </w:r>
+      <w:proofErr w:type="spellEnd"/>
+      <w:r>
+        <w:rPr>
+          <w:lang w:val="en-US"/>
+        </w:rPr>
+        <w:t xml:space="preserve">                                   |</w:t>
+      </w:r>
+    </w:p>
+    <w:p>
+      <w:pPr>
+        <w:pStyle w:val="BodyText"/>
+        <w:rPr>
+          <w:lang w:val="en-US"/>
+        </w:rPr>
+      </w:pPr>
+      <w:r>
+        <w:rPr>
+          <w:lang w:val="en-US"/>
+        </w:rPr>
+        <w:t>|------------------------------------------------------|</w:t>
+      </w:r>
+    </w:p>
+    <w:p>
+      <w:pPr>
+        <w:pStyle w:val="BodyText"/>
+        <w:rPr>
+          <w:lang w:val="en-US"/>
+        </w:rPr>
+      </w:pPr>
+      <w:r>
+        <w:rPr>
+          <w:lang w:val="en-US"/>
+        </w:rPr>
+        <w:t xml:space="preserve">| + </w:t>
+      </w:r>
+      <w:proofErr w:type="spellStart"/>
+      <w:proofErr w:type="gramStart"/>
+      <w:r>
+        <w:rPr>
+          <w:lang w:val="en-US"/>
+        </w:rPr>
+        <w:t>OpenCommand</w:t>
+      </w:r>
+      <w:proofErr w:type="spellEnd"/>
+      <w:r>
+        <w:rPr>
+          <w:lang w:val="en-US"/>
+        </w:rPr>
+        <w:t xml:space="preserve"> :</w:t>
+      </w:r>
+      <w:proofErr w:type="gramEnd"/>
+      <w:r>
+        <w:rPr>
+          <w:lang w:val="en-US"/>
+        </w:rPr>
+        <w:t xml:space="preserve"> </w:t>
+      </w:r>
+      <w:proofErr w:type="spellStart"/>
+      <w:r>
+        <w:rPr>
+          <w:lang w:val="en-US"/>
+        </w:rPr>
+        <w:t>ICommand</w:t>
+      </w:r>
+      <w:proofErr w:type="spellEnd"/>
+      <w:r>
+        <w:rPr>
+          <w:lang w:val="en-US"/>
+        </w:rPr>
+        <w:t xml:space="preserve">                              |</w:t>
+      </w:r>
+    </w:p>
+    <w:p>
+      <w:pPr>
+        <w:pStyle w:val="BodyText"/>
+        <w:rPr>
+          <w:lang w:val="en-US"/>
+        </w:rPr>
+      </w:pPr>
+      <w:r>
+        <w:rPr>
+          <w:lang w:val="en-US"/>
+        </w:rPr>
+        <w:t xml:space="preserve">| + </w:t>
+      </w:r>
+      <w:proofErr w:type="spellStart"/>
+      <w:proofErr w:type="gramStart"/>
+      <w:r>
+        <w:rPr>
+          <w:lang w:val="en-US"/>
+        </w:rPr>
+        <w:t>BrowseCommand</w:t>
+      </w:r>
+      <w:proofErr w:type="spellEnd"/>
+      <w:r>
+        <w:rPr>
+          <w:lang w:val="en-US"/>
+        </w:rPr>
+        <w:t xml:space="preserve"> :</w:t>
+      </w:r>
+      <w:proofErr w:type="gramEnd"/>
+      <w:r>
+        <w:rPr>
+          <w:lang w:val="en-US"/>
+        </w:rPr>
+        <w:t xml:space="preserve"> </w:t>
+      </w:r>
+      <w:proofErr w:type="spellStart"/>
+      <w:r>
+        <w:rPr>
+          <w:lang w:val="en-US"/>
+        </w:rPr>
+        <w:t>RelayCommand</w:t>
+      </w:r>
+      <w:proofErr w:type="spellEnd"/>
+      <w:r>
+        <w:rPr>
+          <w:lang w:val="en-US"/>
+        </w:rPr>
+        <w:t xml:space="preserve">                        |</w:t>
+      </w:r>
+    </w:p>
+    <w:p>
+      <w:pPr>
+        <w:pStyle w:val="BodyText"/>
+        <w:rPr>
+          <w:lang w:val="en-US"/>
+        </w:rPr>
+      </w:pPr>
+      <w:r>
+        <w:rPr>
+          <w:lang w:val="en-US"/>
+        </w:rPr>
+        <w:t xml:space="preserve">| + </w:t>
+      </w:r>
+      <w:proofErr w:type="spellStart"/>
+      <w:proofErr w:type="gramStart"/>
+      <w:r>
+        <w:rPr>
+          <w:lang w:val="en-US"/>
+        </w:rPr>
+        <w:t>QuitCommand</w:t>
+      </w:r>
+      <w:proofErr w:type="spellEnd"/>
+      <w:r>
+        <w:rPr>
+          <w:lang w:val="en-US"/>
+        </w:rPr>
+        <w:t xml:space="preserve"> :</w:t>
+      </w:r>
+      <w:proofErr w:type="gramEnd"/>
+      <w:r>
+        <w:rPr>
+          <w:lang w:val="en-US"/>
+        </w:rPr>
+        <w:t xml:space="preserve"> </w:t>
+      </w:r>
+      <w:proofErr w:type="spellStart"/>
+      <w:r>
+        <w:rPr>
+          <w:lang w:val="en-US"/>
+        </w:rPr>
+        <w:t>RelayCommand</w:t>
+      </w:r>
+      <w:proofErr w:type="spellEnd"/>
+      <w:r>
+        <w:rPr>
+          <w:lang w:val="en-US"/>
+        </w:rPr>
+        <w:t xml:space="preserve">                           |</w:t>
+      </w:r>
+    </w:p>
+    <w:p>
+      <w:pPr>
+        <w:pStyle w:val="BodyText"/>
+        <w:rPr>
+          <w:lang w:val="en-US"/>
+        </w:rPr>
+      </w:pPr>
+      <w:r>
+        <w:rPr>
+          <w:lang w:val="en-US"/>
+        </w:rPr>
+        <w:t xml:space="preserve">| + </w:t>
+      </w:r>
+      <w:proofErr w:type="gramStart"/>
+      <w:r>
+        <w:rPr>
+          <w:lang w:val="en-US"/>
+        </w:rPr>
+        <w:t>Tabs :</w:t>
+      </w:r>
+      <w:proofErr w:type="gramEnd"/>
+      <w:r>
+        <w:rPr>
+          <w:lang w:val="en-US"/>
+        </w:rPr>
+        <w:t xml:space="preserve"> </w:t>
+      </w:r>
+      <w:proofErr w:type="spellStart"/>
+      <w:r>
+        <w:rPr>
+          <w:lang w:val="en-US"/>
+        </w:rPr>
+        <w:t>ObservableCollection</w:t>
+      </w:r>
+      <w:proofErr w:type="spellEnd"/>
+      <w:r>
+        <w:rPr>
+          <w:lang w:val="en-US"/>
+        </w:rPr>
+        <w:t>&lt;object&gt;                |</w:t>
+      </w:r>
+    </w:p>
+    <w:p>
+      <w:pPr>
+        <w:pStyle w:val="BodyText"/>
+        <w:rPr>
+          <w:lang w:val="en-US"/>
+        </w:rPr>
+      </w:pPr>
+      <w:r>
+        <w:rPr>
+          <w:lang w:val="en-US"/>
+        </w:rPr>
+        <w:t xml:space="preserve">| + </w:t>
+      </w:r>
+      <w:proofErr w:type="spellStart"/>
+      <w:proofErr w:type="gramStart"/>
+      <w:r>
+        <w:rPr>
+          <w:lang w:val="en-US"/>
+        </w:rPr>
+        <w:t>SelectedTab</w:t>
+      </w:r>
+      <w:proofErr w:type="spellEnd"/>
+      <w:r>
+        <w:rPr>
+          <w:lang w:val="en-US"/>
+        </w:rPr>
+        <w:t xml:space="preserve"> :</w:t>
+      </w:r>
+      <w:proofErr w:type="gramEnd"/>
+      <w:r>
+        <w:rPr>
+          <w:lang w:val="en-US"/>
+        </w:rPr>
+        <w:t xml:space="preserve"> object?                              |</w:t>
+      </w:r>
+    </w:p>
+    <w:p>
+      <w:pPr>
+        <w:pStyle w:val="BodyText"/>
+        <w:rPr>
+          <w:lang w:val="en-US"/>
+        </w:rPr>
+      </w:pPr>
+      <w:r>
+        <w:rPr>
+          <w:lang w:val="en-US"/>
+        </w:rPr>
+        <w:t>|------------------------------------------------------|</w:t>
+      </w:r>
+    </w:p>
+    <w:p>
+      <w:pPr>
+        <w:pStyle w:val="BodyText"/>
+        <w:rPr>
+          <w:lang w:val="en-US"/>
+        </w:rPr>
+      </w:pPr>
+      <w:r>
+        <w:rPr>
+          <w:lang w:val="en-US"/>
+        </w:rPr>
+        <w:t xml:space="preserve">| + </w:t>
+      </w:r>
+      <w:proofErr w:type="spellStart"/>
+      <w:proofErr w:type="gramStart"/>
+      <w:r>
+        <w:rPr>
+          <w:lang w:val="en-US"/>
+        </w:rPr>
+        <w:t>MainWindowViewModel</w:t>
+      </w:r>
+      <w:proofErr w:type="spellEnd"/>
+      <w:r>
+        <w:rPr>
+          <w:lang w:val="en-US"/>
+        </w:rPr>
+        <w:t>(</w:t>
+      </w:r>
+      <w:proofErr w:type="spellStart"/>
+      <w:r>
+        <w:rPr>
+          <w:lang w:val="en-US"/>
+        </w:rPr>
+        <w:t>fileDialogService</w:t>
+      </w:r>
+      <w:proofErr w:type="spellEnd"/>
+      <w:r>
+        <w:rPr>
+          <w:lang w:val="en-US"/>
+        </w:rPr>
+        <w:t xml:space="preserve"> :</w:t>
+      </w:r>
+      <w:proofErr w:type="gramEnd"/>
+      <w:r>
+        <w:rPr>
+          <w:lang w:val="en-US"/>
+        </w:rPr>
+        <w:t xml:space="preserve"> </w:t>
+      </w:r>
+      <w:proofErr w:type="spellStart"/>
+      <w:r>
+        <w:rPr>
+          <w:lang w:val="en-US"/>
+        </w:rPr>
+        <w:t>IFileDialogService</w:t>
+      </w:r>
+      <w:proofErr w:type="spellEnd"/>
+      <w:r>
+        <w:rPr>
+          <w:lang w:val="en-US"/>
+        </w:rPr>
+        <w:t>) |</w:t>
+      </w:r>
+    </w:p>
+    <w:p>
+      <w:pPr>
+        <w:pStyle w:val="BodyText"/>
+        <w:rPr>
+          <w:lang w:val="en-US"/>
+        </w:rPr>
+      </w:pPr>
+      <w:r>
+        <w:rPr>
+          <w:lang w:val="en-US"/>
+        </w:rPr>
+        <w:t xml:space="preserve">| + </w:t>
+      </w:r>
+      <w:proofErr w:type="spellStart"/>
+      <w:proofErr w:type="gramStart"/>
+      <w:r>
+        <w:rPr>
+          <w:lang w:val="en-US"/>
+        </w:rPr>
+        <w:t>OpenFiles</w:t>
+      </w:r>
+      <w:proofErr w:type="spellEnd"/>
+      <w:r>
+        <w:rPr>
+          <w:lang w:val="en-US"/>
+        </w:rPr>
+        <w:t>(</w:t>
+      </w:r>
+      <w:proofErr w:type="gramEnd"/>
+      <w:r>
+        <w:rPr>
+          <w:lang w:val="en-US"/>
+        </w:rPr>
+        <w:t>)                                         |</w:t>
+      </w:r>
+    </w:p>
+    <w:p>
+      <w:pPr>
+        <w:pStyle w:val="BodyText"/>
+        <w:rPr>
+          <w:lang w:val="en-US"/>
+        </w:rPr>
+      </w:pPr>
+      <w:r>
+        <w:rPr>
+          <w:lang w:val="en-US"/>
+        </w:rPr>
+        <w:t xml:space="preserve">| + </w:t>
+      </w:r>
+      <w:proofErr w:type="spellStart"/>
+      <w:proofErr w:type="gramStart"/>
+      <w:r>
+        <w:rPr>
+          <w:lang w:val="en-US"/>
+        </w:rPr>
+        <w:t>ShowExplorerTab</w:t>
+      </w:r>
+      <w:proofErr w:type="spellEnd"/>
+      <w:r>
+        <w:rPr>
+          <w:lang w:val="en-US"/>
+        </w:rPr>
+        <w:t>(</w:t>
+      </w:r>
+      <w:proofErr w:type="gramEnd"/>
+      <w:r>
+        <w:rPr>
+          <w:lang w:val="en-US"/>
+        </w:rPr>
+        <w:t>)                                   |</w:t>
+      </w:r>
+    </w:p>
+    <w:p>
+      <w:pPr>
+        <w:pStyle w:val="BodyText"/>
+        <w:rPr>
+          <w:lang w:val="en-US"/>
+        </w:rPr>
+      </w:pPr>
+      <w:r>
+        <w:rPr>
+          <w:lang w:val="en-US"/>
+        </w:rPr>
+        <w:t>+------------------------------------------------------+</w:t>
+      </w:r>
+    </w:p>
+    <w:p>
+      <w:pPr>
+        <w:pStyle w:val="BodyText"/>
+        <w:rPr>
+          <w:lang w:val="en-US"/>
+        </w:rPr>
+      </w:pPr>
+      <w:r>
+        <w:rPr>
+          <w:lang w:val="en-US"/>
+        </w:rPr>
+        <w:t xml:space="preserve">                         |</w:t>
+      </w:r>
+    </w:p>
+    <w:p>
+      <w:pPr>
+        <w:pStyle w:val="BodyText"/>
+        <w:rPr>
+          <w:lang w:val="en-US"/>
+        </w:rPr>
+      </w:pPr>
+      <w:r>
+        <w:rPr>
+          <w:lang w:val="en-US"/>
+        </w:rPr>
+        <w:t xml:space="preserve">                         | uses</w:t>
+      </w:r>
+    </w:p>
+    <w:p>
+      <w:pPr>
+        <w:pStyle w:val="BodyText"/>
+        <w:rPr>
+          <w:lang w:val="en-US"/>
+        </w:rPr>
+      </w:pPr>
+      <w:r>
+        <w:rPr>
+          <w:lang w:val="en-US"/>
+        </w:rPr>
+        <w:t xml:space="preserve">                         v</w:t>
+      </w:r>
+    </w:p>
+    <w:p>
+      <w:pPr>
+        <w:pStyle w:val="BodyText"/>
+        <w:rPr>
+          <w:lang w:val="en-US"/>
+        </w:rPr>
+      </w:pPr>
+      <w:r>
+        <w:rPr>
+          <w:lang w:val="en-US"/>
+        </w:rPr>
+        <w:t>+------------------------------------------------------+</w:t>
+      </w:r>
+    </w:p>
+    <w:p>
+      <w:pPr>
+        <w:pStyle w:val="BodyText"/>
+        <w:rPr>
+          <w:lang w:val="en-US"/>
+        </w:rPr>
+      </w:pPr>
+      <w:r>
+        <w:rPr>
+          <w:lang w:val="en-US"/>
+        </w:rPr>
+        <w:t xml:space="preserve">| </w:t>
+      </w:r>
+      <w:proofErr w:type="spellStart"/>
+      <w:r>
+        <w:rPr>
+          <w:lang w:val="en-US"/>
+        </w:rPr>
+        <w:t>IFileDialogService</w:t>
+      </w:r>
+      <w:proofErr w:type="spellEnd"/>
+      <w:r>
+        <w:rPr>
+          <w:lang w:val="en-US"/>
+        </w:rPr>
+        <w:t xml:space="preserve">                                    |</w:t>
+      </w:r>
+    </w:p>
+    <w:p>
+      <w:pPr>
+        <w:pStyle w:val="BodyText"/>
+        <w:rPr>
+          <w:lang w:val="en-US"/>
+        </w:rPr>
+      </w:pPr>
+      <w:r>
+        <w:rPr>
+          <w:lang w:val="en-US"/>
+        </w:rPr>
+        <w:t>|------------------------------------------------------|</w:t>
+      </w:r>
+    </w:p>
+    <w:p>
+      <w:pPr>
+        <w:pStyle w:val="BodyText"/>
+        <w:rPr>
+          <w:lang w:val="en-US"/>
+        </w:rPr>
+      </w:pPr>
+      <w:r>
+        <w:rPr>
+          <w:lang w:val="en-US"/>
+        </w:rPr>
+        <w:t xml:space="preserve">| + </w:t>
+      </w:r>
+      <w:proofErr w:type="spellStart"/>
+      <w:proofErr w:type="gramStart"/>
+      <w:r>
+        <w:rPr>
+          <w:lang w:val="en-US"/>
+        </w:rPr>
+        <w:t>OpenFiles</w:t>
+      </w:r>
+      <w:proofErr w:type="spellEnd"/>
+      <w:r>
+        <w:rPr>
+          <w:lang w:val="en-US"/>
+        </w:rPr>
+        <w:t>(filter :</w:t>
+      </w:r>
+      <w:proofErr w:type="gramEnd"/>
+      <w:r>
+        <w:rPr>
+          <w:lang w:val="en-US"/>
+        </w:rPr>
+        <w:t xml:space="preserve"> string, </w:t>
+      </w:r>
+      <w:proofErr w:type="spellStart"/>
+      <w:proofErr w:type="gramStart"/>
+      <w:r>
+        <w:rPr>
+          <w:lang w:val="en-US"/>
+        </w:rPr>
+        <w:t>multiSelect</w:t>
+      </w:r>
+      <w:proofErr w:type="spellEnd"/>
+      <w:r>
+        <w:rPr>
+          <w:lang w:val="en-US"/>
+        </w:rPr>
+        <w:t xml:space="preserve"> :</w:t>
+      </w:r>
+      <w:proofErr w:type="gramEnd"/>
+      <w:r>
+        <w:rPr>
+          <w:lang w:val="en-US"/>
+        </w:rPr>
+        <w:t xml:space="preserve"> bool</w:t>
+      </w:r>
+      <w:proofErr w:type="gramStart"/>
+      <w:r>
+        <w:rPr>
+          <w:lang w:val="en-US"/>
+        </w:rPr>
+        <w:t>) :</w:t>
+      </w:r>
+      <w:proofErr w:type="gramEnd"/>
+      <w:r>
+        <w:rPr>
+          <w:lang w:val="en-US"/>
+        </w:rPr>
+        <w:t xml:space="preserve"> </w:t>
+      </w:r>
+      <w:proofErr w:type="gramStart"/>
+      <w:r>
+        <w:rPr>
+          <w:lang w:val="en-US"/>
+        </w:rPr>
+        <w:t>string[</w:t>
+      </w:r>
+      <w:proofErr w:type="gramEnd"/>
+      <w:r>
+        <w:rPr>
+          <w:lang w:val="en-US"/>
+        </w:rPr>
+        <w:t>] |</w:t>
+      </w:r>
+    </w:p>
+    <w:p>
+      <w:pPr>
+        <w:pStyle w:val="BodyText"/>
+        <w:rPr>
+          <w:lang w:val="en-US"/>
+        </w:rPr>
+      </w:pPr>
+      <w:r>
+        <w:rPr>
+          <w:lang w:val="en-US"/>
+        </w:rPr>
+        <w:lastRenderedPageBreak/>
+        <w:t>+------------------------------------------------------+</w:t>
+      </w:r>
+    </w:p>
+    <w:p>
+      <w:pPr>
+        <w:pStyle w:val="BodyText"/>
+        <w:rPr>
+          <w:lang w:val="en-US"/>
+        </w:rPr>
+      </w:pPr>
+      <w:r>
+        <w:rPr>
+          <w:lang w:val="en-US"/>
+        </w:rPr>
+        <w:t xml:space="preserve">                         ^</w:t>
+      </w:r>
+    </w:p>
+    <w:p>
+      <w:pPr>
+        <w:pStyle w:val="BodyText"/>
+        <w:rPr>
+          <w:lang w:val="en-US"/>
+        </w:rPr>
+      </w:pPr>
+      <w:r>
+        <w:rPr>
+          <w:lang w:val="en-US"/>
+        </w:rPr>
+        <w:t xml:space="preserve">                         |</w:t>
+      </w:r>
+    </w:p>
+    <w:p>
+      <w:pPr>
+        <w:pStyle w:val="BodyText"/>
+        <w:rPr>
+          <w:lang w:val="en-US"/>
+        </w:rPr>
+      </w:pPr>
+      <w:r>
+        <w:rPr>
+          <w:lang w:val="en-US"/>
+        </w:rPr>
+        <w:t xml:space="preserve">                         | implements</w:t>
+      </w:r>
+    </w:p>
+    <w:p>
+      <w:pPr>
+        <w:pStyle w:val="BodyText"/>
+        <w:rPr>
+          <w:lang w:val="en-US"/>
+        </w:rPr>
+      </w:pPr>
+      <w:r>
+        <w:rPr>
+          <w:lang w:val="en-US"/>
+        </w:rPr>
+        <w:t xml:space="preserve">                         v</w:t>
+      </w:r>
+    </w:p>
+    <w:p>
+      <w:pPr>
+        <w:pStyle w:val="BodyText"/>
+        <w:rPr>
+          <w:lang w:val="en-US"/>
+        </w:rPr>
+      </w:pPr>
+      <w:r>
+        <w:rPr>
+          <w:lang w:val="en-US"/>
+        </w:rPr>
+        <w:t>+------------------------------------------------------+</w:t>
+      </w:r>
+    </w:p>
+    <w:p>
+      <w:pPr>
+        <w:pStyle w:val="BodyText"/>
+        <w:rPr>
+          <w:lang w:val="en-US"/>
+        </w:rPr>
+      </w:pPr>
+      <w:r>
+        <w:rPr>
+          <w:lang w:val="en-US"/>
+        </w:rPr>
+        <w:t xml:space="preserve">| </w:t>
+      </w:r>
+      <w:proofErr w:type="spellStart"/>
+      <w:r>
+        <w:rPr>
+          <w:lang w:val="en-US"/>
+        </w:rPr>
+        <w:t>FileDialogService</w:t>
+      </w:r>
+      <w:proofErr w:type="spellEnd"/>
+      <w:r>
+        <w:rPr>
+          <w:lang w:val="en-US"/>
+        </w:rPr>
+        <w:t xml:space="preserve">                                     |</w:t>
+      </w:r>
+    </w:p>
+    <w:p>
+      <w:pPr>
+        <w:pStyle w:val="BodyText"/>
+        <w:rPr>
+          <w:lang w:val="en-US"/>
+        </w:rPr>
+      </w:pPr>
+      <w:r>
+        <w:rPr>
+          <w:lang w:val="en-US"/>
+        </w:rPr>
+        <w:t>|------------------------------------------------------|</w:t>
+      </w:r>
+    </w:p>
+    <w:p>
+      <w:pPr>
+        <w:pStyle w:val="BodyText"/>
+        <w:rPr>
+          <w:lang w:val="en-US"/>
+        </w:rPr>
+      </w:pPr>
+      <w:r>
+        <w:rPr>
+          <w:lang w:val="en-US"/>
+        </w:rPr>
+        <w:t xml:space="preserve">| + </w:t>
+      </w:r>
+      <w:proofErr w:type="spellStart"/>
+      <w:proofErr w:type="gramStart"/>
+      <w:r>
+        <w:rPr>
+          <w:lang w:val="en-US"/>
+        </w:rPr>
+        <w:t>OpenFiles</w:t>
+      </w:r>
+      <w:proofErr w:type="spellEnd"/>
+      <w:r>
+        <w:rPr>
+          <w:lang w:val="en-US"/>
+        </w:rPr>
+        <w:t>(filter :</w:t>
+      </w:r>
+      <w:proofErr w:type="gramEnd"/>
+      <w:r>
+        <w:rPr>
+          <w:lang w:val="en-US"/>
+        </w:rPr>
+        <w:t xml:space="preserve"> string, </w:t>
+      </w:r>
+      <w:proofErr w:type="spellStart"/>
+      <w:proofErr w:type="gramStart"/>
+      <w:r>
+        <w:rPr>
+          <w:lang w:val="en-US"/>
+        </w:rPr>
+        <w:t>multiSelect</w:t>
+      </w:r>
+      <w:proofErr w:type="spellEnd"/>
+      <w:r>
+        <w:rPr>
+          <w:lang w:val="en-US"/>
+        </w:rPr>
+        <w:t xml:space="preserve"> :</w:t>
+      </w:r>
+      <w:proofErr w:type="gramEnd"/>
+      <w:r>
+        <w:rPr>
+          <w:lang w:val="en-US"/>
+        </w:rPr>
+        <w:t xml:space="preserve"> bool</w:t>
+      </w:r>
+      <w:proofErr w:type="gramStart"/>
+      <w:r>
+        <w:rPr>
+          <w:lang w:val="en-US"/>
+        </w:rPr>
+        <w:t>) :</w:t>
+      </w:r>
+      <w:proofErr w:type="gramEnd"/>
+      <w:r>
+        <w:rPr>
+          <w:lang w:val="en-US"/>
+        </w:rPr>
+        <w:t xml:space="preserve"> </w:t>
+      </w:r>
+      <w:proofErr w:type="gramStart"/>
+      <w:r>
+        <w:rPr>
+          <w:lang w:val="en-US"/>
+        </w:rPr>
+        <w:t>string[</w:t>
+      </w:r>
+      <w:proofErr w:type="gramEnd"/>
+      <w:r>
+        <w:rPr>
+          <w:lang w:val="en-US"/>
+        </w:rPr>
+        <w:t>] |</w:t>
+      </w:r>
+    </w:p>
+    <w:p>
+      <w:pPr>
+        <w:pStyle w:val="BodyText"/>
+        <w:rPr>
+          <w:lang w:val="en-US"/>
+        </w:rPr>
+      </w:pPr>
+      <w:r>
+        <w:rPr>
+          <w:lang w:val="en-US"/>
+        </w:rPr>
+        <w:t>|------------------------------------------------------|</w:t>
+      </w:r>
+    </w:p>
+    <w:p>
+      <w:pPr>
+        <w:pStyle w:val="BodyText"/>
+        <w:rPr>
+          <w:lang w:val="en-US"/>
+        </w:rPr>
+      </w:pPr>
+      <w:r>
+        <w:rPr>
+          <w:lang w:val="en-US"/>
+        </w:rPr>
+        <w:t>| - uses Microsoft.Win</w:t>
+      </w:r>
+      <w:proofErr w:type="gramStart"/>
+      <w:r>
+        <w:rPr>
+          <w:lang w:val="en-US"/>
+        </w:rPr>
+        <w:t>32.OpenFileDialog</w:t>
+      </w:r>
+      <w:proofErr w:type="gramEnd"/>
+      <w:r>
+        <w:rPr>
+          <w:lang w:val="en-US"/>
+        </w:rPr>
+        <w:t xml:space="preserve">                 |</w:t>
+      </w:r>
+    </w:p>
+    <w:p>
+      <w:pPr>
+        <w:pStyle w:val="BodyText"/>
+        <w:rPr>
+          <w:lang w:val="en-US"/>
+        </w:rPr>
+      </w:pPr>
+      <w:r>
+        <w:rPr>
+          <w:lang w:val="en-US"/>
+        </w:rPr>
+        <w:t>+------------------------------------------------------+</w:t>
+      </w:r>
+    </w:p>
+    <w:p>
+      <w:pPr>
+        <w:pStyle w:val="BodyText"/>
+        <w:rPr>
+          <w:lang w:val="en-US"/>
+        </w:rPr>
+      </w:pPr>
+    </w:p>
+    <w:p>
+      <w:pPr>
+        <w:pStyle w:val="BodyText"/>
+        <w:rPr>
+          <w:lang w:val="en-US"/>
+        </w:rPr>
+      </w:pPr>
+      <w:r>
+        <w:rPr>
+          <w:lang w:val="en-US"/>
+        </w:rPr>
+        <w:t xml:space="preserve">                         |</w:t>
+      </w:r>
+    </w:p>
+    <w:p>
+      <w:pPr>
+        <w:pStyle w:val="BodyText"/>
+        <w:rPr>
+          <w:lang w:val="en-US"/>
+        </w:rPr>
+      </w:pPr>
+      <w:r>
+        <w:rPr>
+          <w:lang w:val="en-US"/>
+        </w:rPr>
+        <w:t xml:space="preserve">                         | returns selected file paths</w:t>
+      </w:r>
+    </w:p>
+    <w:p>
+      <w:pPr>
+        <w:pStyle w:val="BodyText"/>
+        <w:rPr>
+          <w:lang w:val="en-US"/>
+        </w:rPr>
+      </w:pPr>
+      <w:r>
+        <w:rPr>
+          <w:lang w:val="en-US"/>
+        </w:rPr>
+        <w:t xml:space="preserve">                         v</w:t>
+      </w:r>
+    </w:p>
+    <w:p>
+      <w:pPr>
+        <w:pStyle w:val="BodyText"/>
+        <w:rPr>
+          <w:lang w:val="en-US"/>
+        </w:rPr>
+      </w:pPr>
+      <w:r>
+        <w:rPr>
+          <w:lang w:val="en-US"/>
+        </w:rPr>
+        <w:t>+------------------------------------------------------+</w:t>
+      </w:r>
+    </w:p>
+    <w:p>
+      <w:pPr>
+        <w:pStyle w:val="BodyText"/>
+        <w:rPr>
+          <w:lang w:val="en-US"/>
+        </w:rPr>
+      </w:pPr>
+      <w:r>
+        <w:rPr>
+          <w:lang w:val="en-US"/>
+        </w:rPr>
+        <w:t xml:space="preserve">| </w:t>
+      </w:r>
+      <w:proofErr w:type="spellStart"/>
+      <w:r>
+        <w:rPr>
+          <w:lang w:val="en-US"/>
+        </w:rPr>
+        <w:t>RelayCommand</w:t>
+      </w:r>
+      <w:proofErr w:type="spellEnd"/>
+      <w:r>
+        <w:rPr>
+          <w:lang w:val="en-US"/>
+        </w:rPr>
+        <w:t xml:space="preserve">                                          |</w:t>
+      </w:r>
+    </w:p>
+    <w:p>
+      <w:pPr>
+        <w:pStyle w:val="BodyText"/>
+        <w:rPr>
+          <w:lang w:val="en-US"/>
+        </w:rPr>
+      </w:pPr>
+      <w:r>
+        <w:rPr>
+          <w:lang w:val="en-US"/>
+        </w:rPr>
+        <w:t>|------------------------------------------------------|</w:t>
+      </w:r>
+    </w:p>
+    <w:p>
+      <w:pPr>
+        <w:pStyle w:val="BodyText"/>
+        <w:rPr>
+          <w:lang w:val="en-US"/>
+        </w:rPr>
+      </w:pPr>
+      <w:r>
+        <w:rPr>
+          <w:lang w:val="en-US"/>
+        </w:rPr>
+        <w:t>| - _</w:t>
+      </w:r>
+      <w:proofErr w:type="gramStart"/>
+      <w:r>
+        <w:rPr>
+          <w:lang w:val="en-US"/>
+        </w:rPr>
+        <w:t>execute :</w:t>
+      </w:r>
+      <w:proofErr w:type="gramEnd"/>
+      <w:r>
+        <w:rPr>
+          <w:lang w:val="en-US"/>
+        </w:rPr>
+        <w:t xml:space="preserve"> Action&lt;object?&gt;                          |</w:t>
+      </w:r>
+    </w:p>
+    <w:p>
+      <w:pPr>
+        <w:pStyle w:val="BodyText"/>
+        <w:rPr>
+          <w:lang w:val="en-US"/>
+        </w:rPr>
+      </w:pPr>
+      <w:r>
+        <w:rPr>
+          <w:lang w:val="en-US"/>
+        </w:rPr>
+        <w:t>| - _</w:t>
+      </w:r>
+      <w:proofErr w:type="spellStart"/>
+      <w:proofErr w:type="gramStart"/>
+      <w:r>
+        <w:rPr>
+          <w:lang w:val="en-US"/>
+        </w:rPr>
+        <w:t>canExecute</w:t>
+      </w:r>
+      <w:proofErr w:type="spellEnd"/>
+      <w:r>
+        <w:rPr>
+          <w:lang w:val="en-US"/>
+        </w:rPr>
+        <w:t xml:space="preserve"> :</w:t>
+      </w:r>
+      <w:proofErr w:type="gramEnd"/>
+      <w:r>
+        <w:rPr>
+          <w:lang w:val="en-US"/>
+        </w:rPr>
+        <w:t xml:space="preserve"> Predicate&lt;object?&gt;?                  |</w:t>
+      </w:r>
+    </w:p>
+    <w:p>
+      <w:pPr>
+        <w:pStyle w:val="BodyText"/>
+        <w:rPr>
+          <w:lang w:val="en-US"/>
+        </w:rPr>
+      </w:pPr>
+      <w:r>
+        <w:rPr>
+          <w:lang w:val="en-US"/>
+        </w:rPr>
+        <w:t>|------------------------------------------------------|</w:t>
+      </w:r>
+    </w:p>
+    <w:p>
+      <w:pPr>
+        <w:pStyle w:val="BodyText"/>
+        <w:rPr>
+          <w:lang w:val="en-US"/>
+        </w:rPr>
+      </w:pPr>
+      <w:r>
+        <w:rPr>
+          <w:lang w:val="en-US"/>
+        </w:rPr>
+        <w:t xml:space="preserve">| + </w:t>
+      </w:r>
+      <w:proofErr w:type="spellStart"/>
+      <w:r>
+        <w:rPr>
+          <w:lang w:val="en-US"/>
+        </w:rPr>
+        <w:t>CanExecute</w:t>
+      </w:r>
+      <w:proofErr w:type="spellEnd"/>
+      <w:r>
+        <w:rPr>
+          <w:lang w:val="en-US"/>
+        </w:rPr>
+        <w:t>(parameter</w:t>
+      </w:r>
+      <w:proofErr w:type="gramStart"/>
+      <w:r>
+        <w:rPr>
+          <w:lang w:val="en-US"/>
+        </w:rPr>
+        <w:t>) :</w:t>
+      </w:r>
+      <w:proofErr w:type="gramEnd"/>
+      <w:r>
+        <w:rPr>
+          <w:lang w:val="en-US"/>
+        </w:rPr>
+        <w:t xml:space="preserve"> bool                       |</w:t>
+      </w:r>
+    </w:p>
+    <w:p>
+      <w:pPr>
+        <w:pStyle w:val="BodyText"/>
+        <w:rPr>
+          <w:lang w:val="en-US"/>
+        </w:rPr>
+      </w:pPr>
+      <w:r>
+        <w:rPr>
+          <w:lang w:val="en-US"/>
+        </w:rPr>
+        <w:t>| + Execute(</w:t>
+      </w:r>
+      <w:proofErr w:type="gramStart"/>
+      <w:r>
+        <w:rPr>
+          <w:lang w:val="en-US"/>
+        </w:rPr>
+        <w:t xml:space="preserve">parameter)   </w:t>
+      </w:r>
+      <w:proofErr w:type="gramEnd"/>
+      <w:r>
+        <w:rPr>
+          <w:lang w:val="en-US"/>
+        </w:rPr>
+        <w:t xml:space="preserve">                               |</w:t>
+      </w:r>
+    </w:p>
+    <w:p>
+      <w:pPr>
+        <w:pStyle w:val="BodyText"/>
+        <w:rPr>
+          <w:lang w:val="en-US"/>
+        </w:rPr>
+      </w:pPr>
+      <w:r>
+        <w:rPr>
+          <w:lang w:val="en-US"/>
+        </w:rPr>
+        <w:t xml:space="preserve">| + event </w:t>
+      </w:r>
+      <w:proofErr w:type="spellStart"/>
+      <w:r>
+        <w:rPr>
+          <w:lang w:val="en-US"/>
+        </w:rPr>
+        <w:t>CanExecuteChanged</w:t>
+      </w:r>
+      <w:proofErr w:type="spellEnd"/>
+      <w:r>
+        <w:rPr>
+          <w:lang w:val="en-US"/>
+        </w:rPr>
+        <w:t xml:space="preserve">                             |</w:t>
+      </w:r>
+    </w:p>
+    <w:p>
+      <w:pPr>
+        <w:pStyle w:val="BodyText"/>
+        <w:rPr>
+          <w:lang w:val="en-US"/>
+        </w:rPr>
+      </w:pPr>
+      <w:r>
+        <w:rPr>
+          <w:lang w:val="en-US"/>
+        </w:rPr>
+        <w:t>+------------------------------------------------------+</w:t>
+      </w:r>
+    </w:p>
+    <w:p>
+      <w:pPr>
+        <w:pStyle w:val="BodyText"/>
+        <w:rPr>
+          <w:lang w:val="en-US"/>
+        </w:rPr>
+      </w:pPr>
+    </w:p>
+    <w:p>
+      <w:pPr>
+        <w:pStyle w:val="BodyText"/>
+        <w:rPr>
+          <w:lang w:val="en-US"/>
+        </w:rPr>
+      </w:pPr>
+      <w:r>
+        <w:rPr>
+          <w:lang w:val="en-US"/>
+        </w:rPr>
+        <w:t xml:space="preserve">                         |</w:t>
+      </w:r>
+    </w:p>
+    <w:p>
+      <w:pPr>
+        <w:pStyle w:val="BodyText"/>
+        <w:rPr>
+          <w:lang w:val="en-US"/>
+        </w:rPr>
+      </w:pPr>
+      <w:r>
+        <w:rPr>
+          <w:lang w:val="en-US"/>
+        </w:rPr>
+        <w:t xml:space="preserve">                         | executes</w:t>
+      </w:r>
+    </w:p>
+    <w:p>
+      <w:pPr>
+        <w:pStyle w:val="BodyText"/>
+        <w:rPr>
+          <w:lang w:val="en-US"/>
+        </w:rPr>
+      </w:pPr>
+      <w:r>
+        <w:rPr>
+          <w:lang w:val="en-US"/>
+        </w:rPr>
+        <w:lastRenderedPageBreak/>
+        <w:t xml:space="preserve">                         v</w:t>
+      </w:r>
+    </w:p>
+    <w:p>
+      <w:pPr>
+        <w:pStyle w:val="BodyText"/>
+        <w:rPr>
+          <w:lang w:val="en-US"/>
+        </w:rPr>
+      </w:pPr>
+      <w:r>
+        <w:rPr>
+          <w:lang w:val="en-US"/>
+        </w:rPr>
+        <w:t>+------------------------------------------------------+</w:t>
+      </w:r>
+    </w:p>
+    <w:p>
+      <w:pPr>
+        <w:pStyle w:val="BodyText"/>
+        <w:rPr>
+          <w:lang w:val="en-US"/>
+        </w:rPr>
+      </w:pPr>
+      <w:r>
+        <w:rPr>
+          <w:lang w:val="en-US"/>
+        </w:rPr>
+        <w:t xml:space="preserve">| </w:t>
+      </w:r>
+      <w:proofErr w:type="spellStart"/>
+      <w:r>
+        <w:rPr>
+          <w:lang w:val="en-US"/>
+        </w:rPr>
+        <w:t>MainWindowViewModel.OpenFiles</w:t>
+      </w:r>
+      <w:proofErr w:type="spellEnd"/>
+      <w:proofErr w:type="gramStart"/>
+      <w:r>
+        <w:rPr>
+          <w:lang w:val="en-US"/>
+        </w:rPr>
+        <w:t xml:space="preserve">()   </w:t>
+      </w:r>
+      <w:proofErr w:type="gramEnd"/>
+      <w:r>
+        <w:rPr>
+          <w:lang w:val="en-US"/>
+        </w:rPr>
+        <w:t xml:space="preserve">                    |</w:t>
+      </w:r>
+    </w:p>
+    <w:p>
+      <w:pPr>
+        <w:pStyle w:val="BodyText"/>
+        <w:rPr>
+          <w:lang w:val="en-US"/>
+        </w:rPr>
+      </w:pPr>
+      <w:r>
+        <w:rPr>
+          <w:lang w:val="en-US"/>
+        </w:rPr>
+        <w:t>|------------------------------------------------------|</w:t>
+      </w:r>
+    </w:p>
+    <w:p>
+      <w:pPr>
+        <w:pStyle w:val="BodyText"/>
+        <w:rPr>
+          <w:lang w:val="en-US"/>
+        </w:rPr>
+      </w:pPr>
+      <w:r>
+        <w:rPr>
+          <w:lang w:val="en-US"/>
+        </w:rPr>
+        <w:t xml:space="preserve">| 1. </w:t>
+      </w:r>
+      <w:proofErr w:type="spellStart"/>
+      <w:r>
+        <w:rPr>
+          <w:lang w:val="en-US"/>
+        </w:rPr>
+        <w:t>fileDialogService.OpenFiles</w:t>
+      </w:r>
+      <w:proofErr w:type="spellEnd"/>
+      <w:r>
+        <w:rPr>
+          <w:lang w:val="en-US"/>
+        </w:rPr>
+        <w:t xml:space="preserve">(filter, </w:t>
+      </w:r>
+      <w:proofErr w:type="gramStart"/>
+      <w:r>
+        <w:rPr>
+          <w:lang w:val="en-US"/>
+        </w:rPr>
+        <w:t xml:space="preserve">true)   </w:t>
+      </w:r>
+      <w:proofErr w:type="gramEnd"/>
+      <w:r>
+        <w:rPr>
+          <w:lang w:val="en-US"/>
+        </w:rPr>
+        <w:t xml:space="preserve">       |</w:t>
+      </w:r>
+    </w:p>
+    <w:p>
+      <w:pPr>
+        <w:pStyle w:val="BodyText"/>
+        <w:rPr>
+          <w:lang w:val="en-US"/>
+        </w:rPr>
+      </w:pPr>
+      <w:r>
+        <w:rPr>
+          <w:lang w:val="en-US"/>
+        </w:rPr>
+        <w:t>| 2. foreach selected file                              |</w:t>
+      </w:r>
+    </w:p>
+    <w:p>
+      <w:pPr>
+        <w:pStyle w:val="BodyText"/>
+        <w:rPr>
+          <w:lang w:val="en-US"/>
+        </w:rPr>
+      </w:pPr>
+      <w:r>
+        <w:rPr>
+          <w:lang w:val="en-US"/>
+        </w:rPr>
+        <w:t xml:space="preserve">|    a. </w:t>
+      </w:r>
+      <w:proofErr w:type="gramStart"/>
+      <w:r>
+        <w:rPr>
+          <w:lang w:val="en-US"/>
+        </w:rPr>
+        <w:t>create</w:t>
+      </w:r>
+      <w:proofErr w:type="gramEnd"/>
+      <w:r>
+        <w:rPr>
+          <w:lang w:val="en-US"/>
+        </w:rPr>
+        <w:t xml:space="preserve"> new </w:t>
+      </w:r>
+      <w:proofErr w:type="spellStart"/>
+      <w:r>
+        <w:rPr>
+          <w:lang w:val="en-US"/>
+        </w:rPr>
+        <w:t>ImageTabViewModel</w:t>
+      </w:r>
+      <w:proofErr w:type="spellEnd"/>
+      <w:r>
+        <w:rPr>
+          <w:lang w:val="en-US"/>
+        </w:rPr>
+        <w:t>(</w:t>
+      </w:r>
+      <w:proofErr w:type="gramStart"/>
+      <w:r>
+        <w:rPr>
+          <w:lang w:val="en-US"/>
+        </w:rPr>
+        <w:t xml:space="preserve">file)   </w:t>
+      </w:r>
+      <w:proofErr w:type="gramEnd"/>
+      <w:r>
+        <w:rPr>
+          <w:lang w:val="en-US"/>
+        </w:rPr>
+        <w:t xml:space="preserve">            |</w:t>
+      </w:r>
+    </w:p>
+    <w:p>
+      <w:pPr>
+        <w:pStyle w:val="BodyText"/>
+        <w:rPr>
+          <w:lang w:val="en-US"/>
+        </w:rPr>
+      </w:pPr>
+      <w:r>
+        <w:rPr>
+          <w:lang w:val="en-US"/>
+        </w:rPr>
+        <w:t xml:space="preserve">|    b. </w:t>
+      </w:r>
+      <w:proofErr w:type="spellStart"/>
+      <w:r>
+        <w:rPr>
+          <w:lang w:val="en-US"/>
+        </w:rPr>
+        <w:t>Tabs.Add</w:t>
+      </w:r>
+      <w:proofErr w:type="spellEnd"/>
+      <w:r>
+        <w:rPr>
+          <w:lang w:val="en-US"/>
+        </w:rPr>
+        <w:t>(</w:t>
+      </w:r>
+      <w:proofErr w:type="gramStart"/>
+      <w:r>
+        <w:rPr>
+          <w:lang w:val="en-US"/>
+        </w:rPr>
+        <w:t xml:space="preserve">tab)   </w:t>
+      </w:r>
+      <w:proofErr w:type="gramEnd"/>
+      <w:r>
+        <w:rPr>
+          <w:lang w:val="en-US"/>
+        </w:rPr>
+        <w:t xml:space="preserve">                                |</w:t>
+      </w:r>
+    </w:p>
+    <w:p>
+      <w:pPr>
+        <w:pStyle w:val="BodyText"/>
+        <w:rPr>
+          <w:lang w:val="en-US"/>
+        </w:rPr>
+      </w:pPr>
+      <w:r>
+        <w:rPr>
+          <w:lang w:val="en-US"/>
+        </w:rPr>
+        <w:t xml:space="preserve">|    c. </w:t>
+      </w:r>
+      <w:proofErr w:type="spellStart"/>
+      <w:r>
+        <w:rPr>
+          <w:lang w:val="en-US"/>
+        </w:rPr>
+        <w:t>SelectedTab</w:t>
+      </w:r>
+      <w:proofErr w:type="spellEnd"/>
+      <w:r>
+        <w:rPr>
+          <w:lang w:val="en-US"/>
+        </w:rPr>
+        <w:t xml:space="preserve"> = tab                                |</w:t>
+      </w:r>
+    </w:p>
+    <w:p>
+      <w:pPr>
+        <w:pStyle w:val="BodyText"/>
+        <w:rPr>
+          <w:lang w:val="en-US"/>
+        </w:rPr>
+      </w:pPr>
+      <w:r>
+        <w:rPr>
+          <w:lang w:val="en-US"/>
+        </w:rPr>
+        <w:t>+------------------------------------------------------+</w:t>
+      </w:r>
+    </w:p>
+    <w:p>
+      <w:pPr>
+        <w:pStyle w:val="BodyText"/>
+        <w:rPr>
+          <w:lang w:val="en-US"/>
+        </w:rPr>
+      </w:pPr>
+    </w:p>
+    <w:p>
+      <w:pPr>
+        <w:pStyle w:val="BodyText"/>
+        <w:rPr>
+          <w:lang w:val="en-US"/>
+        </w:rPr>
+      </w:pPr>
+      <w:r>
+        <w:rPr>
+          <w:lang w:val="en-US"/>
+        </w:rPr>
+        <w:t xml:space="preserve">                         |</w:t>
+      </w:r>
+    </w:p>
+    <w:p>
+      <w:pPr>
+        <w:pStyle w:val="BodyText"/>
+        <w:rPr>
+          <w:lang w:val="en-US"/>
+        </w:rPr>
+      </w:pPr>
+      <w:r>
+        <w:rPr>
+          <w:lang w:val="en-US"/>
+        </w:rPr>
+        <w:t xml:space="preserve">                         | creates</w:t>
+      </w:r>
+    </w:p>
+    <w:p>
+      <w:pPr>
+        <w:pStyle w:val="BodyText"/>
+        <w:rPr>
+          <w:lang w:val="en-US"/>
+        </w:rPr>
+      </w:pPr>
+      <w:r>
+        <w:rPr>
+          <w:lang w:val="en-US"/>
+        </w:rPr>
+        <w:t xml:space="preserve">                         v</w:t>
+      </w:r>
+    </w:p>
+    <w:p>
+      <w:pPr>
+        <w:pStyle w:val="BodyText"/>
+        <w:rPr>
+          <w:lang w:val="en-US"/>
+        </w:rPr>
+      </w:pPr>
+      <w:r>
+        <w:rPr>
+          <w:lang w:val="en-US"/>
+        </w:rPr>
+        <w:t>+------------------------------------------------------+</w:t>
+      </w:r>
+    </w:p>
+    <w:p>
+      <w:pPr>
+        <w:pStyle w:val="BodyText"/>
+        <w:rPr>
+          <w:lang w:val="en-US"/>
+        </w:rPr>
+      </w:pPr>
+      <w:r>
+        <w:rPr>
+          <w:lang w:val="en-US"/>
+        </w:rPr>
+        <w:t xml:space="preserve">| </w:t>
+      </w:r>
+      <w:proofErr w:type="spellStart"/>
+      <w:r>
+        <w:rPr>
+          <w:lang w:val="en-US"/>
+        </w:rPr>
+        <w:t>ImageTabViewModel</w:t>
+      </w:r>
+      <w:proofErr w:type="spellEnd"/>
+      <w:r>
+        <w:rPr>
+          <w:lang w:val="en-US"/>
+        </w:rPr>
+        <w:t xml:space="preserve">                                     |</w:t>
+      </w:r>
+    </w:p>
+    <w:p>
+      <w:pPr>
+        <w:pStyle w:val="BodyText"/>
+        <w:rPr>
+          <w:lang w:val="en-US"/>
+        </w:rPr>
+      </w:pPr>
+      <w:r>
+        <w:rPr>
+          <w:lang w:val="en-US"/>
+        </w:rPr>
+        <w:t>|------------------------------------------------------|</w:t>
+      </w:r>
+    </w:p>
+    <w:p>
+      <w:pPr>
+        <w:pStyle w:val="BodyText"/>
+        <w:rPr>
+          <w:lang w:val="en-US"/>
+        </w:rPr>
+      </w:pPr>
+      <w:r>
+        <w:rPr>
+          <w:lang w:val="en-US"/>
+        </w:rPr>
+        <w:t xml:space="preserve">| + </w:t>
+      </w:r>
+      <w:proofErr w:type="gramStart"/>
+      <w:r>
+        <w:rPr>
+          <w:lang w:val="en-US"/>
+        </w:rPr>
+        <w:t>Title :</w:t>
+      </w:r>
+      <w:proofErr w:type="gramEnd"/>
+      <w:r>
+        <w:rPr>
+          <w:lang w:val="en-US"/>
+        </w:rPr>
+        <w:t xml:space="preserve"> string                                      |</w:t>
+      </w:r>
+    </w:p>
+    <w:p>
+      <w:pPr>
+        <w:pStyle w:val="BodyText"/>
+        <w:rPr>
+          <w:lang w:val="en-US"/>
+        </w:rPr>
+      </w:pPr>
+      <w:r>
+        <w:rPr>
+          <w:lang w:val="en-US"/>
+        </w:rPr>
+        <w:t xml:space="preserve">| + </w:t>
+      </w:r>
+      <w:proofErr w:type="gramStart"/>
+      <w:r>
+        <w:rPr>
+          <w:lang w:val="en-US"/>
+        </w:rPr>
+        <w:t>Image :</w:t>
+      </w:r>
+      <w:proofErr w:type="gramEnd"/>
+      <w:r>
+        <w:rPr>
+          <w:lang w:val="en-US"/>
+        </w:rPr>
+        <w:t xml:space="preserve"> </w:t>
+      </w:r>
+      <w:proofErr w:type="spellStart"/>
+      <w:r>
+        <w:rPr>
+          <w:lang w:val="en-US"/>
+        </w:rPr>
+        <w:t>ImageSource</w:t>
+      </w:r>
+      <w:proofErr w:type="spellEnd"/>
+      <w:r>
+        <w:rPr>
+          <w:lang w:val="en-US"/>
+        </w:rPr>
+        <w:t>?                                 |</w:t>
+      </w:r>
+    </w:p>
+    <w:p>
+      <w:pPr>
+        <w:pStyle w:val="BodyText"/>
+        <w:rPr>
+          <w:lang w:val="en-US"/>
+        </w:rPr>
+      </w:pPr>
+      <w:r>
+        <w:rPr>
+          <w:lang w:val="en-US"/>
+        </w:rPr>
+        <w:t>|------------------------------------------------------|</w:t>
+      </w:r>
+    </w:p>
+    <w:p>
+      <w:pPr>
+        <w:pStyle w:val="BodyText"/>
+        <w:rPr>
+          <w:lang w:val="en-US"/>
+        </w:rPr>
+      </w:pPr>
+      <w:r>
+        <w:rPr>
+          <w:lang w:val="en-US"/>
+        </w:rPr>
+        <w:t xml:space="preserve">| + </w:t>
+      </w:r>
+      <w:proofErr w:type="spellStart"/>
+      <w:proofErr w:type="gramStart"/>
+      <w:r>
+        <w:rPr>
+          <w:lang w:val="en-US"/>
+        </w:rPr>
+        <w:t>ImageTabViewModel</w:t>
+      </w:r>
+      <w:proofErr w:type="spellEnd"/>
+      <w:r>
+        <w:rPr>
+          <w:lang w:val="en-US"/>
+        </w:rPr>
+        <w:t>(path :</w:t>
+      </w:r>
+      <w:proofErr w:type="gramEnd"/>
+      <w:r>
+        <w:rPr>
+          <w:lang w:val="en-US"/>
+        </w:rPr>
+        <w:t xml:space="preserve"> </w:t>
+      </w:r>
+      <w:proofErr w:type="gramStart"/>
+      <w:r>
+        <w:rPr>
+          <w:lang w:val="en-US"/>
+        </w:rPr>
+        <w:t xml:space="preserve">string)   </w:t>
+      </w:r>
+      <w:proofErr w:type="gramEnd"/>
+      <w:r>
+        <w:rPr>
+          <w:lang w:val="en-US"/>
+        </w:rPr>
+        <w:t xml:space="preserve">                 |</w:t>
+      </w:r>
+    </w:p>
+    <w:p>
+      <w:pPr>
+        <w:pStyle w:val="BodyText"/>
+        <w:rPr>
+          <w:lang w:val="en-US"/>
+        </w:rPr>
+      </w:pPr>
+      <w:r>
+        <w:rPr>
+          <w:lang w:val="en-US"/>
+        </w:rPr>
+        <w:t>+------------------------------------------------------+</w:t>
+      </w:r>
+    </w:p>
+    <w:p>
+      <w:pPr>
+        <w:pStyle w:val="Heading1"/>
+        <w:rPr>
+          <w:lang w:val="en-US"/>
+        </w:rPr>
+      </w:pPr>
+      <w:r>
+        <w:rPr>
+          <w:lang w:val="en-US"/>
+        </w:rPr>
+        <w:t>GitHub</w:t>
+      </w:r>
+    </w:p>
+    <w:p>
+      <w:pPr>
+        <w:rPr>
+          <w:lang w:val="en-US"/>
+        </w:rPr>
+      </w:pPr>
+      <w:r>
+        <w:rPr>
+          <w:lang w:val="en-US"/>
+        </w:rPr>
+        <w:t xml:space="preserve">Create the remote </w:t>
+      </w:r>
+      <w:proofErr w:type="spellStart"/>
+      <w:r>
+        <w:rPr>
+          <w:lang w:val="en-US"/>
+        </w:rPr>
+        <w:t>github</w:t>
+      </w:r>
+      <w:proofErr w:type="spellEnd"/>
+      <w:r>
+        <w:rPr>
+          <w:lang w:val="en-US"/>
+        </w:rPr>
+        <w:t xml:space="preserve"> </w:t>
+      </w:r>
+      <w:proofErr w:type="gramStart"/>
+      <w:r>
+        <w:rPr>
+          <w:lang w:val="en-US"/>
+        </w:rPr>
+        <w:t>repo :</w:t>
+      </w:r>
+      <w:proofErr w:type="gramEnd"/>
+      <w:r>
+        <w:rPr>
+          <w:lang w:val="en-US"/>
+        </w:rPr>
+        <w:t xml:space="preserve"> </w:t>
+      </w:r>
+    </w:p>
+    <w:p>
+      <w:pPr>
+        <w:rPr>
+          <w:lang w:val="en-US"/>
+        </w:rPr>
+      </w:pPr>
+      <w:r>
+        <w:rPr>
+          <w:b/>
+          <w:lang w:val="en-US"/>
+        </w:rPr>
+        <w:t xml:space="preserve">git -C "C:\Users\hicha\Data\Projets\PictureView" remote add origin </w:t>
+      </w:r>
+      <w:hyperlink r:id="rId12" w:history="1">
+        <w:r>
+          <w:rPr>
+            <w:rStyle w:val="Hyperlink"/>
+            <w:b/>
+            <w:lang w:val="en-US"/>
+          </w:rPr>
+          <w:t>https://github.com/&lt;YOUR_USERNAME&gt;/&lt;YOUR_REPO&gt;.git</w:t>
+        </w:r>
+      </w:hyperlink>
+      <w:r>
+        <w:rPr>
+          <w:b/>
+          <w:lang w:val="en-US"/>
+        </w:rPr>
+        <w:t xml:space="preserve"> </w:t>
+      </w:r>
+      <w:proofErr w:type="gramStart"/>
+      <w:r>
+        <w:rPr>
+          <w:b/>
+          <w:lang w:val="en-US"/>
+        </w:rPr>
+        <w:t>ex :</w:t>
+      </w:r>
+      <w:proofErr w:type="gramEnd"/>
+      <w:r>
+        <w:rPr>
+          <w:b/>
+          <w:lang w:val="en-US"/>
+        </w:rPr>
+        <w:t xml:space="preserve"> </w:t>
+      </w:r>
+      <w:r>
+        <w:rPr>
+          <w:b/>
+          <w:lang w:val="en-US"/>
+        </w:rPr>
+        <w:t>git -C "C:\Users\hicha\Data\Projets\PictureView" remote add origin https://github.com/hicham7995/PictureView.git</w:t>
       </w:r>
     </w:p>
     <w:p>
@@ -7371,6 +10340,29 @@
       <w:lang w:eastAsia="fr-FR"/>
     </w:rPr>
   </w:style>
+  <w:style w:type="character" w:styleId="Hyperlink">
+    <w:name w:val="Hyperlink"/>
+    <w:basedOn w:val="DefaultParagraphFont"/>
+    <w:uiPriority w:val="99"/>
+    <w:unhideWhenUsed/>
+    <w:rsid w:val="0056649C"/>
+    <w:rPr>
+      <w:color w:val="467886" w:themeColor="hyperlink"/>
+      <w:u w:val="single"/>
+    </w:rPr>
+  </w:style>
+  <w:style w:type="character" w:styleId="UnresolvedMention">
+    <w:name w:val="Unresolved Mention"/>
+    <w:basedOn w:val="DefaultParagraphFont"/>
+    <w:uiPriority w:val="99"/>
+    <w:semiHidden/>
+    <w:unhideWhenUsed/>
+    <w:rsid w:val="0056649C"/>
+    <w:rPr>
+      <w:color w:val="605E5C"/>
+      <w:shd w:val="clear" w:color="auto" w:fill="E1DFDD"/>
+    </w:rPr>
+  </w:style>
 </w:styles>
 </file>
 

</xml_diff>